<commit_message>
works but images catalogue images don't show up
</commit_message>
<xml_diff>
--- a/relatorio.docx
+++ b/relatorio.docx
@@ -14,6 +14,672 @@
           <w:b/>
           <w:bCs/>
         </w:rPr>
+        <w:t>01/04/2026</w:t>
+      </w:r>
+    </w:p>
+    <w:p>
+      <w:r>
+        <w:t>Link para catálogo de imagens</w:t>
+      </w:r>
+    </w:p>
+    <w:p>
+      <w:hyperlink r:id="rId4" w:history="1">
+        <w:r>
+          <w:rPr>
+            <w:rStyle w:val="Hiperligao"/>
+          </w:rPr>
+          <w:t>https://camonianadigital.bnportugal.gov.pt/product-category/imagens_cat/</w:t>
+        </w:r>
+      </w:hyperlink>
+      <w:r>
+        <w:t xml:space="preserve"> </w:t>
+      </w:r>
+    </w:p>
+    <w:p/>
+    <w:p/>
+    <w:p>
+      <w:r>
+        <w:t>Foi acrescentado código para alterar o número de obras encontradas no catálogo de 2115 para 1249</w:t>
+      </w:r>
+      <w:r>
+        <w:t>.</w:t>
+      </w:r>
+    </w:p>
+    <w:p>
+      <w:pPr>
+        <w:spacing w:after="0" w:line="240" w:lineRule="auto"/>
+        <w:rPr>
+          <w:i/>
+          <w:iCs/>
+          <w:lang w:val="en-US"/>
+        </w:rPr>
+      </w:pPr>
+      <w:r>
+        <w:rPr>
+          <w:i/>
+          <w:iCs/>
+          <w:lang w:val="en-US"/>
+        </w:rPr>
+        <w:t xml:space="preserve">function </w:t>
+      </w:r>
+      <w:proofErr w:type="spellStart"/>
+      <w:r>
+        <w:rPr>
+          <w:i/>
+          <w:iCs/>
+          <w:lang w:val="en-US"/>
+        </w:rPr>
+        <w:t>change_products_found_</w:t>
+      </w:r>
+      <w:proofErr w:type="gramStart"/>
+      <w:r>
+        <w:rPr>
+          <w:i/>
+          <w:iCs/>
+          <w:lang w:val="en-US"/>
+        </w:rPr>
+        <w:t>number</w:t>
+      </w:r>
+      <w:proofErr w:type="spellEnd"/>
+      <w:r>
+        <w:rPr>
+          <w:i/>
+          <w:iCs/>
+          <w:lang w:val="en-US"/>
+        </w:rPr>
+        <w:t>(</w:t>
+      </w:r>
+      <w:proofErr w:type="gramEnd"/>
+      <w:r>
+        <w:rPr>
+          <w:i/>
+          <w:iCs/>
+          <w:lang w:val="en-US"/>
+        </w:rPr>
+        <w:t>) {</w:t>
+      </w:r>
+    </w:p>
+    <w:p>
+      <w:pPr>
+        <w:spacing w:after="0" w:line="240" w:lineRule="auto"/>
+        <w:rPr>
+          <w:i/>
+          <w:iCs/>
+          <w:lang w:val="en-US"/>
+        </w:rPr>
+      </w:pPr>
+      <w:r>
+        <w:rPr>
+          <w:i/>
+          <w:iCs/>
+          <w:lang w:val="en-US"/>
+        </w:rPr>
+        <w:t xml:space="preserve">    ?&gt;</w:t>
+      </w:r>
+    </w:p>
+    <w:p>
+      <w:pPr>
+        <w:spacing w:after="0" w:line="240" w:lineRule="auto"/>
+        <w:rPr>
+          <w:i/>
+          <w:iCs/>
+          <w:lang w:val="en-US"/>
+        </w:rPr>
+      </w:pPr>
+      <w:r>
+        <w:rPr>
+          <w:i/>
+          <w:iCs/>
+          <w:lang w:val="en-US"/>
+        </w:rPr>
+        <w:t xml:space="preserve">    &lt;script&gt;</w:t>
+      </w:r>
+    </w:p>
+    <w:p>
+      <w:pPr>
+        <w:spacing w:after="0" w:line="240" w:lineRule="auto"/>
+        <w:rPr>
+          <w:i/>
+          <w:iCs/>
+          <w:lang w:val="en-US"/>
+        </w:rPr>
+      </w:pPr>
+      <w:r>
+        <w:rPr>
+          <w:i/>
+          <w:iCs/>
+          <w:lang w:val="en-US"/>
+        </w:rPr>
+        <w:t xml:space="preserve">        jQuery(document</w:t>
+      </w:r>
+      <w:proofErr w:type="gramStart"/>
+      <w:r>
+        <w:rPr>
+          <w:i/>
+          <w:iCs/>
+          <w:lang w:val="en-US"/>
+        </w:rPr>
+        <w:t>).ready</w:t>
+      </w:r>
+      <w:proofErr w:type="gramEnd"/>
+      <w:r>
+        <w:rPr>
+          <w:i/>
+          <w:iCs/>
+          <w:lang w:val="en-US"/>
+        </w:rPr>
+        <w:t>(</w:t>
+      </w:r>
+      <w:proofErr w:type="gramStart"/>
+      <w:r>
+        <w:rPr>
+          <w:i/>
+          <w:iCs/>
+          <w:lang w:val="en-US"/>
+        </w:rPr>
+        <w:t>function(</w:t>
+      </w:r>
+      <w:proofErr w:type="gramEnd"/>
+      <w:r>
+        <w:rPr>
+          <w:i/>
+          <w:iCs/>
+          <w:lang w:val="en-US"/>
+        </w:rPr>
+        <w:t>$</w:t>
+      </w:r>
+      <w:proofErr w:type="gramStart"/>
+      <w:r>
+        <w:rPr>
+          <w:i/>
+          <w:iCs/>
+          <w:lang w:val="en-US"/>
+        </w:rPr>
+        <w:t>) {</w:t>
+      </w:r>
+      <w:proofErr w:type="gramEnd"/>
+    </w:p>
+    <w:p>
+      <w:pPr>
+        <w:spacing w:after="0" w:line="240" w:lineRule="auto"/>
+        <w:rPr>
+          <w:i/>
+          <w:iCs/>
+          <w:lang w:val="en-US"/>
+        </w:rPr>
+      </w:pPr>
+      <w:r>
+        <w:rPr>
+          <w:i/>
+          <w:iCs/>
+          <w:lang w:val="en-US"/>
+        </w:rPr>
+        <w:t xml:space="preserve">            if ($(</w:t>
+      </w:r>
+      <w:proofErr w:type="gramStart"/>
+      <w:r>
+        <w:rPr>
+          <w:i/>
+          <w:iCs/>
+          <w:lang w:val="en-US"/>
+        </w:rPr>
+        <w:t>'.products</w:t>
+      </w:r>
+      <w:proofErr w:type="gramEnd"/>
+      <w:r>
+        <w:rPr>
+          <w:i/>
+          <w:iCs/>
+          <w:lang w:val="en-US"/>
+        </w:rPr>
+        <w:t>-found strong').</w:t>
+      </w:r>
+      <w:proofErr w:type="gramStart"/>
+      <w:r>
+        <w:rPr>
+          <w:i/>
+          <w:iCs/>
+          <w:lang w:val="en-US"/>
+        </w:rPr>
+        <w:t>text(</w:t>
+      </w:r>
+      <w:proofErr w:type="gramEnd"/>
+      <w:r>
+        <w:rPr>
+          <w:i/>
+          <w:iCs/>
+          <w:lang w:val="en-US"/>
+        </w:rPr>
+        <w:t>) === '2115') {</w:t>
+      </w:r>
+    </w:p>
+    <w:p>
+      <w:pPr>
+        <w:spacing w:after="0" w:line="240" w:lineRule="auto"/>
+        <w:rPr>
+          <w:i/>
+          <w:iCs/>
+          <w:lang w:val="en-US"/>
+        </w:rPr>
+      </w:pPr>
+      <w:r>
+        <w:rPr>
+          <w:i/>
+          <w:iCs/>
+          <w:lang w:val="en-US"/>
+        </w:rPr>
+        <w:t xml:space="preserve">                $(</w:t>
+      </w:r>
+      <w:proofErr w:type="gramStart"/>
+      <w:r>
+        <w:rPr>
+          <w:i/>
+          <w:iCs/>
+          <w:lang w:val="en-US"/>
+        </w:rPr>
+        <w:t>'.products</w:t>
+      </w:r>
+      <w:proofErr w:type="gramEnd"/>
+      <w:r>
+        <w:rPr>
+          <w:i/>
+          <w:iCs/>
+          <w:lang w:val="en-US"/>
+        </w:rPr>
+        <w:t>-found strong').</w:t>
+      </w:r>
+      <w:proofErr w:type="gramStart"/>
+      <w:r>
+        <w:rPr>
+          <w:i/>
+          <w:iCs/>
+          <w:lang w:val="en-US"/>
+        </w:rPr>
+        <w:t>text(</w:t>
+      </w:r>
+      <w:proofErr w:type="gramEnd"/>
+      <w:r>
+        <w:rPr>
+          <w:i/>
+          <w:iCs/>
+          <w:lang w:val="en-US"/>
+        </w:rPr>
+        <w:t>'1249'</w:t>
+      </w:r>
+      <w:proofErr w:type="gramStart"/>
+      <w:r>
+        <w:rPr>
+          <w:i/>
+          <w:iCs/>
+          <w:lang w:val="en-US"/>
+        </w:rPr>
+        <w:t>);</w:t>
+      </w:r>
+      <w:proofErr w:type="gramEnd"/>
+    </w:p>
+    <w:p>
+      <w:pPr>
+        <w:spacing w:after="0" w:line="240" w:lineRule="auto"/>
+        <w:rPr>
+          <w:i/>
+          <w:iCs/>
+          <w:lang w:val="en-US"/>
+        </w:rPr>
+      </w:pPr>
+      <w:r>
+        <w:rPr>
+          <w:i/>
+          <w:iCs/>
+          <w:lang w:val="en-US"/>
+        </w:rPr>
+        <w:t xml:space="preserve">            }</w:t>
+      </w:r>
+    </w:p>
+    <w:p>
+      <w:pPr>
+        <w:spacing w:after="0" w:line="240" w:lineRule="auto"/>
+        <w:rPr>
+          <w:i/>
+          <w:iCs/>
+          <w:lang w:val="en-US"/>
+        </w:rPr>
+      </w:pPr>
+      <w:r>
+        <w:rPr>
+          <w:i/>
+          <w:iCs/>
+          <w:lang w:val="en-US"/>
+        </w:rPr>
+        <w:t xml:space="preserve">        }</w:t>
+      </w:r>
+      <w:proofErr w:type="gramStart"/>
+      <w:r>
+        <w:rPr>
+          <w:i/>
+          <w:iCs/>
+          <w:lang w:val="en-US"/>
+        </w:rPr>
+        <w:t>);</w:t>
+      </w:r>
+      <w:proofErr w:type="gramEnd"/>
+    </w:p>
+    <w:p>
+      <w:pPr>
+        <w:spacing w:after="0" w:line="240" w:lineRule="auto"/>
+        <w:rPr>
+          <w:i/>
+          <w:iCs/>
+          <w:lang w:val="en-US"/>
+        </w:rPr>
+      </w:pPr>
+      <w:r>
+        <w:rPr>
+          <w:i/>
+          <w:iCs/>
+          <w:lang w:val="en-US"/>
+        </w:rPr>
+        <w:t xml:space="preserve">    &lt;/script&gt;</w:t>
+      </w:r>
+    </w:p>
+    <w:p>
+      <w:pPr>
+        <w:spacing w:after="0" w:line="240" w:lineRule="auto"/>
+        <w:rPr>
+          <w:i/>
+          <w:iCs/>
+          <w:lang w:val="en-US"/>
+        </w:rPr>
+      </w:pPr>
+      <w:r>
+        <w:rPr>
+          <w:i/>
+          <w:iCs/>
+          <w:lang w:val="en-US"/>
+        </w:rPr>
+        <w:t xml:space="preserve">    &lt;?</w:t>
+      </w:r>
+      <w:proofErr w:type="spellStart"/>
+      <w:r>
+        <w:rPr>
+          <w:i/>
+          <w:iCs/>
+          <w:lang w:val="en-US"/>
+        </w:rPr>
+        <w:t>php</w:t>
+      </w:r>
+      <w:proofErr w:type="spellEnd"/>
+    </w:p>
+    <w:p>
+      <w:pPr>
+        <w:spacing w:after="0" w:line="240" w:lineRule="auto"/>
+        <w:rPr>
+          <w:i/>
+          <w:iCs/>
+          <w:lang w:val="en-US"/>
+        </w:rPr>
+      </w:pPr>
+      <w:r>
+        <w:rPr>
+          <w:i/>
+          <w:iCs/>
+          <w:lang w:val="en-US"/>
+        </w:rPr>
+        <w:t>}</w:t>
+      </w:r>
+    </w:p>
+    <w:p>
+      <w:pPr>
+        <w:spacing w:after="0" w:line="240" w:lineRule="auto"/>
+        <w:rPr>
+          <w:i/>
+          <w:iCs/>
+          <w:lang w:val="en-US"/>
+        </w:rPr>
+      </w:pPr>
+      <w:proofErr w:type="spellStart"/>
+      <w:r>
+        <w:rPr>
+          <w:i/>
+          <w:iCs/>
+          <w:lang w:val="en-US"/>
+        </w:rPr>
+        <w:t>add_</w:t>
+      </w:r>
+      <w:proofErr w:type="gramStart"/>
+      <w:r>
+        <w:rPr>
+          <w:i/>
+          <w:iCs/>
+          <w:lang w:val="en-US"/>
+        </w:rPr>
+        <w:t>action</w:t>
+      </w:r>
+      <w:proofErr w:type="spellEnd"/>
+      <w:r>
+        <w:rPr>
+          <w:i/>
+          <w:iCs/>
+          <w:lang w:val="en-US"/>
+        </w:rPr>
+        <w:t>(</w:t>
+      </w:r>
+      <w:proofErr w:type="gramEnd"/>
+      <w:r>
+        <w:rPr>
+          <w:i/>
+          <w:iCs/>
+          <w:lang w:val="en-US"/>
+        </w:rPr>
+        <w:t>'</w:t>
+      </w:r>
+      <w:proofErr w:type="spellStart"/>
+      <w:r>
+        <w:rPr>
+          <w:i/>
+          <w:iCs/>
+          <w:lang w:val="en-US"/>
+        </w:rPr>
+        <w:t>wp_footer</w:t>
+      </w:r>
+      <w:proofErr w:type="spellEnd"/>
+      <w:r>
+        <w:rPr>
+          <w:i/>
+          <w:iCs/>
+          <w:lang w:val="en-US"/>
+        </w:rPr>
+        <w:t>', '</w:t>
+      </w:r>
+      <w:proofErr w:type="spellStart"/>
+      <w:r>
+        <w:rPr>
+          <w:i/>
+          <w:iCs/>
+          <w:lang w:val="en-US"/>
+        </w:rPr>
+        <w:t>change_products_found_number</w:t>
+      </w:r>
+      <w:proofErr w:type="spellEnd"/>
+      <w:r>
+        <w:rPr>
+          <w:i/>
+          <w:iCs/>
+          <w:lang w:val="en-US"/>
+        </w:rPr>
+        <w:t>'</w:t>
+      </w:r>
+      <w:proofErr w:type="gramStart"/>
+      <w:r>
+        <w:rPr>
+          <w:i/>
+          <w:iCs/>
+          <w:lang w:val="en-US"/>
+        </w:rPr>
+        <w:t>);</w:t>
+      </w:r>
+      <w:proofErr w:type="gramEnd"/>
+    </w:p>
+    <w:p>
+      <w:pPr>
+        <w:rPr>
+          <w:b/>
+          <w:bCs/>
+          <w:lang w:val="en-US"/>
+        </w:rPr>
+      </w:pPr>
+    </w:p>
+    <w:p>
+      <w:pPr>
+        <w:rPr>
+          <w:b/>
+          <w:bCs/>
+          <w:lang w:val="en-US"/>
+        </w:rPr>
+      </w:pPr>
+    </w:p>
+    <w:p>
+      <w:pPr>
+        <w:rPr>
+          <w:b/>
+          <w:bCs/>
+          <w:lang w:val="en-US"/>
+        </w:rPr>
+      </w:pPr>
+    </w:p>
+    <w:p>
+      <w:pPr>
+        <w:rPr>
+          <w:b/>
+          <w:bCs/>
+        </w:rPr>
+      </w:pPr>
+      <w:r>
+        <w:rPr>
+          <w:b/>
+          <w:bCs/>
+        </w:rPr>
+        <w:t>31/03/2026</w:t>
+      </w:r>
+    </w:p>
+    <w:p>
+      <w:pPr>
+        <w:rPr>
+          <w:b/>
+          <w:bCs/>
+          <w:color w:val="EE0000"/>
+        </w:rPr>
+      </w:pPr>
+      <w:r>
+        <w:rPr>
+          <w:b/>
+          <w:bCs/>
+          <w:color w:val="EE0000"/>
+        </w:rPr>
+        <w:lastRenderedPageBreak/>
+        <w:t>Tive de alterar a numeração do ficheiro “imagens” de “</w:t>
+      </w:r>
+      <w:proofErr w:type="spellStart"/>
+      <w:r>
+        <w:rPr>
+          <w:b/>
+          <w:bCs/>
+          <w:color w:val="EE0000"/>
+        </w:rPr>
+        <w:t>data_csv</w:t>
+      </w:r>
+      <w:proofErr w:type="spellEnd"/>
+      <w:r>
+        <w:rPr>
+          <w:b/>
+          <w:bCs/>
+          <w:color w:val="EE0000"/>
+        </w:rPr>
+        <w:t xml:space="preserve">” de </w:t>
+      </w:r>
+      <w:r>
+        <w:rPr>
+          <w:b/>
+          <w:bCs/>
+          <w:color w:val="EE0000"/>
+        </w:rPr>
+        <w:t xml:space="preserve">7341 para 9456, senão não haveria encontro entre os </w:t>
+      </w:r>
+      <w:proofErr w:type="spellStart"/>
+      <w:r>
+        <w:rPr>
+          <w:b/>
+          <w:bCs/>
+          <w:color w:val="EE0000"/>
+        </w:rPr>
+        <w:t>posts</w:t>
+      </w:r>
+      <w:proofErr w:type="spellEnd"/>
+      <w:r>
+        <w:rPr>
+          <w:b/>
+          <w:bCs/>
+          <w:color w:val="EE0000"/>
+        </w:rPr>
+        <w:t xml:space="preserve"> das imagens (das imagens) e o os registos do ficheiro “</w:t>
+      </w:r>
+      <w:proofErr w:type="spellStart"/>
+      <w:r>
+        <w:rPr>
+          <w:b/>
+          <w:bCs/>
+          <w:color w:val="EE0000"/>
+        </w:rPr>
+        <w:t>data_</w:t>
+      </w:r>
+      <w:proofErr w:type="gramStart"/>
+      <w:r>
+        <w:rPr>
+          <w:b/>
+          <w:bCs/>
+          <w:color w:val="EE0000"/>
+        </w:rPr>
+        <w:t>csv.imagens</w:t>
+      </w:r>
+      <w:proofErr w:type="spellEnd"/>
+      <w:proofErr w:type="gramEnd"/>
+      <w:r>
+        <w:rPr>
+          <w:b/>
+          <w:bCs/>
+          <w:color w:val="EE0000"/>
+        </w:rPr>
+        <w:t>”</w:t>
+      </w:r>
+    </w:p>
+    <w:p>
+      <w:pPr>
+        <w:rPr>
+          <w:b/>
+          <w:bCs/>
+          <w:color w:val="EE0000"/>
+        </w:rPr>
+      </w:pPr>
+    </w:p>
+    <w:p>
+      <w:pPr>
+        <w:rPr>
+          <w:b/>
+          <w:bCs/>
+        </w:rPr>
+      </w:pPr>
+    </w:p>
+    <w:p>
+      <w:pPr>
+        <w:rPr>
+          <w:b/>
+          <w:bCs/>
+        </w:rPr>
+      </w:pPr>
+      <w:r>
+        <w:rPr>
+          <w:b/>
+          <w:bCs/>
+        </w:rPr>
         <w:t>30/03/2026</w:t>
       </w:r>
     </w:p>
@@ -76,10 +742,13 @@
         </w:rPr>
       </w:pPr>
       <w:r>
-        <w:rPr>
-          <w:lang w:val="en-US"/>
-        </w:rPr>
-        <w:t>                            if 'Cantos' in categories:</w:t>
+        <w:t xml:space="preserve">                            </w:t>
+      </w:r>
+      <w:r>
+        <w:rPr>
+          <w:lang w:val="en-US"/>
+        </w:rPr>
+        <w:t>if 'Cantos' in categories:</w:t>
       </w:r>
     </w:p>
     <w:p>
@@ -155,21 +824,7 @@
         <w:rPr>
           <w:lang w:val="en-US"/>
         </w:rPr>
-        <w:t xml:space="preserve"> '</w:t>
-      </w:r>
-      <w:proofErr w:type="spellStart"/>
-      <w:r>
-        <w:rPr>
-          <w:lang w:val="en-US"/>
-        </w:rPr>
-        <w:t>Episódios</w:t>
-      </w:r>
-      <w:proofErr w:type="spellEnd"/>
-      <w:r>
-        <w:rPr>
-          <w:lang w:val="en-US"/>
-        </w:rPr>
-        <w:t>' in categories:</w:t>
+        <w:t xml:space="preserve"> 'Episódios' in categories:</w:t>
       </w:r>
     </w:p>
     <w:p>
@@ -271,6 +926,11 @@
       <w:proofErr w:type="spellEnd"/>
     </w:p>
     <w:p>
+      <w:pPr>
+        <w:rPr>
+          <w:lang w:val="en-US"/>
+        </w:rPr>
+      </w:pPr>
       <w:r>
         <w:rPr>
           <w:lang w:val="en-US"/>
@@ -278,14 +938,23 @@
         <w:t xml:space="preserve">                            </w:t>
       </w:r>
       <w:r>
+        <w:rPr>
+          <w:lang w:val="en-US"/>
+        </w:rPr>
         <w:t>print(</w:t>
       </w:r>
       <w:proofErr w:type="spellStart"/>
       <w:r>
+        <w:rPr>
+          <w:lang w:val="en-US"/>
+        </w:rPr>
         <w:t>slugs_text</w:t>
       </w:r>
       <w:proofErr w:type="spellEnd"/>
       <w:r>
+        <w:rPr>
+          <w:lang w:val="en-US"/>
+        </w:rPr>
         <w:t>)</w:t>
       </w:r>
     </w:p>
@@ -294,22 +963,23 @@
         <w:rPr>
           <w:b/>
           <w:bCs/>
-        </w:rPr>
-      </w:pPr>
-    </w:p>
-    <w:p>
-      <w:pPr>
-        <w:rPr>
-          <w:b/>
-          <w:bCs/>
-          <w:lang w:val="it-IT"/>
-        </w:rPr>
-      </w:pPr>
-      <w:r>
-        <w:rPr>
-          <w:b/>
-          <w:bCs/>
-          <w:lang w:val="it-IT"/>
+          <w:lang w:val="en-US"/>
+        </w:rPr>
+      </w:pPr>
+    </w:p>
+    <w:p>
+      <w:pPr>
+        <w:rPr>
+          <w:b/>
+          <w:bCs/>
+          <w:lang w:val="en-US"/>
+        </w:rPr>
+      </w:pPr>
+      <w:r>
+        <w:rPr>
+          <w:b/>
+          <w:bCs/>
+          <w:lang w:val="en-US"/>
         </w:rPr>
         <w:t>e a create_taxonomies.py</w:t>
       </w:r>
@@ -317,8 +987,9 @@
     <w:p>
       <w:r>
         <w:rPr>
-          <w:lang w:val="it-IT"/>
-        </w:rPr>
+          <w:lang w:val="en-US"/>
+        </w:rPr>
+        <w:lastRenderedPageBreak/>
         <w:t xml:space="preserve">            </w:t>
       </w:r>
       <w:proofErr w:type="spellStart"/>
@@ -369,7 +1040,184 @@
       </w:r>
       <w:proofErr w:type="spellEnd"/>
       <w:r>
-        <w:t xml:space="preserve"> '_</w:t>
+        <w:t xml:space="preserve"> '_episodios' in </w:t>
+      </w:r>
+      <w:proofErr w:type="spellStart"/>
+      <w:r>
+        <w:t>categories</w:t>
+      </w:r>
+      <w:proofErr w:type="spellEnd"/>
+      <w:r>
+        <w:t>[i][2]:</w:t>
+      </w:r>
+    </w:p>
+    <w:p>
+      <w:r>
+        <w:t xml:space="preserve">                </w:t>
+      </w:r>
+      <w:proofErr w:type="spellStart"/>
+      <w:r>
+        <w:t>taxonomy</w:t>
+      </w:r>
+      <w:proofErr w:type="spellEnd"/>
+      <w:r>
+        <w:t xml:space="preserve"> = '</w:t>
+      </w:r>
+      <w:proofErr w:type="spellStart"/>
+      <w:r>
+        <w:t>pa_episodios</w:t>
+      </w:r>
+      <w:proofErr w:type="spellEnd"/>
+      <w:r>
+        <w:t>'</w:t>
+      </w:r>
+    </w:p>
+    <w:p>
+      <w:pPr>
+        <w:rPr>
+          <w:b/>
+          <w:bCs/>
+        </w:rPr>
+      </w:pPr>
+    </w:p>
+    <w:p>
+      <w:pPr>
+        <w:rPr>
+          <w:b/>
+          <w:bCs/>
+        </w:rPr>
+      </w:pPr>
+    </w:p>
+    <w:p>
+      <w:pPr>
+        <w:rPr>
+          <w:b/>
+          <w:bCs/>
+        </w:rPr>
+      </w:pPr>
+      <w:r>
+        <w:rPr>
+          <w:b/>
+          <w:bCs/>
+        </w:rPr>
+        <w:t>Faltam os restantes atributos de imagens</w:t>
+      </w:r>
+    </w:p>
+    <w:p>
+      <w:pPr>
+        <w:rPr>
+          <w:b/>
+          <w:bCs/>
+        </w:rPr>
+      </w:pPr>
+    </w:p>
+    <w:p/>
+    <w:p>
+      <w:pPr>
+        <w:rPr>
+          <w:b/>
+          <w:bCs/>
+        </w:rPr>
+      </w:pPr>
+    </w:p>
+    <w:p>
+      <w:pPr>
+        <w:rPr>
+          <w:b/>
+          <w:bCs/>
+        </w:rPr>
+      </w:pPr>
+    </w:p>
+    <w:p>
+      <w:pPr>
+        <w:rPr>
+          <w:b/>
+          <w:bCs/>
+        </w:rPr>
+      </w:pPr>
+      <w:r>
+        <w:rPr>
+          <w:b/>
+          <w:bCs/>
+        </w:rPr>
+        <w:t>27/03/2026</w:t>
+      </w:r>
+    </w:p>
+    <w:p>
+      <w:pPr>
+        <w:rPr>
+          <w:b/>
+          <w:bCs/>
+          <w:color w:val="EE0000"/>
+        </w:rPr>
+      </w:pPr>
+      <w:r>
+        <w:rPr>
+          <w:b/>
+          <w:bCs/>
+          <w:color w:val="EE0000"/>
+        </w:rPr>
+        <w:t>Criar 1º a categoria “Imagens” e os atributos gerais (Cantos, Episódios, etc.)</w:t>
+      </w:r>
+    </w:p>
+    <w:p>
+      <w:pPr>
+        <w:rPr>
+          <w:b/>
+          <w:bCs/>
+        </w:rPr>
+      </w:pPr>
+    </w:p>
+    <w:p>
+      <w:r>
+        <w:t>Acrescentei a categoria: “Imagens”</w:t>
+      </w:r>
+      <w:r>
+        <w:t xml:space="preserve"> com o </w:t>
+      </w:r>
+      <w:proofErr w:type="spellStart"/>
+      <w:r>
+        <w:t>slug</w:t>
+      </w:r>
+      <w:proofErr w:type="spellEnd"/>
+      <w:r>
+        <w:t xml:space="preserve"> “</w:t>
+      </w:r>
+      <w:r>
+        <w:t>imagens</w:t>
+      </w:r>
+      <w:r>
+        <w:t>”</w:t>
+      </w:r>
+    </w:p>
+    <w:p>
+      <w:r>
+        <w:t>Acrescentei os atributos: “Cantos”</w:t>
+      </w:r>
+      <w:r>
+        <w:t xml:space="preserve"> (</w:t>
+      </w:r>
+      <w:proofErr w:type="spellStart"/>
+      <w:r>
+        <w:t>slug</w:t>
+      </w:r>
+      <w:proofErr w:type="spellEnd"/>
+      <w:r>
+        <w:t>: cantos)</w:t>
+      </w:r>
+      <w:r>
+        <w:t xml:space="preserve"> e “Episódios”</w:t>
+      </w:r>
+      <w:r>
+        <w:t xml:space="preserve"> (</w:t>
+      </w:r>
+      <w:proofErr w:type="spellStart"/>
+      <w:r>
+        <w:t>slug</w:t>
+      </w:r>
+      <w:proofErr w:type="spellEnd"/>
+      <w:r>
+        <w:t xml:space="preserve">: </w:t>
       </w:r>
       <w:proofErr w:type="spellStart"/>
       <w:r>
@@ -377,140 +1225,14 @@
       </w:r>
       <w:proofErr w:type="spellEnd"/>
       <w:r>
-        <w:t xml:space="preserve">' in </w:t>
-      </w:r>
-      <w:proofErr w:type="spellStart"/>
-      <w:r>
-        <w:t>categories</w:t>
-      </w:r>
-      <w:proofErr w:type="spellEnd"/>
-      <w:r>
-        <w:t>[i][2]:</w:t>
-      </w:r>
-    </w:p>
-    <w:p>
-      <w:r>
-        <w:t xml:space="preserve">                </w:t>
-      </w:r>
-      <w:proofErr w:type="spellStart"/>
-      <w:r>
-        <w:t>taxonomy</w:t>
-      </w:r>
-      <w:proofErr w:type="spellEnd"/>
-      <w:r>
-        <w:t xml:space="preserve"> = '</w:t>
-      </w:r>
-      <w:proofErr w:type="spellStart"/>
-      <w:r>
-        <w:t>pa_episodios</w:t>
-      </w:r>
-      <w:proofErr w:type="spellEnd"/>
-      <w:r>
-        <w:t>'</w:t>
-      </w:r>
-    </w:p>
-    <w:p>
-      <w:pPr>
-        <w:rPr>
-          <w:b/>
-          <w:bCs/>
-        </w:rPr>
-      </w:pPr>
-    </w:p>
-    <w:p>
-      <w:pPr>
-        <w:rPr>
-          <w:b/>
-          <w:bCs/>
-        </w:rPr>
-      </w:pPr>
-    </w:p>
-    <w:p>
-      <w:pPr>
-        <w:rPr>
-          <w:b/>
-          <w:bCs/>
-        </w:rPr>
-      </w:pPr>
-      <w:r>
-        <w:rPr>
-          <w:b/>
-          <w:bCs/>
-        </w:rPr>
-        <w:t>Faltam os restantes atributos de imagens</w:t>
-      </w:r>
-    </w:p>
-    <w:p>
-      <w:pPr>
-        <w:rPr>
-          <w:b/>
-          <w:bCs/>
-        </w:rPr>
-      </w:pPr>
+        <w:t>)</w:t>
+      </w:r>
     </w:p>
     <w:p/>
     <w:p>
-      <w:pPr>
-        <w:rPr>
-          <w:b/>
-          <w:bCs/>
-        </w:rPr>
-      </w:pPr>
-    </w:p>
-    <w:p>
-      <w:pPr>
-        <w:rPr>
-          <w:b/>
-          <w:bCs/>
-        </w:rPr>
-      </w:pPr>
-    </w:p>
-    <w:p>
-      <w:pPr>
-        <w:rPr>
-          <w:b/>
-          <w:bCs/>
-        </w:rPr>
-      </w:pPr>
-      <w:r>
-        <w:rPr>
-          <w:b/>
-          <w:bCs/>
-        </w:rPr>
-        <w:t>27/03/2026</w:t>
-      </w:r>
-    </w:p>
-    <w:p>
-      <w:pPr>
-        <w:rPr>
-          <w:b/>
-          <w:bCs/>
-          <w:color w:val="EE0000"/>
-        </w:rPr>
-      </w:pPr>
-      <w:r>
-        <w:rPr>
-          <w:b/>
-          <w:bCs/>
-          <w:color w:val="EE0000"/>
-        </w:rPr>
-        <w:t>Criar 1º a categoria “Imagens” e os atributos gerais (Cantos, Episódios, etc.)</w:t>
-      </w:r>
-    </w:p>
-    <w:p>
-      <w:pPr>
-        <w:rPr>
-          <w:b/>
-          <w:bCs/>
-        </w:rPr>
-      </w:pPr>
-    </w:p>
-    <w:p>
-      <w:r>
-        <w:t>Acrescentei a categoria: “Imagens”</w:t>
-      </w:r>
-      <w:r>
-        <w:t xml:space="preserve"> com o </w:t>
+      <w:r>
+        <w:lastRenderedPageBreak/>
+        <w:t>Dentro do atributo: Cantos, adicionei: “Canto I” (</w:t>
       </w:r>
       <w:proofErr w:type="spellStart"/>
       <w:r>
@@ -518,21 +1240,39 @@
       </w:r>
       <w:proofErr w:type="spellEnd"/>
       <w:r>
-        <w:t xml:space="preserve"> “</w:t>
-      </w:r>
-      <w:r>
-        <w:t>imagens</w:t>
-      </w:r>
-      <w:r>
-        <w:t>”</w:t>
-      </w:r>
-    </w:p>
-    <w:p>
-      <w:r>
-        <w:t>Acrescentei os atributos: “Cantos”</w:t>
-      </w:r>
-      <w:r>
-        <w:t xml:space="preserve"> (</w:t>
+        <w:t>: canto-</w:t>
+      </w:r>
+      <w:proofErr w:type="spellStart"/>
+      <w:r>
+        <w:t>i</w:t>
+      </w:r>
+      <w:r>
+        <w:t>_pa_cantos</w:t>
+      </w:r>
+      <w:proofErr w:type="spellEnd"/>
+      <w:r>
+        <w:t>) e “Canto II” (</w:t>
+      </w:r>
+      <w:proofErr w:type="spellStart"/>
+      <w:proofErr w:type="gramStart"/>
+      <w:r>
+        <w:t>slug:canto</w:t>
+      </w:r>
+      <w:proofErr w:type="gramEnd"/>
+      <w:r>
+        <w:t>-ii</w:t>
+      </w:r>
+      <w:r>
+        <w:t>_pa_cantos</w:t>
+      </w:r>
+      <w:proofErr w:type="spellEnd"/>
+      <w:r>
+        <w:t>)</w:t>
+      </w:r>
+    </w:p>
+    <w:p>
+      <w:r>
+        <w:t>Dentro de episódio, acrescentei os termos: Camões na gruta de Macau (</w:t>
       </w:r>
       <w:proofErr w:type="spellStart"/>
       <w:r>
@@ -540,25 +1280,47 @@
       </w:r>
       <w:proofErr w:type="spellEnd"/>
       <w:r>
-        <w:t>: cantos)</w:t>
-      </w:r>
-      <w:r>
-        <w:t xml:space="preserve"> e “Episódios”</w:t>
-      </w:r>
-      <w:r>
-        <w:t xml:space="preserve"> (</w:t>
-      </w:r>
-      <w:proofErr w:type="spellStart"/>
-      <w:r>
-        <w:t>slug</w:t>
-      </w:r>
-      <w:proofErr w:type="spellEnd"/>
-      <w:r>
         <w:t xml:space="preserve">: </w:t>
       </w:r>
       <w:proofErr w:type="spellStart"/>
       <w:r>
-        <w:t>episodios</w:t>
+        <w:t>camoes</w:t>
+      </w:r>
+      <w:proofErr w:type="spellEnd"/>
+      <w:r>
+        <w:t>-na-gruta-de-</w:t>
+      </w:r>
+      <w:proofErr w:type="spellStart"/>
+      <w:r>
+        <w:t>macau</w:t>
+      </w:r>
+      <w:r>
+        <w:t>_pa_episodios</w:t>
+      </w:r>
+      <w:proofErr w:type="spellEnd"/>
+      <w:r>
+        <w:t xml:space="preserve">) e </w:t>
+      </w:r>
+      <w:r>
+        <w:t>Visita do Rei de Melinde a Gama (visita-do-rei-de-</w:t>
+      </w:r>
+      <w:proofErr w:type="spellStart"/>
+      <w:r>
+        <w:t>melinde</w:t>
+      </w:r>
+      <w:proofErr w:type="spellEnd"/>
+      <w:r>
+        <w:t>-a-</w:t>
+      </w:r>
+      <w:proofErr w:type="spellStart"/>
+      <w:r>
+        <w:t>gama</w:t>
+      </w:r>
+      <w:r>
+        <w:t>_pa_episodios</w:t>
+      </w:r>
+      <w:r>
+        <w:t>f</w:t>
       </w:r>
       <w:proofErr w:type="spellEnd"/>
       <w:r>
@@ -568,105 +1330,6 @@
     <w:p/>
     <w:p>
       <w:r>
-        <w:t>Dentro do atributo: Cantos, adicionei: “Canto I” (</w:t>
-      </w:r>
-      <w:proofErr w:type="spellStart"/>
-      <w:r>
-        <w:t>slug</w:t>
-      </w:r>
-      <w:proofErr w:type="spellEnd"/>
-      <w:r>
-        <w:t>: canto-</w:t>
-      </w:r>
-      <w:proofErr w:type="spellStart"/>
-      <w:r>
-        <w:t>i</w:t>
-      </w:r>
-      <w:r>
-        <w:t>_pa_cantos</w:t>
-      </w:r>
-      <w:proofErr w:type="spellEnd"/>
-      <w:r>
-        <w:t>) e “Canto II” (</w:t>
-      </w:r>
-      <w:proofErr w:type="spellStart"/>
-      <w:proofErr w:type="gramStart"/>
-      <w:r>
-        <w:t>slug:canto</w:t>
-      </w:r>
-      <w:proofErr w:type="gramEnd"/>
-      <w:r>
-        <w:t>-ii</w:t>
-      </w:r>
-      <w:r>
-        <w:t>_pa_cantos</w:t>
-      </w:r>
-      <w:proofErr w:type="spellEnd"/>
-      <w:r>
-        <w:t>)</w:t>
-      </w:r>
-    </w:p>
-    <w:p>
-      <w:r>
-        <w:t>Dentro de episódio, acrescentei os termos: Camões na gruta de Macau (</w:t>
-      </w:r>
-      <w:proofErr w:type="spellStart"/>
-      <w:r>
-        <w:t>slug</w:t>
-      </w:r>
-      <w:proofErr w:type="spellEnd"/>
-      <w:r>
-        <w:t xml:space="preserve">: </w:t>
-      </w:r>
-      <w:proofErr w:type="spellStart"/>
-      <w:r>
-        <w:t>camoes</w:t>
-      </w:r>
-      <w:proofErr w:type="spellEnd"/>
-      <w:r>
-        <w:t>-na-gruta-de-</w:t>
-      </w:r>
-      <w:proofErr w:type="spellStart"/>
-      <w:r>
-        <w:t>macau</w:t>
-      </w:r>
-      <w:r>
-        <w:t>_pa_episodios</w:t>
-      </w:r>
-      <w:proofErr w:type="spellEnd"/>
-      <w:r>
-        <w:t xml:space="preserve">) e </w:t>
-      </w:r>
-      <w:r>
-        <w:t>Visita do Rei de Melinde a Gama (visita-do-rei-de-</w:t>
-      </w:r>
-      <w:proofErr w:type="spellStart"/>
-      <w:r>
-        <w:t>melinde</w:t>
-      </w:r>
-      <w:proofErr w:type="spellEnd"/>
-      <w:r>
-        <w:t>-a-</w:t>
-      </w:r>
-      <w:proofErr w:type="spellStart"/>
-      <w:r>
-        <w:t>gama</w:t>
-      </w:r>
-      <w:r>
-        <w:t>_pa_episodios</w:t>
-      </w:r>
-      <w:r>
-        <w:t>f</w:t>
-      </w:r>
-      <w:proofErr w:type="spellEnd"/>
-      <w:r>
-        <w:t>)</w:t>
-      </w:r>
-    </w:p>
-    <w:p/>
-    <w:p>
-      <w:r>
-        <w:lastRenderedPageBreak/>
         <w:t>Associei produtos à categoria “Imagens”</w:t>
       </w:r>
       <w:r>
@@ -879,6 +1542,7 @@
     </w:p>
     <w:p>
       <w:r>
+        <w:lastRenderedPageBreak/>
         <w:t xml:space="preserve">É possível </w:t>
       </w:r>
       <w:r>
@@ -948,7 +1612,6 @@
     </w:p>
     <w:p>
       <w:r>
-        <w:lastRenderedPageBreak/>
         <w:t xml:space="preserve">Alterei o </w:t>
       </w:r>
       <w:proofErr w:type="spellStart"/>
@@ -1351,7 +2014,6 @@
         <w:rPr>
           <w:lang w:val="en-US"/>
         </w:rPr>
-        <w:lastRenderedPageBreak/>
         <w:t xml:space="preserve">            </w:t>
       </w:r>
       <w:proofErr w:type="spellStart"/>
@@ -1721,7 +2383,7 @@
           <w:bCs/>
         </w:rPr>
       </w:pPr>
-      <w:hyperlink r:id="rId4" w:history="1">
+      <w:hyperlink r:id="rId5" w:history="1">
         <w:r>
           <w:rPr>
             <w:rStyle w:val="Hiperligao"/>
@@ -1789,7 +2451,7 @@
       <w:r>
         <w:t xml:space="preserve">Exemplo: </w:t>
       </w:r>
-      <w:hyperlink r:id="rId5" w:history="1">
+      <w:hyperlink r:id="rId6" w:history="1">
         <w:r>
           <w:rPr>
             <w:rStyle w:val="Hiperligao"/>
@@ -1802,7 +2464,7 @@
       </w:r>
     </w:p>
     <w:p>
-      <w:hyperlink r:id="rId6" w:history="1">
+      <w:hyperlink r:id="rId7" w:history="1">
         <w:r>
           <w:rPr>
             <w:rStyle w:val="Hiperligao"/>
@@ -1815,7 +2477,7 @@
       </w:r>
     </w:p>
     <w:p>
-      <w:hyperlink r:id="rId7" w:history="1">
+      <w:hyperlink r:id="rId8" w:history="1">
         <w:r>
           <w:rPr>
             <w:rStyle w:val="Hiperligao"/>
@@ -1828,7 +2490,7 @@
       </w:r>
     </w:p>
     <w:p>
-      <w:hyperlink r:id="rId8" w:history="1">
+      <w:hyperlink r:id="rId9" w:history="1">
         <w:r>
           <w:rPr>
             <w:rStyle w:val="Hiperligao"/>
@@ -1846,7 +2508,7 @@
       </w:r>
     </w:p>
     <w:p>
-      <w:hyperlink r:id="rId9" w:history="1">
+      <w:hyperlink r:id="rId10" w:history="1">
         <w:r>
           <w:rPr>
             <w:rStyle w:val="Hiperligao"/>
@@ -1859,7 +2521,7 @@
       </w:r>
     </w:p>
     <w:p>
-      <w:hyperlink r:id="rId10" w:history="1">
+      <w:hyperlink r:id="rId11" w:history="1">
         <w:r>
           <w:rPr>
             <w:rStyle w:val="Hiperligao"/>
@@ -1869,7 +2531,7 @@
       </w:hyperlink>
     </w:p>
     <w:p>
-      <w:hyperlink r:id="rId11" w:history="1">
+      <w:hyperlink r:id="rId12" w:history="1">
         <w:r>
           <w:rPr>
             <w:rStyle w:val="Hiperligao"/>
@@ -1879,7 +2541,7 @@
       </w:hyperlink>
     </w:p>
     <w:p>
-      <w:hyperlink r:id="rId12" w:history="1">
+      <w:hyperlink r:id="rId13" w:history="1">
         <w:r>
           <w:rPr>
             <w:rStyle w:val="Hiperligao"/>
@@ -1892,7 +2554,7 @@
       </w:r>
     </w:p>
     <w:p>
-      <w:hyperlink r:id="rId13" w:history="1">
+      <w:hyperlink r:id="rId14" w:history="1">
         <w:r>
           <w:rPr>
             <w:rStyle w:val="Hiperligao"/>
@@ -1902,7 +2564,7 @@
       </w:hyperlink>
     </w:p>
     <w:p>
-      <w:hyperlink r:id="rId14" w:history="1">
+      <w:hyperlink r:id="rId15" w:history="1">
         <w:r>
           <w:rPr>
             <w:rStyle w:val="Hiperligao"/>
@@ -1912,7 +2574,7 @@
       </w:hyperlink>
     </w:p>
     <w:p>
-      <w:hyperlink r:id="rId15" w:history="1">
+      <w:hyperlink r:id="rId16" w:history="1">
         <w:r>
           <w:rPr>
             <w:rStyle w:val="Hiperligao"/>
@@ -1923,7 +2585,7 @@
     </w:p>
     <w:p/>
     <w:p>
-      <w:hyperlink r:id="rId16" w:history="1">
+      <w:hyperlink r:id="rId17" w:history="1">
         <w:r>
           <w:rPr>
             <w:rStyle w:val="Hiperligao"/>
@@ -1933,7 +2595,7 @@
       </w:hyperlink>
     </w:p>
     <w:p>
-      <w:hyperlink r:id="rId17" w:history="1">
+      <w:hyperlink r:id="rId18" w:history="1">
         <w:r>
           <w:rPr>
             <w:rStyle w:val="Hiperligao"/>
@@ -1943,7 +2605,7 @@
       </w:hyperlink>
     </w:p>
     <w:p>
-      <w:hyperlink r:id="rId18" w:history="1">
+      <w:hyperlink r:id="rId19" w:history="1">
         <w:r>
           <w:rPr>
             <w:rStyle w:val="Hiperligao"/>
@@ -1953,7 +2615,7 @@
       </w:hyperlink>
     </w:p>
     <w:p>
-      <w:hyperlink r:id="rId19" w:history="1">
+      <w:hyperlink r:id="rId20" w:history="1">
         <w:r>
           <w:rPr>
             <w:rStyle w:val="Hiperligao"/>
@@ -1963,7 +2625,7 @@
       </w:hyperlink>
     </w:p>
     <w:p>
-      <w:hyperlink r:id="rId20" w:history="1">
+      <w:hyperlink r:id="rId21" w:history="1">
         <w:r>
           <w:rPr>
             <w:rStyle w:val="Hiperligao"/>
@@ -1979,7 +2641,7 @@
       </w:r>
     </w:p>
     <w:p>
-      <w:hyperlink r:id="rId21" w:history="1">
+      <w:hyperlink r:id="rId22" w:history="1">
         <w:r>
           <w:rPr>
             <w:rStyle w:val="Hiperligao"/>
@@ -1992,7 +2654,7 @@
       </w:r>
     </w:p>
     <w:p>
-      <w:hyperlink r:id="rId22" w:history="1">
+      <w:hyperlink r:id="rId23" w:history="1">
         <w:r>
           <w:rPr>
             <w:rStyle w:val="Hiperligao"/>
@@ -2096,7 +2758,6 @@
     </w:p>
     <w:p>
       <w:r>
-        <w:lastRenderedPageBreak/>
         <w:t xml:space="preserve">Extrair dados atualizados do </w:t>
       </w:r>
       <w:proofErr w:type="spellStart"/>
@@ -2204,6 +2865,7 @@
     <w:p/>
     <w:p>
       <w:r>
+        <w:lastRenderedPageBreak/>
         <w:t xml:space="preserve">Houve uma fusão de registos e os registos: </w:t>
       </w:r>
     </w:p>
@@ -2272,7 +2934,6 @@
         <w:rPr>
           <w:color w:val="000000" w:themeColor="text1"/>
         </w:rPr>
-        <w:lastRenderedPageBreak/>
         <w:t xml:space="preserve">599364 passou a: </w:t>
       </w:r>
       <w:r>
@@ -2521,6 +3182,7 @@
                 <w:lang w:eastAsia="pt-PT"/>
                 <w14:ligatures w14:val="none"/>
               </w:rPr>
+              <w:lastRenderedPageBreak/>
               <w:t>454907</w:t>
             </w:r>
           </w:p>
@@ -2634,7 +3296,7 @@
                 <w14:ligatures w14:val="none"/>
               </w:rPr>
             </w:pPr>
-            <w:hyperlink r:id="rId23" w:tgtFrame="_parent" w:history="1">
+            <w:hyperlink r:id="rId24" w:tgtFrame="_parent" w:history="1">
               <w:r>
                 <w:rPr>
                   <w:rFonts w:ascii="Aptos Narrow" w:eastAsia="Times New Roman" w:hAnsi="Aptos Narrow" w:cs="Times New Roman"/>
@@ -3018,7 +3680,6 @@
                 <w:lang w:eastAsia="pt-PT"/>
                 <w14:ligatures w14:val="none"/>
               </w:rPr>
-              <w:lastRenderedPageBreak/>
               <w:t>454907</w:t>
             </w:r>
           </w:p>
@@ -3132,7 +3793,7 @@
                 <w14:ligatures w14:val="none"/>
               </w:rPr>
             </w:pPr>
-            <w:hyperlink r:id="rId24" w:tgtFrame="_parent" w:history="1">
+            <w:hyperlink r:id="rId25" w:tgtFrame="_parent" w:history="1">
               <w:r>
                 <w:rPr>
                   <w:rFonts w:ascii="Aptos Narrow" w:eastAsia="Times New Roman" w:hAnsi="Aptos Narrow" w:cs="Times New Roman"/>
@@ -3516,6 +4177,7 @@
                 <w:lang w:eastAsia="pt-PT"/>
                 <w14:ligatures w14:val="none"/>
               </w:rPr>
+              <w:lastRenderedPageBreak/>
               <w:t>454907</w:t>
             </w:r>
           </w:p>
@@ -3629,7 +4291,7 @@
                 <w14:ligatures w14:val="none"/>
               </w:rPr>
             </w:pPr>
-            <w:hyperlink r:id="rId25" w:tgtFrame="_parent" w:history="1">
+            <w:hyperlink r:id="rId26" w:tgtFrame="_parent" w:history="1">
               <w:r>
                 <w:rPr>
                   <w:rFonts w:ascii="Aptos Narrow" w:eastAsia="Times New Roman" w:hAnsi="Aptos Narrow" w:cs="Times New Roman"/>

</xml_diff>

<commit_message>
changed cantos e séculos
</commit_message>
<xml_diff>
--- a/relatorio.docx
+++ b/relatorio.docx
@@ -14,16 +14,542 @@
           <w:b/>
           <w:bCs/>
         </w:rPr>
+        <w:t>07/04/2026</w:t>
+      </w:r>
+    </w:p>
+    <w:p>
+      <w:pPr>
+        <w:rPr>
+          <w:b/>
+          <w:bCs/>
+        </w:rPr>
+      </w:pPr>
+      <w:r>
+        <w:rPr>
+          <w:b/>
+          <w:bCs/>
+        </w:rPr>
+        <w:t xml:space="preserve">Sugestões do Paulo Barata: </w:t>
+      </w:r>
+    </w:p>
+    <w:p>
+      <w:r>
+        <w:t>Colocar os campos pela ordem em que se encontram no catálogo da BN</w:t>
+      </w:r>
+    </w:p>
+    <w:p>
+      <w:r>
+        <w:t xml:space="preserve">Perguntar Profª Isabel Almeida: </w:t>
+      </w:r>
+      <w:r>
+        <w:t>Magiar para a Húngaro e Chinês a Mandarim</w:t>
+      </w:r>
+    </w:p>
+    <w:p/>
+    <w:p>
+      <w:pPr>
+        <w:rPr>
+          <w:b/>
+          <w:bCs/>
+        </w:rPr>
+      </w:pPr>
+    </w:p>
+    <w:p>
+      <w:pPr>
+        <w:rPr>
+          <w:b/>
+          <w:bCs/>
+        </w:rPr>
+      </w:pPr>
+      <w:r>
+        <w:rPr>
+          <w:b/>
+          <w:bCs/>
+        </w:rPr>
+        <w:t>02/04/2026</w:t>
+      </w:r>
+    </w:p>
+    <w:p>
+      <w:pPr>
+        <w:rPr>
+          <w:b/>
+          <w:bCs/>
+          <w:color w:val="EE0000"/>
+        </w:rPr>
+      </w:pPr>
+      <w:r>
+        <w:rPr>
+          <w:b/>
+          <w:bCs/>
+          <w:color w:val="EE0000"/>
+        </w:rPr>
+        <w:t>Atenção aos atributos dos cantos e episódios</w:t>
+      </w:r>
+      <w:r>
+        <w:rPr>
+          <w:b/>
+          <w:bCs/>
+          <w:color w:val="EE0000"/>
+        </w:rPr>
+        <w:t xml:space="preserve">. Provavelmente </w:t>
+      </w:r>
+      <w:r>
+        <w:rPr>
+          <w:b/>
+          <w:bCs/>
+          <w:color w:val="EE0000"/>
+        </w:rPr>
+        <w:t>Canto deve ter o slug: pa_cantos</w:t>
+      </w:r>
+      <w:r>
+        <w:rPr>
+          <w:b/>
+          <w:bCs/>
+          <w:color w:val="EE0000"/>
+        </w:rPr>
+        <w:t xml:space="preserve"> e o mesmo procedimento para os episódios</w:t>
+      </w:r>
+    </w:p>
+    <w:p>
+      <w:pPr>
+        <w:rPr>
+          <w:b/>
+          <w:bCs/>
+        </w:rPr>
+      </w:pPr>
+    </w:p>
+    <w:p>
+      <w:pPr>
+        <w:rPr>
+          <w:b/>
+          <w:bCs/>
+        </w:rPr>
+      </w:pPr>
+      <w:r>
+        <w:rPr>
+          <w:b/>
+          <w:bCs/>
+        </w:rPr>
         <w:t>01/04/2026</w:t>
       </w:r>
     </w:p>
     <w:p>
+      <w:pPr>
+        <w:rPr>
+          <w:b/>
+          <w:bCs/>
+        </w:rPr>
+      </w:pPr>
+    </w:p>
+    <w:p>
+      <w:pPr>
+        <w:rPr>
+          <w:b/>
+          <w:bCs/>
+          <w:color w:val="EE0000"/>
+        </w:rPr>
+      </w:pPr>
+      <w:r>
+        <w:rPr>
+          <w:b/>
+          <w:bCs/>
+          <w:color w:val="EE0000"/>
+        </w:rPr>
+        <w:t>O problema está no thumbnail_id</w:t>
+      </w:r>
+      <w:r>
+        <w:rPr>
+          <w:b/>
+          <w:bCs/>
+          <w:color w:val="EE0000"/>
+        </w:rPr>
+        <w:t>, está se feita a ligação ao registo master</w:t>
+      </w:r>
+    </w:p>
+    <w:p>
+      <w:pPr>
+        <w:rPr>
+          <w:b/>
+          <w:bCs/>
+          <w:color w:val="EE0000"/>
+        </w:rPr>
+      </w:pPr>
+      <w:r>
+        <w:rPr>
+          <w:b/>
+          <w:bCs/>
+          <w:color w:val="EE0000"/>
+        </w:rPr>
+        <w:t>Correr sc</w:t>
+      </w:r>
+      <w:r>
+        <w:rPr>
+          <w:b/>
+          <w:bCs/>
+          <w:color w:val="EE0000"/>
+        </w:rPr>
+        <w:t>ript até postmeta_thumbs – ficheiro imagens1</w:t>
+      </w:r>
+      <w:r>
+        <w:rPr>
+          <w:b/>
+          <w:bCs/>
+          <w:color w:val="EE0000"/>
+        </w:rPr>
+        <w:t xml:space="preserve"> para ver se há diferença</w:t>
+      </w:r>
+    </w:p>
+    <w:p>
+      <w:r>
+        <w:t>9679 tem como parent o 7564 que tem no postmeta o meta_value 9430 que é a capa da obra</w:t>
+      </w:r>
+    </w:p>
+    <w:p>
+      <w:pPr>
+        <w:rPr>
+          <w:b/>
+          <w:bCs/>
+        </w:rPr>
+      </w:pPr>
+    </w:p>
+    <w:p>
+      <w:pPr>
+        <w:rPr>
+          <w:b/>
+          <w:bCs/>
+        </w:rPr>
+      </w:pPr>
+      <w:r>
+        <w:rPr>
+          <w:b/>
+          <w:bCs/>
+        </w:rPr>
+        <w:t>7564 – registo</w:t>
+      </w:r>
+    </w:p>
+    <w:p>
+      <w:pPr>
+        <w:rPr>
+          <w:b/>
+          <w:bCs/>
+        </w:rPr>
+      </w:pPr>
+      <w:r>
+        <w:rPr>
+          <w:b/>
+          <w:bCs/>
+        </w:rPr>
+        <w:lastRenderedPageBreak/>
+        <w:t xml:space="preserve">9679 </w:t>
+      </w:r>
+      <w:r>
+        <w:rPr>
+          <w:b/>
+          <w:bCs/>
+        </w:rPr>
+        <w:t>–</w:t>
+      </w:r>
+      <w:r>
+        <w:rPr>
+          <w:b/>
+          <w:bCs/>
+        </w:rPr>
+        <w:t xml:space="preserve"> </w:t>
+      </w:r>
+      <w:r>
+        <w:rPr>
+          <w:b/>
+          <w:bCs/>
+        </w:rPr>
+        <w:t>tem link para a imagem</w:t>
+      </w:r>
+    </w:p>
+    <w:p>
+      <w:pPr>
+        <w:rPr>
+          <w:b/>
+          <w:bCs/>
+        </w:rPr>
+      </w:pPr>
+      <w:r>
+        <w:rPr>
+          <w:b/>
+          <w:bCs/>
+        </w:rPr>
+        <w:t xml:space="preserve">9430 - </w:t>
+      </w:r>
+      <w:r>
+        <w:rPr>
+          <w:b/>
+          <w:bCs/>
+        </w:rPr>
+        <w:t>Tem a capa da obra</w:t>
+      </w:r>
+    </w:p>
+    <w:p>
+      <w:pPr>
+        <w:rPr>
+          <w:b/>
+          <w:bCs/>
+        </w:rPr>
+      </w:pPr>
+    </w:p>
+    <w:p>
+      <w:pPr>
+        <w:rPr>
+          <w:b/>
+          <w:bCs/>
+        </w:rPr>
+      </w:pPr>
+    </w:p>
+    <w:p>
+      <w:pPr>
+        <w:rPr>
+          <w:b/>
+          <w:bCs/>
+        </w:rPr>
+      </w:pPr>
+    </w:p>
+    <w:p>
+      <w:pPr>
+        <w:rPr>
+          <w:b/>
+          <w:bCs/>
+        </w:rPr>
+      </w:pPr>
+      <w:r>
+        <w:rPr>
+          <w:b/>
+          <w:bCs/>
+        </w:rPr>
+        <w:t xml:space="preserve">Ver se </w:t>
+      </w:r>
+      <w:r>
+        <w:rPr>
+          <w:b/>
+          <w:bCs/>
+        </w:rPr>
+        <w:t xml:space="preserve">depois de correr: </w:t>
+      </w:r>
+      <w:hyperlink r:id="rId4" w:tgtFrame="mysql_doc" w:history="1">
+        <w:r>
+          <w:rPr>
+            <w:rStyle w:val="Hiperligao"/>
+            <w:b/>
+            <w:bCs/>
+          </w:rPr>
+          <w:t>SELECT</w:t>
+        </w:r>
+      </w:hyperlink>
+      <w:r>
+        <w:rPr>
+          <w:b/>
+          <w:bCs/>
+        </w:rPr>
+        <w:t> * FROM `wp_postmeta` WHERE post_id = 8204;</w:t>
+      </w:r>
+    </w:p>
+    <w:p>
+      <w:pPr>
+        <w:rPr>
+          <w:b/>
+          <w:bCs/>
+        </w:rPr>
+      </w:pPr>
+      <w:r>
+        <w:rPr>
+          <w:b/>
+          <w:bCs/>
+        </w:rPr>
+        <w:t xml:space="preserve">Aparece. </w:t>
+      </w:r>
+    </w:p>
+    <w:tbl>
+      <w:tblPr>
+        <w:tblW w:w="0" w:type="dxa"/>
+        <w:shd w:val="clear" w:color="auto" w:fill="FFFFFF"/>
+        <w:tblCellMar>
+          <w:top w:w="15" w:type="dxa"/>
+          <w:left w:w="15" w:type="dxa"/>
+          <w:bottom w:w="15" w:type="dxa"/>
+          <w:right w:w="15" w:type="dxa"/>
+        </w:tblCellMar>
+        <w:tblLook w:val="04A0" w:firstRow="1" w:lastRow="0" w:firstColumn="1" w:lastColumn="0" w:noHBand="0" w:noVBand="1"/>
+      </w:tblPr>
+      <w:tblGrid>
+        <w:gridCol w:w="786"/>
+        <w:gridCol w:w="657"/>
+        <w:gridCol w:w="1695"/>
+        <w:gridCol w:w="657"/>
+      </w:tblGrid>
+      <w:tr>
+        <w:tc>
+          <w:tcPr>
+            <w:tcW w:w="0" w:type="auto"/>
+            <w:tcBorders>
+              <w:top w:val="single" w:sz="2" w:space="0" w:color="auto"/>
+              <w:left w:val="single" w:sz="2" w:space="0" w:color="auto"/>
+              <w:bottom w:val="single" w:sz="2" w:space="0" w:color="auto"/>
+              <w:right w:val="single" w:sz="2" w:space="0" w:color="auto"/>
+            </w:tcBorders>
+            <w:shd w:val="clear" w:color="auto" w:fill="FFFFFF"/>
+            <w:noWrap/>
+            <w:tcMar>
+              <w:top w:w="24" w:type="dxa"/>
+              <w:left w:w="72" w:type="dxa"/>
+              <w:bottom w:w="24" w:type="dxa"/>
+              <w:right w:w="72" w:type="dxa"/>
+            </w:tcMar>
+            <w:vAlign w:val="center"/>
+            <w:hideMark/>
+          </w:tcPr>
+          <w:p>
+            <w:pPr>
+              <w:rPr>
+                <w:b/>
+                <w:bCs/>
+              </w:rPr>
+            </w:pPr>
+            <w:r>
+              <w:rPr>
+                <w:b/>
+                <w:bCs/>
+              </w:rPr>
+              <w:t>11759</w:t>
+            </w:r>
+          </w:p>
+        </w:tc>
+        <w:tc>
+          <w:tcPr>
+            <w:tcW w:w="0" w:type="auto"/>
+            <w:tcBorders>
+              <w:top w:val="single" w:sz="2" w:space="0" w:color="000000"/>
+              <w:left w:val="single" w:sz="6" w:space="0" w:color="000000"/>
+              <w:bottom w:val="single" w:sz="6" w:space="0" w:color="000000"/>
+              <w:right w:val="single" w:sz="6" w:space="0" w:color="000000"/>
+            </w:tcBorders>
+            <w:shd w:val="clear" w:color="auto" w:fill="FFFFFF"/>
+            <w:noWrap/>
+            <w:tcMar>
+              <w:top w:w="24" w:type="dxa"/>
+              <w:left w:w="72" w:type="dxa"/>
+              <w:bottom w:w="24" w:type="dxa"/>
+              <w:right w:w="72" w:type="dxa"/>
+            </w:tcMar>
+            <w:vAlign w:val="center"/>
+            <w:hideMark/>
+          </w:tcPr>
+          <w:p>
+            <w:pPr>
+              <w:rPr>
+                <w:b/>
+                <w:bCs/>
+              </w:rPr>
+            </w:pPr>
+            <w:r>
+              <w:rPr>
+                <w:b/>
+                <w:bCs/>
+              </w:rPr>
+              <w:t>8204</w:t>
+            </w:r>
+          </w:p>
+        </w:tc>
+        <w:tc>
+          <w:tcPr>
+            <w:tcW w:w="0" w:type="auto"/>
+            <w:tcBorders>
+              <w:top w:val="single" w:sz="2" w:space="0" w:color="auto"/>
+              <w:left w:val="single" w:sz="2" w:space="0" w:color="auto"/>
+              <w:bottom w:val="single" w:sz="2" w:space="0" w:color="auto"/>
+              <w:right w:val="single" w:sz="2" w:space="0" w:color="auto"/>
+            </w:tcBorders>
+            <w:shd w:val="clear" w:color="auto" w:fill="FFFFFF"/>
+            <w:tcMar>
+              <w:top w:w="24" w:type="dxa"/>
+              <w:left w:w="72" w:type="dxa"/>
+              <w:bottom w:w="24" w:type="dxa"/>
+              <w:right w:w="72" w:type="dxa"/>
+            </w:tcMar>
+            <w:vAlign w:val="center"/>
+            <w:hideMark/>
+          </w:tcPr>
+          <w:p>
+            <w:pPr>
+              <w:rPr>
+                <w:b/>
+                <w:bCs/>
+              </w:rPr>
+            </w:pPr>
+            <w:r>
+              <w:rPr>
+                <w:b/>
+                <w:bCs/>
+              </w:rPr>
+              <w:t>_thumbnail_id</w:t>
+            </w:r>
+          </w:p>
+        </w:tc>
+        <w:tc>
+          <w:tcPr>
+            <w:tcW w:w="0" w:type="auto"/>
+            <w:tcBorders>
+              <w:top w:val="single" w:sz="2" w:space="0" w:color="auto"/>
+              <w:left w:val="single" w:sz="2" w:space="0" w:color="auto"/>
+              <w:bottom w:val="single" w:sz="2" w:space="0" w:color="auto"/>
+              <w:right w:val="single" w:sz="2" w:space="0" w:color="auto"/>
+            </w:tcBorders>
+            <w:shd w:val="clear" w:color="auto" w:fill="FFFFFF"/>
+            <w:tcMar>
+              <w:top w:w="24" w:type="dxa"/>
+              <w:left w:w="72" w:type="dxa"/>
+              <w:bottom w:w="24" w:type="dxa"/>
+              <w:right w:w="72" w:type="dxa"/>
+            </w:tcMar>
+            <w:vAlign w:val="center"/>
+            <w:hideMark/>
+          </w:tcPr>
+          <w:p>
+            <w:pPr>
+              <w:rPr>
+                <w:b/>
+                <w:bCs/>
+              </w:rPr>
+            </w:pPr>
+            <w:r>
+              <w:rPr>
+                <w:b/>
+                <w:bCs/>
+              </w:rPr>
+              <w:t>8969</w:t>
+            </w:r>
+          </w:p>
+        </w:tc>
+      </w:tr>
+    </w:tbl>
+    <w:p>
+      <w:pPr>
+        <w:rPr>
+          <w:b/>
+          <w:bCs/>
+        </w:rPr>
+      </w:pPr>
+    </w:p>
+    <w:p>
+      <w:pPr>
+        <w:rPr>
+          <w:b/>
+          <w:bCs/>
+        </w:rPr>
+      </w:pPr>
+    </w:p>
+    <w:p>
       <w:r>
         <w:t>Link para catálogo de imagens</w:t>
       </w:r>
     </w:p>
     <w:p>
-      <w:hyperlink r:id="rId4" w:history="1">
+      <w:hyperlink r:id="rId5" w:history="1">
         <w:r>
           <w:rPr>
             <w:rStyle w:val="Hiperligao"/>
@@ -36,6 +562,80 @@
       </w:r>
     </w:p>
     <w:p/>
+    <w:p>
+      <w:pPr>
+        <w:rPr>
+          <w:b/>
+          <w:bCs/>
+          <w:color w:val="EE0000"/>
+        </w:rPr>
+      </w:pPr>
+      <w:r>
+        <w:rPr>
+          <w:b/>
+          <w:bCs/>
+          <w:color w:val="EE0000"/>
+        </w:rPr>
+        <w:t>A numeração dos atributos do catálogo das imagens começa</w:t>
+      </w:r>
+      <w:r>
+        <w:rPr>
+          <w:b/>
+          <w:bCs/>
+          <w:color w:val="EE0000"/>
+        </w:rPr>
+        <w:t xml:space="preserve"> no 555 </w:t>
+      </w:r>
+      <w:r>
+        <w:rPr>
+          <w:b/>
+          <w:bCs/>
+          <w:color w:val="EE0000"/>
+        </w:rPr>
+        <w:t>e</w:t>
+      </w:r>
+      <w:r>
+        <w:rPr>
+          <w:b/>
+          <w:bCs/>
+          <w:color w:val="EE0000"/>
+        </w:rPr>
+        <w:t xml:space="preserve"> não no 554, devido à categoria “imagens_cat” ser a 554</w:t>
+      </w:r>
+    </w:p>
+    <w:p>
+      <w:pPr>
+        <w:rPr>
+          <w:b/>
+          <w:bCs/>
+          <w:color w:val="EE0000"/>
+        </w:rPr>
+      </w:pPr>
+      <w:r>
+        <w:rPr>
+          <w:b/>
+          <w:bCs/>
+          <w:color w:val="EE0000"/>
+        </w:rPr>
+        <w:t xml:space="preserve">Criar atributos das imagens antes de </w:t>
+      </w:r>
+      <w:r>
+        <w:rPr>
+          <w:b/>
+          <w:bCs/>
+          <w:color w:val="EE0000"/>
+        </w:rPr>
+        <w:t>acrescentar dados à tabela das taxonomias</w:t>
+      </w:r>
+      <w:r>
+        <w:rPr>
+          <w:b/>
+          <w:bCs/>
+          <w:color w:val="EE0000"/>
+        </w:rPr>
+        <w:t>, senão não é feita a ligação</w:t>
+      </w:r>
+    </w:p>
     <w:p/>
     <w:p>
       <w:r>
@@ -60,43 +660,44 @@
           <w:iCs/>
           <w:lang w:val="en-US"/>
         </w:rPr>
-        <w:t xml:space="preserve">function </w:t>
-      </w:r>
-      <w:proofErr w:type="spellStart"/>
-      <w:r>
+        <w:lastRenderedPageBreak/>
+        <w:t>function change_products_found_number() {</w:t>
+      </w:r>
+    </w:p>
+    <w:p>
+      <w:pPr>
+        <w:spacing w:after="0" w:line="240" w:lineRule="auto"/>
         <w:rPr>
           <w:i/>
           <w:iCs/>
           <w:lang w:val="en-US"/>
         </w:rPr>
-        <w:t>change_products_found_</w:t>
-      </w:r>
-      <w:proofErr w:type="gramStart"/>
+      </w:pPr>
       <w:r>
         <w:rPr>
           <w:i/>
           <w:iCs/>
           <w:lang w:val="en-US"/>
         </w:rPr>
-        <w:t>number</w:t>
-      </w:r>
-      <w:proofErr w:type="spellEnd"/>
-      <w:r>
+        <w:t xml:space="preserve">    ?&gt;</w:t>
+      </w:r>
+    </w:p>
+    <w:p>
+      <w:pPr>
+        <w:spacing w:after="0" w:line="240" w:lineRule="auto"/>
         <w:rPr>
           <w:i/>
           <w:iCs/>
           <w:lang w:val="en-US"/>
         </w:rPr>
-        <w:t>(</w:t>
-      </w:r>
-      <w:proofErr w:type="gramEnd"/>
+      </w:pPr>
       <w:r>
         <w:rPr>
           <w:i/>
           <w:iCs/>
           <w:lang w:val="en-US"/>
         </w:rPr>
-        <w:t>) {</w:t>
+        <w:t xml:space="preserve">    &lt;script&gt;</w:t>
       </w:r>
     </w:p>
     <w:p>
@@ -114,7 +715,7 @@
           <w:iCs/>
           <w:lang w:val="en-US"/>
         </w:rPr>
-        <w:t xml:space="preserve">    ?&gt;</w:t>
+        <w:t xml:space="preserve">        jQuery(document).ready(function($) {</w:t>
       </w:r>
     </w:p>
     <w:p>
@@ -132,7 +733,7 @@
           <w:iCs/>
           <w:lang w:val="en-US"/>
         </w:rPr>
-        <w:t xml:space="preserve">    &lt;script&gt;</w:t>
+        <w:t xml:space="preserve">            if ($('.products-found strong').text() === '2115') {</w:t>
       </w:r>
     </w:p>
     <w:p>
@@ -150,374 +751,116 @@
           <w:iCs/>
           <w:lang w:val="en-US"/>
         </w:rPr>
-        <w:t xml:space="preserve">        jQuery(document</w:t>
-      </w:r>
-      <w:proofErr w:type="gramStart"/>
-      <w:r>
+        <w:t xml:space="preserve">                $('.products-found strong').text('1249');</w:t>
+      </w:r>
+    </w:p>
+    <w:p>
+      <w:pPr>
+        <w:spacing w:after="0" w:line="240" w:lineRule="auto"/>
         <w:rPr>
           <w:i/>
           <w:iCs/>
           <w:lang w:val="en-US"/>
         </w:rPr>
-        <w:t>).ready</w:t>
-      </w:r>
-      <w:proofErr w:type="gramEnd"/>
+      </w:pPr>
       <w:r>
         <w:rPr>
           <w:i/>
           <w:iCs/>
           <w:lang w:val="en-US"/>
         </w:rPr>
-        <w:t>(</w:t>
-      </w:r>
-      <w:proofErr w:type="gramStart"/>
-      <w:r>
+        <w:t xml:space="preserve">            }</w:t>
+      </w:r>
+    </w:p>
+    <w:p>
+      <w:pPr>
+        <w:spacing w:after="0" w:line="240" w:lineRule="auto"/>
         <w:rPr>
           <w:i/>
           <w:iCs/>
           <w:lang w:val="en-US"/>
         </w:rPr>
-        <w:t>function(</w:t>
-      </w:r>
-      <w:proofErr w:type="gramEnd"/>
+      </w:pPr>
       <w:r>
         <w:rPr>
           <w:i/>
           <w:iCs/>
           <w:lang w:val="en-US"/>
         </w:rPr>
-        <w:t>$</w:t>
-      </w:r>
-      <w:proofErr w:type="gramStart"/>
-      <w:r>
+        <w:t xml:space="preserve">        });</w:t>
+      </w:r>
+    </w:p>
+    <w:p>
+      <w:pPr>
+        <w:spacing w:after="0" w:line="240" w:lineRule="auto"/>
         <w:rPr>
           <w:i/>
           <w:iCs/>
           <w:lang w:val="en-US"/>
         </w:rPr>
-        <w:t>) {</w:t>
-      </w:r>
-      <w:proofErr w:type="gramEnd"/>
-    </w:p>
-    <w:p>
-      <w:pPr>
-        <w:spacing w:after="0" w:line="240" w:lineRule="auto"/>
+      </w:pPr>
+      <w:r>
         <w:rPr>
           <w:i/>
           <w:iCs/>
           <w:lang w:val="en-US"/>
         </w:rPr>
-      </w:pPr>
-      <w:r>
+        <w:t xml:space="preserve">    &lt;/script&gt;</w:t>
+      </w:r>
+    </w:p>
+    <w:p>
+      <w:pPr>
+        <w:spacing w:after="0" w:line="240" w:lineRule="auto"/>
         <w:rPr>
           <w:i/>
           <w:iCs/>
           <w:lang w:val="en-US"/>
         </w:rPr>
-        <w:t xml:space="preserve">            if ($(</w:t>
-      </w:r>
-      <w:proofErr w:type="gramStart"/>
+      </w:pPr>
       <w:r>
         <w:rPr>
           <w:i/>
           <w:iCs/>
           <w:lang w:val="en-US"/>
         </w:rPr>
-        <w:t>'.products</w:t>
-      </w:r>
-      <w:proofErr w:type="gramEnd"/>
-      <w:r>
+        <w:t xml:space="preserve">    &lt;?php</w:t>
+      </w:r>
+    </w:p>
+    <w:p>
+      <w:pPr>
+        <w:spacing w:after="0" w:line="240" w:lineRule="auto"/>
         <w:rPr>
           <w:i/>
           <w:iCs/>
           <w:lang w:val="en-US"/>
         </w:rPr>
-        <w:t>-found strong').</w:t>
-      </w:r>
-      <w:proofErr w:type="gramStart"/>
+      </w:pPr>
       <w:r>
         <w:rPr>
           <w:i/>
           <w:iCs/>
           <w:lang w:val="en-US"/>
         </w:rPr>
-        <w:t>text(</w:t>
-      </w:r>
-      <w:proofErr w:type="gramEnd"/>
-      <w:r>
+        <w:t>}</w:t>
+      </w:r>
+    </w:p>
+    <w:p>
+      <w:pPr>
+        <w:spacing w:after="0" w:line="240" w:lineRule="auto"/>
         <w:rPr>
           <w:i/>
           <w:iCs/>
           <w:lang w:val="en-US"/>
         </w:rPr>
-        <w:t>) === '2115') {</w:t>
-      </w:r>
-    </w:p>
-    <w:p>
-      <w:pPr>
-        <w:spacing w:after="0" w:line="240" w:lineRule="auto"/>
+      </w:pPr>
+      <w:r>
         <w:rPr>
           <w:i/>
           <w:iCs/>
           <w:lang w:val="en-US"/>
         </w:rPr>
-      </w:pPr>
-      <w:r>
-        <w:rPr>
-          <w:i/>
-          <w:iCs/>
-          <w:lang w:val="en-US"/>
-        </w:rPr>
-        <w:t xml:space="preserve">                $(</w:t>
-      </w:r>
-      <w:proofErr w:type="gramStart"/>
-      <w:r>
-        <w:rPr>
-          <w:i/>
-          <w:iCs/>
-          <w:lang w:val="en-US"/>
-        </w:rPr>
-        <w:t>'.products</w:t>
-      </w:r>
-      <w:proofErr w:type="gramEnd"/>
-      <w:r>
-        <w:rPr>
-          <w:i/>
-          <w:iCs/>
-          <w:lang w:val="en-US"/>
-        </w:rPr>
-        <w:t>-found strong').</w:t>
-      </w:r>
-      <w:proofErr w:type="gramStart"/>
-      <w:r>
-        <w:rPr>
-          <w:i/>
-          <w:iCs/>
-          <w:lang w:val="en-US"/>
-        </w:rPr>
-        <w:t>text(</w:t>
-      </w:r>
-      <w:proofErr w:type="gramEnd"/>
-      <w:r>
-        <w:rPr>
-          <w:i/>
-          <w:iCs/>
-          <w:lang w:val="en-US"/>
-        </w:rPr>
-        <w:t>'1249'</w:t>
-      </w:r>
-      <w:proofErr w:type="gramStart"/>
-      <w:r>
-        <w:rPr>
-          <w:i/>
-          <w:iCs/>
-          <w:lang w:val="en-US"/>
-        </w:rPr>
-        <w:t>);</w:t>
-      </w:r>
-      <w:proofErr w:type="gramEnd"/>
-    </w:p>
-    <w:p>
-      <w:pPr>
-        <w:spacing w:after="0" w:line="240" w:lineRule="auto"/>
-        <w:rPr>
-          <w:i/>
-          <w:iCs/>
-          <w:lang w:val="en-US"/>
-        </w:rPr>
-      </w:pPr>
-      <w:r>
-        <w:rPr>
-          <w:i/>
-          <w:iCs/>
-          <w:lang w:val="en-US"/>
-        </w:rPr>
-        <w:t xml:space="preserve">            }</w:t>
-      </w:r>
-    </w:p>
-    <w:p>
-      <w:pPr>
-        <w:spacing w:after="0" w:line="240" w:lineRule="auto"/>
-        <w:rPr>
-          <w:i/>
-          <w:iCs/>
-          <w:lang w:val="en-US"/>
-        </w:rPr>
-      </w:pPr>
-      <w:r>
-        <w:rPr>
-          <w:i/>
-          <w:iCs/>
-          <w:lang w:val="en-US"/>
-        </w:rPr>
-        <w:t xml:space="preserve">        }</w:t>
-      </w:r>
-      <w:proofErr w:type="gramStart"/>
-      <w:r>
-        <w:rPr>
-          <w:i/>
-          <w:iCs/>
-          <w:lang w:val="en-US"/>
-        </w:rPr>
-        <w:t>);</w:t>
-      </w:r>
-      <w:proofErr w:type="gramEnd"/>
-    </w:p>
-    <w:p>
-      <w:pPr>
-        <w:spacing w:after="0" w:line="240" w:lineRule="auto"/>
-        <w:rPr>
-          <w:i/>
-          <w:iCs/>
-          <w:lang w:val="en-US"/>
-        </w:rPr>
-      </w:pPr>
-      <w:r>
-        <w:rPr>
-          <w:i/>
-          <w:iCs/>
-          <w:lang w:val="en-US"/>
-        </w:rPr>
-        <w:t xml:space="preserve">    &lt;/script&gt;</w:t>
-      </w:r>
-    </w:p>
-    <w:p>
-      <w:pPr>
-        <w:spacing w:after="0" w:line="240" w:lineRule="auto"/>
-        <w:rPr>
-          <w:i/>
-          <w:iCs/>
-          <w:lang w:val="en-US"/>
-        </w:rPr>
-      </w:pPr>
-      <w:r>
-        <w:rPr>
-          <w:i/>
-          <w:iCs/>
-          <w:lang w:val="en-US"/>
-        </w:rPr>
-        <w:t xml:space="preserve">    &lt;?</w:t>
-      </w:r>
-      <w:proofErr w:type="spellStart"/>
-      <w:r>
-        <w:rPr>
-          <w:i/>
-          <w:iCs/>
-          <w:lang w:val="en-US"/>
-        </w:rPr>
-        <w:t>php</w:t>
-      </w:r>
-      <w:proofErr w:type="spellEnd"/>
-    </w:p>
-    <w:p>
-      <w:pPr>
-        <w:spacing w:after="0" w:line="240" w:lineRule="auto"/>
-        <w:rPr>
-          <w:i/>
-          <w:iCs/>
-          <w:lang w:val="en-US"/>
-        </w:rPr>
-      </w:pPr>
-      <w:r>
-        <w:rPr>
-          <w:i/>
-          <w:iCs/>
-          <w:lang w:val="en-US"/>
-        </w:rPr>
-        <w:t>}</w:t>
-      </w:r>
-    </w:p>
-    <w:p>
-      <w:pPr>
-        <w:spacing w:after="0" w:line="240" w:lineRule="auto"/>
-        <w:rPr>
-          <w:i/>
-          <w:iCs/>
-          <w:lang w:val="en-US"/>
-        </w:rPr>
-      </w:pPr>
-      <w:proofErr w:type="spellStart"/>
-      <w:r>
-        <w:rPr>
-          <w:i/>
-          <w:iCs/>
-          <w:lang w:val="en-US"/>
-        </w:rPr>
-        <w:t>add_</w:t>
-      </w:r>
-      <w:proofErr w:type="gramStart"/>
-      <w:r>
-        <w:rPr>
-          <w:i/>
-          <w:iCs/>
-          <w:lang w:val="en-US"/>
-        </w:rPr>
-        <w:t>action</w:t>
-      </w:r>
-      <w:proofErr w:type="spellEnd"/>
-      <w:r>
-        <w:rPr>
-          <w:i/>
-          <w:iCs/>
-          <w:lang w:val="en-US"/>
-        </w:rPr>
-        <w:t>(</w:t>
-      </w:r>
-      <w:proofErr w:type="gramEnd"/>
-      <w:r>
-        <w:rPr>
-          <w:i/>
-          <w:iCs/>
-          <w:lang w:val="en-US"/>
-        </w:rPr>
-        <w:t>'</w:t>
-      </w:r>
-      <w:proofErr w:type="spellStart"/>
-      <w:r>
-        <w:rPr>
-          <w:i/>
-          <w:iCs/>
-          <w:lang w:val="en-US"/>
-        </w:rPr>
-        <w:t>wp_footer</w:t>
-      </w:r>
-      <w:proofErr w:type="spellEnd"/>
-      <w:r>
-        <w:rPr>
-          <w:i/>
-          <w:iCs/>
-          <w:lang w:val="en-US"/>
-        </w:rPr>
-        <w:t>', '</w:t>
-      </w:r>
-      <w:proofErr w:type="spellStart"/>
-      <w:r>
-        <w:rPr>
-          <w:i/>
-          <w:iCs/>
-          <w:lang w:val="en-US"/>
-        </w:rPr>
-        <w:t>change_products_found_number</w:t>
-      </w:r>
-      <w:proofErr w:type="spellEnd"/>
-      <w:r>
-        <w:rPr>
-          <w:i/>
-          <w:iCs/>
-          <w:lang w:val="en-US"/>
-        </w:rPr>
-        <w:t>'</w:t>
-      </w:r>
-      <w:proofErr w:type="gramStart"/>
-      <w:r>
-        <w:rPr>
-          <w:i/>
-          <w:iCs/>
-          <w:lang w:val="en-US"/>
-        </w:rPr>
-        <w:t>);</w:t>
-      </w:r>
-      <w:proofErr w:type="gramEnd"/>
+        <w:t>add_action('wp_footer', 'change_products_found_number');</w:t>
+      </w:r>
     </w:p>
     <w:p>
       <w:pPr>
@@ -575,746 +918,398 @@
           <w:bCs/>
           <w:color w:val="EE0000"/>
         </w:rPr>
+        <w:t xml:space="preserve">Tive de alterar a numeração do ficheiro “imagens” de “data_csv” de </w:t>
+      </w:r>
+      <w:r>
+        <w:rPr>
+          <w:b/>
+          <w:bCs/>
+          <w:color w:val="EE0000"/>
+        </w:rPr>
+        <w:t>7341 para 9456, senão não haveria encontro entre os posts das imagens (das imagens) e o os registos do ficheiro “data_csv.imagens”</w:t>
+      </w:r>
+    </w:p>
+    <w:p>
+      <w:pPr>
+        <w:rPr>
+          <w:b/>
+          <w:bCs/>
+          <w:color w:val="EE0000"/>
+        </w:rPr>
+      </w:pPr>
+    </w:p>
+    <w:p>
+      <w:pPr>
+        <w:rPr>
+          <w:b/>
+          <w:bCs/>
+        </w:rPr>
+      </w:pPr>
+    </w:p>
+    <w:p>
+      <w:pPr>
+        <w:rPr>
+          <w:b/>
+          <w:bCs/>
+        </w:rPr>
+      </w:pPr>
+      <w:r>
+        <w:rPr>
+          <w:b/>
+          <w:bCs/>
+        </w:rPr>
+        <w:t>30/03/2026</w:t>
+      </w:r>
+    </w:p>
+    <w:p>
+      <w:pPr>
+        <w:rPr>
+          <w:b/>
+          <w:bCs/>
+          <w:color w:val="EE0000"/>
+        </w:rPr>
+      </w:pPr>
+      <w:r>
+        <w:rPr>
+          <w:b/>
+          <w:bCs/>
+          <w:color w:val="EE0000"/>
+        </w:rPr>
+        <w:t>Eliminar as linhas a mais do ficheiro “imagens.csv”</w:t>
+      </w:r>
+    </w:p>
+    <w:p>
+      <w:pPr>
+        <w:rPr>
+          <w:b/>
+          <w:bCs/>
+        </w:rPr>
+      </w:pPr>
+    </w:p>
+    <w:p>
+      <w:r>
+        <w:t>Acrescentei “imagens” ao ficheiro das categorias do catálogo – será a única categoria do catálogo das imagens, o resto serão atributos</w:t>
+      </w:r>
+    </w:p>
+    <w:p>
+      <w:pPr>
+        <w:rPr>
+          <w:b/>
+          <w:bCs/>
+        </w:rPr>
+      </w:pPr>
+      <w:r>
+        <w:rPr>
+          <w:b/>
+          <w:bCs/>
+        </w:rPr>
+        <w:t>Foi necessário acrescentar</w:t>
+      </w:r>
+      <w:r>
+        <w:rPr>
+          <w:b/>
+          <w:bCs/>
+        </w:rPr>
+        <w:t xml:space="preserve"> a create_categories.py:</w:t>
+      </w:r>
+    </w:p>
+    <w:p>
+      <w:pPr>
+        <w:rPr>
+          <w:lang w:val="en-US"/>
+        </w:rPr>
+      </w:pPr>
+      <w:r>
+        <w:t xml:space="preserve">                            </w:t>
+      </w:r>
+      <w:r>
+        <w:rPr>
+          <w:lang w:val="en-US"/>
+        </w:rPr>
+        <w:t>if 'Cantos' in categories:</w:t>
+      </w:r>
+    </w:p>
+    <w:p>
+      <w:pPr>
+        <w:rPr>
+          <w:lang w:val="en-US"/>
+        </w:rPr>
+      </w:pPr>
+      <w:r>
+        <w:rPr>
+          <w:lang w:val="en-US"/>
+        </w:rPr>
+        <w:t>                                 category_suffix = '_pa_cantos'</w:t>
+      </w:r>
+    </w:p>
+    <w:p>
+      <w:pPr>
+        <w:rPr>
+          <w:lang w:val="en-US"/>
+        </w:rPr>
+      </w:pPr>
+      <w:r>
+        <w:rPr>
+          <w:lang w:val="en-US"/>
+        </w:rPr>
+        <w:t>                            elif 'Episódios' in categories:</w:t>
+      </w:r>
+    </w:p>
+    <w:p>
+      <w:pPr>
+        <w:rPr>
+          <w:lang w:val="en-US"/>
+        </w:rPr>
+      </w:pPr>
+      <w:r>
+        <w:rPr>
+          <w:lang w:val="en-US"/>
+        </w:rPr>
+        <w:t>                                 category_suffix = '_pa_episodios'</w:t>
+      </w:r>
+    </w:p>
+    <w:p>
+      <w:pPr>
+        <w:rPr>
+          <w:lang w:val="en-US"/>
+        </w:rPr>
+      </w:pPr>
+      <w:r>
+        <w:rPr>
+          <w:lang w:val="en-US"/>
+        </w:rPr>
+        <w:t>                            slugs_text = "".join(slugs) + category_suffix</w:t>
+      </w:r>
+    </w:p>
+    <w:p>
+      <w:pPr>
+        <w:rPr>
+          <w:lang w:val="en-US"/>
+        </w:rPr>
+      </w:pPr>
+      <w:r>
+        <w:rPr>
+          <w:lang w:val="en-US"/>
+        </w:rPr>
+        <w:t xml:space="preserve">                            </w:t>
+      </w:r>
+      <w:r>
+        <w:rPr>
+          <w:lang w:val="en-US"/>
+        </w:rPr>
+        <w:t>print(slugs_text)</w:t>
+      </w:r>
+    </w:p>
+    <w:p>
+      <w:pPr>
+        <w:rPr>
+          <w:b/>
+          <w:bCs/>
+          <w:lang w:val="en-US"/>
+        </w:rPr>
+      </w:pPr>
+    </w:p>
+    <w:p>
+      <w:pPr>
+        <w:rPr>
+          <w:b/>
+          <w:bCs/>
+          <w:lang w:val="en-US"/>
+        </w:rPr>
+      </w:pPr>
+      <w:r>
+        <w:rPr>
+          <w:b/>
+          <w:bCs/>
+          <w:lang w:val="en-US"/>
+        </w:rPr>
+        <w:t>e a create_taxonomies.py</w:t>
+      </w:r>
+    </w:p>
+    <w:p>
+      <w:r>
+        <w:rPr>
+          <w:lang w:val="en-US"/>
+        </w:rPr>
+        <w:t xml:space="preserve">            </w:t>
+      </w:r>
+      <w:r>
+        <w:t>elif '_cantos' in categories[i][2]:</w:t>
+      </w:r>
+    </w:p>
+    <w:p>
+      <w:r>
+        <w:t>                taxonomy = 'pa_cantos'</w:t>
+      </w:r>
+    </w:p>
+    <w:p>
+      <w:r>
+        <w:t>            elif '_episodios' in categories[i][2]:</w:t>
+      </w:r>
+    </w:p>
+    <w:p>
+      <w:r>
+        <w:t>                taxonomy = 'pa_episodios'</w:t>
+      </w:r>
+    </w:p>
+    <w:p>
+      <w:pPr>
+        <w:rPr>
+          <w:b/>
+          <w:bCs/>
+        </w:rPr>
+      </w:pPr>
+    </w:p>
+    <w:p>
+      <w:pPr>
+        <w:rPr>
+          <w:b/>
+          <w:bCs/>
+        </w:rPr>
+      </w:pPr>
+    </w:p>
+    <w:p>
+      <w:pPr>
+        <w:rPr>
+          <w:b/>
+          <w:bCs/>
+        </w:rPr>
+      </w:pPr>
+      <w:r>
+        <w:rPr>
+          <w:b/>
+          <w:bCs/>
+        </w:rPr>
         <w:lastRenderedPageBreak/>
-        <w:t>Tive de alterar a numeração do ficheiro “imagens” de “</w:t>
-      </w:r>
-      <w:proofErr w:type="spellStart"/>
-      <w:r>
+        <w:t>Faltam os restantes atributos de imagens</w:t>
+      </w:r>
+    </w:p>
+    <w:p>
+      <w:pPr>
+        <w:rPr>
+          <w:b/>
+          <w:bCs/>
+        </w:rPr>
+      </w:pPr>
+    </w:p>
+    <w:p/>
+    <w:p>
+      <w:pPr>
+        <w:rPr>
+          <w:b/>
+          <w:bCs/>
+        </w:rPr>
+      </w:pPr>
+    </w:p>
+    <w:p>
+      <w:pPr>
+        <w:rPr>
+          <w:b/>
+          <w:bCs/>
+        </w:rPr>
+      </w:pPr>
+    </w:p>
+    <w:p>
+      <w:pPr>
+        <w:rPr>
+          <w:b/>
+          <w:bCs/>
+        </w:rPr>
+      </w:pPr>
+      <w:r>
+        <w:rPr>
+          <w:b/>
+          <w:bCs/>
+        </w:rPr>
+        <w:t>27/03/2026</w:t>
+      </w:r>
+    </w:p>
+    <w:p>
+      <w:pPr>
         <w:rPr>
           <w:b/>
           <w:bCs/>
           <w:color w:val="EE0000"/>
         </w:rPr>
-        <w:t>data_csv</w:t>
-      </w:r>
-      <w:proofErr w:type="spellEnd"/>
+      </w:pPr>
       <w:r>
         <w:rPr>
           <w:b/>
           <w:bCs/>
           <w:color w:val="EE0000"/>
         </w:rPr>
-        <w:t xml:space="preserve">” de </w:t>
-      </w:r>
-      <w:r>
-        <w:rPr>
-          <w:b/>
-          <w:bCs/>
-          <w:color w:val="EE0000"/>
-        </w:rPr>
-        <w:t xml:space="preserve">7341 para 9456, senão não haveria encontro entre os </w:t>
-      </w:r>
-      <w:proofErr w:type="spellStart"/>
-      <w:r>
-        <w:rPr>
-          <w:b/>
-          <w:bCs/>
-          <w:color w:val="EE0000"/>
-        </w:rPr>
-        <w:t>posts</w:t>
-      </w:r>
-      <w:proofErr w:type="spellEnd"/>
-      <w:r>
-        <w:rPr>
-          <w:b/>
-          <w:bCs/>
-          <w:color w:val="EE0000"/>
-        </w:rPr>
-        <w:t xml:space="preserve"> das imagens (das imagens) e o os registos do ficheiro “</w:t>
-      </w:r>
-      <w:proofErr w:type="spellStart"/>
-      <w:r>
-        <w:rPr>
-          <w:b/>
-          <w:bCs/>
-          <w:color w:val="EE0000"/>
-        </w:rPr>
-        <w:t>data_</w:t>
-      </w:r>
-      <w:proofErr w:type="gramStart"/>
-      <w:r>
-        <w:rPr>
-          <w:b/>
-          <w:bCs/>
-          <w:color w:val="EE0000"/>
-        </w:rPr>
-        <w:t>csv.imagens</w:t>
-      </w:r>
-      <w:proofErr w:type="spellEnd"/>
-      <w:proofErr w:type="gramEnd"/>
-      <w:r>
-        <w:rPr>
-          <w:b/>
-          <w:bCs/>
-          <w:color w:val="EE0000"/>
-        </w:rPr>
+        <w:t>Criar 1º a categoria “Imagens” e os atributos gerais (Cantos, Episódios, etc.)</w:t>
+      </w:r>
+    </w:p>
+    <w:p>
+      <w:pPr>
+        <w:rPr>
+          <w:b/>
+          <w:bCs/>
+        </w:rPr>
+      </w:pPr>
+    </w:p>
+    <w:p>
+      <w:r>
+        <w:t>Acrescentei a categoria: “Imagens”</w:t>
+      </w:r>
+      <w:r>
+        <w:t xml:space="preserve"> com o slug “</w:t>
+      </w:r>
+      <w:r>
+        <w:t>imagens</w:t>
+      </w:r>
+      <w:r>
         <w:t>”</w:t>
       </w:r>
     </w:p>
     <w:p>
-      <w:pPr>
-        <w:rPr>
-          <w:b/>
-          <w:bCs/>
-          <w:color w:val="EE0000"/>
-        </w:rPr>
-      </w:pPr>
-    </w:p>
-    <w:p>
-      <w:pPr>
-        <w:rPr>
-          <w:b/>
-          <w:bCs/>
-        </w:rPr>
-      </w:pPr>
-    </w:p>
-    <w:p>
-      <w:pPr>
-        <w:rPr>
-          <w:b/>
-          <w:bCs/>
-        </w:rPr>
-      </w:pPr>
-      <w:r>
-        <w:rPr>
-          <w:b/>
-          <w:bCs/>
-        </w:rPr>
-        <w:t>30/03/2026</w:t>
-      </w:r>
-    </w:p>
-    <w:p>
-      <w:pPr>
-        <w:rPr>
-          <w:b/>
-          <w:bCs/>
-          <w:color w:val="EE0000"/>
-        </w:rPr>
-      </w:pPr>
-      <w:r>
-        <w:rPr>
-          <w:b/>
-          <w:bCs/>
-          <w:color w:val="EE0000"/>
-        </w:rPr>
-        <w:t>Eliminar as linhas a mais do ficheiro “imagens.csv”</w:t>
-      </w:r>
-    </w:p>
-    <w:p>
-      <w:pPr>
-        <w:rPr>
-          <w:b/>
-          <w:bCs/>
-        </w:rPr>
-      </w:pPr>
-    </w:p>
-    <w:p>
-      <w:r>
-        <w:t>Acrescentei “imagens” ao ficheiro das categorias do catálogo – será a única categoria do catálogo das imagens, o resto serão atributos</w:t>
-      </w:r>
-    </w:p>
-    <w:p>
-      <w:pPr>
-        <w:rPr>
-          <w:b/>
-          <w:bCs/>
-        </w:rPr>
-      </w:pPr>
-      <w:r>
-        <w:rPr>
-          <w:b/>
-          <w:bCs/>
-        </w:rPr>
-        <w:t>Foi necessário acrescentar</w:t>
-      </w:r>
-      <w:r>
-        <w:rPr>
-          <w:b/>
-          <w:bCs/>
-        </w:rPr>
-        <w:t xml:space="preserve"> a create_categories.py:</w:t>
-      </w:r>
-    </w:p>
-    <w:p>
-      <w:pPr>
-        <w:rPr>
-          <w:lang w:val="en-US"/>
-        </w:rPr>
-      </w:pPr>
-      <w:r>
-        <w:t xml:space="preserve">                            </w:t>
-      </w:r>
-      <w:r>
-        <w:rPr>
-          <w:lang w:val="en-US"/>
-        </w:rPr>
-        <w:t>if 'Cantos' in categories:</w:t>
-      </w:r>
-    </w:p>
-    <w:p>
-      <w:pPr>
-        <w:rPr>
-          <w:lang w:val="en-US"/>
-        </w:rPr>
-      </w:pPr>
-      <w:r>
-        <w:rPr>
-          <w:lang w:val="en-US"/>
-        </w:rPr>
-        <w:t>                                 </w:t>
-      </w:r>
-      <w:proofErr w:type="spellStart"/>
-      <w:r>
-        <w:rPr>
-          <w:lang w:val="en-US"/>
-        </w:rPr>
-        <w:t>category_suffix</w:t>
-      </w:r>
-      <w:proofErr w:type="spellEnd"/>
-      <w:r>
-        <w:rPr>
-          <w:lang w:val="en-US"/>
-        </w:rPr>
-        <w:t xml:space="preserve"> </w:t>
-      </w:r>
-      <w:proofErr w:type="gramStart"/>
-      <w:r>
-        <w:rPr>
-          <w:lang w:val="en-US"/>
-        </w:rPr>
-        <w:t>= '_</w:t>
-      </w:r>
-      <w:proofErr w:type="spellStart"/>
-      <w:proofErr w:type="gramEnd"/>
-      <w:r>
-        <w:rPr>
-          <w:lang w:val="en-US"/>
-        </w:rPr>
-        <w:t>pa_cantos</w:t>
-      </w:r>
-      <w:proofErr w:type="spellEnd"/>
-      <w:r>
-        <w:rPr>
-          <w:lang w:val="en-US"/>
-        </w:rPr>
-        <w:t>'</w:t>
-      </w:r>
-    </w:p>
-    <w:p>
-      <w:pPr>
-        <w:rPr>
-          <w:lang w:val="en-US"/>
-        </w:rPr>
-      </w:pPr>
-      <w:r>
-        <w:rPr>
-          <w:lang w:val="en-US"/>
-        </w:rPr>
-        <w:t xml:space="preserve">                            </w:t>
-      </w:r>
-      <w:proofErr w:type="spellStart"/>
-      <w:r>
-        <w:rPr>
-          <w:lang w:val="en-US"/>
-        </w:rPr>
-        <w:t>elif</w:t>
-      </w:r>
-      <w:proofErr w:type="spellEnd"/>
-      <w:r>
-        <w:rPr>
-          <w:lang w:val="en-US"/>
-        </w:rPr>
-        <w:t xml:space="preserve"> 'Episódios' in categories:</w:t>
-      </w:r>
-    </w:p>
-    <w:p>
-      <w:pPr>
-        <w:rPr>
-          <w:lang w:val="en-US"/>
-        </w:rPr>
-      </w:pPr>
-      <w:r>
-        <w:rPr>
-          <w:lang w:val="en-US"/>
-        </w:rPr>
-        <w:t>                                 </w:t>
-      </w:r>
-      <w:proofErr w:type="spellStart"/>
-      <w:r>
-        <w:rPr>
-          <w:lang w:val="en-US"/>
-        </w:rPr>
-        <w:t>category_suffix</w:t>
-      </w:r>
-      <w:proofErr w:type="spellEnd"/>
-      <w:r>
-        <w:rPr>
-          <w:lang w:val="en-US"/>
-        </w:rPr>
-        <w:t xml:space="preserve"> </w:t>
-      </w:r>
-      <w:proofErr w:type="gramStart"/>
-      <w:r>
-        <w:rPr>
-          <w:lang w:val="en-US"/>
-        </w:rPr>
-        <w:t>= '_</w:t>
-      </w:r>
-      <w:proofErr w:type="spellStart"/>
-      <w:proofErr w:type="gramEnd"/>
-      <w:r>
-        <w:rPr>
-          <w:lang w:val="en-US"/>
-        </w:rPr>
-        <w:t>pa_episodios</w:t>
-      </w:r>
-      <w:proofErr w:type="spellEnd"/>
-      <w:r>
-        <w:rPr>
-          <w:lang w:val="en-US"/>
-        </w:rPr>
-        <w:t>'</w:t>
-      </w:r>
-    </w:p>
-    <w:p>
-      <w:pPr>
-        <w:rPr>
-          <w:lang w:val="en-US"/>
-        </w:rPr>
-      </w:pPr>
-      <w:r>
-        <w:rPr>
-          <w:lang w:val="en-US"/>
-        </w:rPr>
-        <w:t xml:space="preserve">                            </w:t>
-      </w:r>
-      <w:proofErr w:type="spellStart"/>
-      <w:r>
-        <w:rPr>
-          <w:lang w:val="en-US"/>
-        </w:rPr>
-        <w:t>slugs_text</w:t>
-      </w:r>
-      <w:proofErr w:type="spellEnd"/>
-      <w:r>
-        <w:rPr>
-          <w:lang w:val="en-US"/>
-        </w:rPr>
-        <w:t xml:space="preserve"> = "</w:t>
-      </w:r>
-      <w:proofErr w:type="gramStart"/>
-      <w:r>
-        <w:rPr>
-          <w:lang w:val="en-US"/>
-        </w:rPr>
-        <w:t>".join</w:t>
-      </w:r>
-      <w:proofErr w:type="gramEnd"/>
-      <w:r>
-        <w:rPr>
-          <w:lang w:val="en-US"/>
-        </w:rPr>
-        <w:t xml:space="preserve">(slugs) + </w:t>
-      </w:r>
-      <w:proofErr w:type="spellStart"/>
-      <w:r>
-        <w:rPr>
-          <w:lang w:val="en-US"/>
-        </w:rPr>
-        <w:t>category_suffix</w:t>
-      </w:r>
-      <w:proofErr w:type="spellEnd"/>
-    </w:p>
-    <w:p>
-      <w:pPr>
-        <w:rPr>
-          <w:lang w:val="en-US"/>
-        </w:rPr>
-      </w:pPr>
-      <w:r>
-        <w:rPr>
-          <w:lang w:val="en-US"/>
-        </w:rPr>
-        <w:t xml:space="preserve">                            </w:t>
-      </w:r>
-      <w:r>
-        <w:rPr>
-          <w:lang w:val="en-US"/>
-        </w:rPr>
-        <w:t>print(</w:t>
-      </w:r>
-      <w:proofErr w:type="spellStart"/>
-      <w:r>
-        <w:rPr>
-          <w:lang w:val="en-US"/>
-        </w:rPr>
-        <w:t>slugs_text</w:t>
-      </w:r>
-      <w:proofErr w:type="spellEnd"/>
-      <w:r>
-        <w:rPr>
-          <w:lang w:val="en-US"/>
-        </w:rPr>
+      <w:r>
+        <w:t>Acrescentei os atributos: “Cantos”</w:t>
+      </w:r>
+      <w:r>
+        <w:t xml:space="preserve"> (slug: cantos)</w:t>
+      </w:r>
+      <w:r>
+        <w:t xml:space="preserve"> e “Episódios”</w:t>
+      </w:r>
+      <w:r>
+        <w:t xml:space="preserve"> (slug: episodios)</w:t>
+      </w:r>
+    </w:p>
+    <w:p/>
+    <w:p>
+      <w:r>
+        <w:t>Dentro do atributo: Cantos, adicionei: “Canto I” (slug: canto-i</w:t>
+      </w:r>
+      <w:r>
+        <w:t>_pa_cantos</w:t>
+      </w:r>
+      <w:r>
+        <w:t>) e “Canto II” (slug:canto-ii</w:t>
+      </w:r>
+      <w:r>
+        <w:t>_pa_cantos</w:t>
+      </w:r>
+      <w:r>
         <w:t>)</w:t>
       </w:r>
     </w:p>
     <w:p>
-      <w:pPr>
-        <w:rPr>
-          <w:b/>
-          <w:bCs/>
-          <w:lang w:val="en-US"/>
-        </w:rPr>
-      </w:pPr>
-    </w:p>
-    <w:p>
-      <w:pPr>
-        <w:rPr>
-          <w:b/>
-          <w:bCs/>
-          <w:lang w:val="en-US"/>
-        </w:rPr>
-      </w:pPr>
-      <w:r>
-        <w:rPr>
-          <w:b/>
-          <w:bCs/>
-          <w:lang w:val="en-US"/>
-        </w:rPr>
-        <w:t>e a create_taxonomies.py</w:t>
-      </w:r>
-    </w:p>
-    <w:p>
-      <w:r>
-        <w:rPr>
-          <w:lang w:val="en-US"/>
-        </w:rPr>
-        <w:lastRenderedPageBreak/>
-        <w:t xml:space="preserve">            </w:t>
-      </w:r>
-      <w:proofErr w:type="spellStart"/>
-      <w:r>
-        <w:t>elif</w:t>
-      </w:r>
-      <w:proofErr w:type="spellEnd"/>
-      <w:r>
-        <w:t xml:space="preserve"> '_cantos' in </w:t>
-      </w:r>
-      <w:proofErr w:type="spellStart"/>
-      <w:r>
-        <w:t>categories</w:t>
-      </w:r>
-      <w:proofErr w:type="spellEnd"/>
-      <w:r>
-        <w:t>[i][2]:</w:t>
-      </w:r>
-    </w:p>
-    <w:p>
-      <w:r>
-        <w:t xml:space="preserve">                </w:t>
-      </w:r>
-      <w:proofErr w:type="spellStart"/>
-      <w:r>
-        <w:t>taxonomy</w:t>
-      </w:r>
-      <w:proofErr w:type="spellEnd"/>
-      <w:r>
-        <w:t xml:space="preserve"> = '</w:t>
-      </w:r>
-      <w:proofErr w:type="spellStart"/>
-      <w:r>
-        <w:t>pa_cantos</w:t>
-      </w:r>
-      <w:proofErr w:type="spellEnd"/>
-      <w:r>
-        <w:t>'</w:t>
-      </w:r>
-    </w:p>
-    <w:p>
-      <w:r>
-        <w:t xml:space="preserve">            </w:t>
-      </w:r>
-      <w:proofErr w:type="spellStart"/>
-      <w:r>
-        <w:t>elif</w:t>
-      </w:r>
-      <w:proofErr w:type="spellEnd"/>
-      <w:r>
-        <w:t xml:space="preserve"> '_episodios' in </w:t>
-      </w:r>
-      <w:proofErr w:type="spellStart"/>
-      <w:r>
-        <w:t>categories</w:t>
-      </w:r>
-      <w:proofErr w:type="spellEnd"/>
-      <w:r>
-        <w:t>[i][2]:</w:t>
-      </w:r>
-    </w:p>
-    <w:p>
-      <w:r>
-        <w:t xml:space="preserve">                </w:t>
-      </w:r>
-      <w:proofErr w:type="spellStart"/>
-      <w:r>
-        <w:t>taxonomy</w:t>
-      </w:r>
-      <w:proofErr w:type="spellEnd"/>
-      <w:r>
-        <w:t xml:space="preserve"> = '</w:t>
-      </w:r>
-      <w:proofErr w:type="spellStart"/>
-      <w:r>
-        <w:t>pa_episodios</w:t>
-      </w:r>
-      <w:proofErr w:type="spellEnd"/>
-      <w:r>
-        <w:t>'</w:t>
-      </w:r>
-    </w:p>
-    <w:p>
-      <w:pPr>
-        <w:rPr>
-          <w:b/>
-          <w:bCs/>
-        </w:rPr>
-      </w:pPr>
-    </w:p>
-    <w:p>
-      <w:pPr>
-        <w:rPr>
-          <w:b/>
-          <w:bCs/>
-        </w:rPr>
-      </w:pPr>
-    </w:p>
-    <w:p>
-      <w:pPr>
-        <w:rPr>
-          <w:b/>
-          <w:bCs/>
-        </w:rPr>
-      </w:pPr>
-      <w:r>
-        <w:rPr>
-          <w:b/>
-          <w:bCs/>
-        </w:rPr>
-        <w:t>Faltam os restantes atributos de imagens</w:t>
-      </w:r>
-    </w:p>
-    <w:p>
-      <w:pPr>
-        <w:rPr>
-          <w:b/>
-          <w:bCs/>
-        </w:rPr>
-      </w:pPr>
-    </w:p>
-    <w:p/>
-    <w:p>
-      <w:pPr>
-        <w:rPr>
-          <w:b/>
-          <w:bCs/>
-        </w:rPr>
-      </w:pPr>
-    </w:p>
-    <w:p>
-      <w:pPr>
-        <w:rPr>
-          <w:b/>
-          <w:bCs/>
-        </w:rPr>
-      </w:pPr>
-    </w:p>
-    <w:p>
-      <w:pPr>
-        <w:rPr>
-          <w:b/>
-          <w:bCs/>
-        </w:rPr>
-      </w:pPr>
-      <w:r>
-        <w:rPr>
-          <w:b/>
-          <w:bCs/>
-        </w:rPr>
-        <w:t>27/03/2026</w:t>
-      </w:r>
-    </w:p>
-    <w:p>
-      <w:pPr>
-        <w:rPr>
-          <w:b/>
-          <w:bCs/>
-          <w:color w:val="EE0000"/>
-        </w:rPr>
-      </w:pPr>
-      <w:r>
-        <w:rPr>
-          <w:b/>
-          <w:bCs/>
-          <w:color w:val="EE0000"/>
-        </w:rPr>
-        <w:t>Criar 1º a categoria “Imagens” e os atributos gerais (Cantos, Episódios, etc.)</w:t>
-      </w:r>
-    </w:p>
-    <w:p>
-      <w:pPr>
-        <w:rPr>
-          <w:b/>
-          <w:bCs/>
-        </w:rPr>
-      </w:pPr>
-    </w:p>
-    <w:p>
-      <w:r>
-        <w:t>Acrescentei a categoria: “Imagens”</w:t>
-      </w:r>
-      <w:r>
-        <w:t xml:space="preserve"> com o </w:t>
-      </w:r>
-      <w:proofErr w:type="spellStart"/>
-      <w:r>
-        <w:t>slug</w:t>
-      </w:r>
-      <w:proofErr w:type="spellEnd"/>
-      <w:r>
-        <w:t xml:space="preserve"> “</w:t>
-      </w:r>
-      <w:r>
-        <w:t>imagens</w:t>
-      </w:r>
-      <w:r>
-        <w:t>”</w:t>
-      </w:r>
-    </w:p>
-    <w:p>
-      <w:r>
-        <w:t>Acrescentei os atributos: “Cantos”</w:t>
-      </w:r>
-      <w:r>
-        <w:t xml:space="preserve"> (</w:t>
-      </w:r>
-      <w:proofErr w:type="spellStart"/>
-      <w:r>
-        <w:t>slug</w:t>
-      </w:r>
-      <w:proofErr w:type="spellEnd"/>
-      <w:r>
-        <w:t>: cantos)</w:t>
-      </w:r>
-      <w:r>
-        <w:t xml:space="preserve"> e “Episódios”</w:t>
-      </w:r>
-      <w:r>
-        <w:t xml:space="preserve"> (</w:t>
-      </w:r>
-      <w:proofErr w:type="spellStart"/>
-      <w:r>
-        <w:t>slug</w:t>
-      </w:r>
-      <w:proofErr w:type="spellEnd"/>
-      <w:r>
-        <w:t xml:space="preserve">: </w:t>
-      </w:r>
-      <w:proofErr w:type="spellStart"/>
-      <w:r>
-        <w:t>episodios</w:t>
-      </w:r>
-      <w:proofErr w:type="spellEnd"/>
-      <w:r>
-        <w:t>)</w:t>
-      </w:r>
-    </w:p>
-    <w:p/>
-    <w:p>
-      <w:r>
-        <w:lastRenderedPageBreak/>
-        <w:t>Dentro do atributo: Cantos, adicionei: “Canto I” (</w:t>
-      </w:r>
-      <w:proofErr w:type="spellStart"/>
-      <w:r>
-        <w:t>slug</w:t>
-      </w:r>
-      <w:proofErr w:type="spellEnd"/>
-      <w:r>
-        <w:t>: canto-</w:t>
-      </w:r>
-      <w:proofErr w:type="spellStart"/>
-      <w:r>
-        <w:t>i</w:t>
-      </w:r>
-      <w:r>
-        <w:t>_pa_cantos</w:t>
-      </w:r>
-      <w:proofErr w:type="spellEnd"/>
-      <w:r>
-        <w:t>) e “Canto II” (</w:t>
-      </w:r>
-      <w:proofErr w:type="spellStart"/>
-      <w:proofErr w:type="gramStart"/>
-      <w:r>
-        <w:t>slug:canto</w:t>
-      </w:r>
-      <w:proofErr w:type="gramEnd"/>
-      <w:r>
-        <w:t>-ii</w:t>
-      </w:r>
-      <w:r>
-        <w:t>_pa_cantos</w:t>
-      </w:r>
-      <w:proofErr w:type="spellEnd"/>
-      <w:r>
-        <w:t>)</w:t>
-      </w:r>
-    </w:p>
-    <w:p>
-      <w:r>
-        <w:t>Dentro de episódio, acrescentei os termos: Camões na gruta de Macau (</w:t>
-      </w:r>
-      <w:proofErr w:type="spellStart"/>
-      <w:r>
-        <w:t>slug</w:t>
-      </w:r>
-      <w:proofErr w:type="spellEnd"/>
-      <w:r>
-        <w:t xml:space="preserve">: </w:t>
-      </w:r>
-      <w:proofErr w:type="spellStart"/>
-      <w:r>
-        <w:t>camoes</w:t>
-      </w:r>
-      <w:proofErr w:type="spellEnd"/>
-      <w:r>
-        <w:t>-na-gruta-de-</w:t>
-      </w:r>
-      <w:proofErr w:type="spellStart"/>
-      <w:r>
-        <w:t>macau</w:t>
+      <w:r>
+        <w:t xml:space="preserve">Dentro de episódio, acrescentei os termos: Camões na gruta de Macau (slug: </w:t>
+      </w:r>
+      <w:r>
+        <w:t>camoes-na-gruta-de-macau</w:t>
       </w:r>
       <w:r>
         <w:t>_pa_episodios</w:t>
       </w:r>
-      <w:proofErr w:type="spellEnd"/>
       <w:r>
         <w:t xml:space="preserve">) e </w:t>
       </w:r>
       <w:r>
-        <w:t>Visita do Rei de Melinde a Gama (visita-do-rei-de-</w:t>
-      </w:r>
-      <w:proofErr w:type="spellStart"/>
-      <w:r>
-        <w:t>melinde</w:t>
-      </w:r>
-      <w:proofErr w:type="spellEnd"/>
-      <w:r>
-        <w:t>-a-</w:t>
-      </w:r>
-      <w:proofErr w:type="spellStart"/>
-      <w:r>
-        <w:t>gama</w:t>
+        <w:t>Visita do Rei de Melinde a Gama (visita-do-rei-de-melinde-a-gama</w:t>
       </w:r>
       <w:r>
         <w:t>_pa_episodios</w:t>
@@ -1322,7 +1317,6 @@
       <w:r>
         <w:t>f</w:t>
       </w:r>
-      <w:proofErr w:type="spellEnd"/>
       <w:r>
         <w:t>)</w:t>
       </w:r>
@@ -1346,94 +1340,7 @@
     </w:p>
     <w:p>
       <w:r>
-        <w:t>#mf_product_categories-1, #martfury_product_tag_cloud-4, #martfury_layered_nav-15, #martfury_layered_nav-16, #martfury_layered_nav-23 {box-</w:t>
-      </w:r>
-      <w:proofErr w:type="spellStart"/>
-      <w:r>
-        <w:t>shadow</w:t>
-      </w:r>
-      <w:proofErr w:type="spellEnd"/>
-      <w:r>
-        <w:t xml:space="preserve">: 0 4px 8px 0 </w:t>
-      </w:r>
-      <w:proofErr w:type="spellStart"/>
-      <w:proofErr w:type="gramStart"/>
-      <w:r>
-        <w:t>rgba</w:t>
-      </w:r>
-      <w:proofErr w:type="spellEnd"/>
-      <w:r>
-        <w:t>(</w:t>
-      </w:r>
-      <w:proofErr w:type="gramEnd"/>
-      <w:r>
-        <w:t xml:space="preserve">0, 0, 0, 0.1), 0 6px 20px 0 </w:t>
-      </w:r>
-      <w:proofErr w:type="spellStart"/>
-      <w:proofErr w:type="gramStart"/>
-      <w:r>
-        <w:t>rgba</w:t>
-      </w:r>
-      <w:proofErr w:type="spellEnd"/>
-      <w:r>
-        <w:t>(</w:t>
-      </w:r>
-      <w:proofErr w:type="gramEnd"/>
-      <w:r>
-        <w:t>0, 0, 0, 0.1</w:t>
-      </w:r>
-      <w:proofErr w:type="gramStart"/>
-      <w:r>
-        <w:t>);background</w:t>
-      </w:r>
-      <w:proofErr w:type="gramEnd"/>
-      <w:r>
-        <w:t>-</w:t>
-      </w:r>
-      <w:proofErr w:type="gramStart"/>
-      <w:r>
-        <w:t>color:#</w:t>
-      </w:r>
-      <w:proofErr w:type="spellStart"/>
-      <w:r>
-        <w:t>fff</w:t>
-      </w:r>
-      <w:proofErr w:type="spellEnd"/>
-      <w:r>
-        <w:t xml:space="preserve"> !</w:t>
-      </w:r>
-      <w:proofErr w:type="spellStart"/>
-      <w:r>
-        <w:t>important</w:t>
-      </w:r>
-      <w:proofErr w:type="spellEnd"/>
-      <w:proofErr w:type="gramEnd"/>
-      <w:r>
-        <w:t xml:space="preserve">;} /*border:10px </w:t>
-      </w:r>
-      <w:proofErr w:type="spellStart"/>
-      <w:r>
-        <w:t>solid</w:t>
-      </w:r>
-      <w:proofErr w:type="spellEnd"/>
-      <w:r>
-        <w:t xml:space="preserve"> #47595</w:t>
-      </w:r>
-      <w:proofErr w:type="gramStart"/>
-      <w:r>
-        <w:t>c;border</w:t>
-      </w:r>
-      <w:proofErr w:type="gramEnd"/>
-      <w:r>
-        <w:t>-radius:10</w:t>
-      </w:r>
-      <w:proofErr w:type="gramStart"/>
-      <w:r>
-        <w:t>px;  *</w:t>
-      </w:r>
-      <w:proofErr w:type="gramEnd"/>
-      <w:r>
-        <w:t>/</w:t>
+        <w:t>#mf_product_categories-1, #martfury_product_tag_cloud-4, #martfury_layered_nav-15, #martfury_layered_nav-16, #martfury_layered_nav-23 {box-shadow: 0 4px 8px 0 rgba(0, 0, 0, 0.1), 0 6px 20px 0 rgba(0, 0, 0, 0.1);background-color:#fff !important;} /*border:10px solid #47595c;border-radius:10px;  */</w:t>
       </w:r>
     </w:p>
     <w:p/>
@@ -1475,110 +1382,26 @@
           <w:bCs/>
           <w:color w:val="EE0000"/>
         </w:rPr>
-        <w:t xml:space="preserve">Foi necessário recriar o kit do </w:t>
-      </w:r>
-      <w:proofErr w:type="spellStart"/>
-      <w:r>
-        <w:rPr>
-          <w:b/>
-          <w:bCs/>
-          <w:color w:val="EE0000"/>
-        </w:rPr>
-        <w:t>Elementor</w:t>
-      </w:r>
-      <w:proofErr w:type="spellEnd"/>
-      <w:r>
-        <w:rPr>
-          <w:b/>
-          <w:bCs/>
-          <w:color w:val="EE0000"/>
-        </w:rPr>
-        <w:t xml:space="preserve">, a partir de </w:t>
-      </w:r>
-      <w:proofErr w:type="spellStart"/>
-      <w:r>
-        <w:rPr>
-          <w:b/>
-          <w:bCs/>
-          <w:color w:val="EE0000"/>
-        </w:rPr>
-        <w:t>Elementor</w:t>
-      </w:r>
-      <w:proofErr w:type="spellEnd"/>
-      <w:r>
-        <w:rPr>
-          <w:b/>
-          <w:bCs/>
-          <w:color w:val="EE0000"/>
-        </w:rPr>
-        <w:t xml:space="preserve"> &gt; Ferramentas &gt; </w:t>
-      </w:r>
-      <w:proofErr w:type="spellStart"/>
-      <w:r>
-        <w:rPr>
-          <w:b/>
-          <w:bCs/>
-          <w:color w:val="EE0000"/>
-        </w:rPr>
-        <w:t>Recreate</w:t>
-      </w:r>
-      <w:proofErr w:type="spellEnd"/>
-      <w:r>
-        <w:rPr>
-          <w:b/>
-          <w:bCs/>
-          <w:color w:val="EE0000"/>
-        </w:rPr>
-        <w:t xml:space="preserve"> Kit</w:t>
-      </w:r>
-    </w:p>
-    <w:p>
-      <w:pPr>
-        <w:rPr>
-          <w:b/>
-          <w:bCs/>
-        </w:rPr>
-      </w:pPr>
-    </w:p>
-    <w:p>
-      <w:r>
-        <w:lastRenderedPageBreak/>
+        <w:t>Foi necessário recriar o kit do Elementor, a partir de Elementor &gt; Ferramentas &gt; Recreate Kit</w:t>
+      </w:r>
+    </w:p>
+    <w:p>
+      <w:pPr>
+        <w:rPr>
+          <w:b/>
+          <w:bCs/>
+        </w:rPr>
+      </w:pPr>
+    </w:p>
+    <w:p>
+      <w:r>
         <w:t xml:space="preserve">É possível </w:t>
       </w:r>
       <w:r>
-        <w:t xml:space="preserve">criar páginas com os produtos de terminados atributos com o </w:t>
-      </w:r>
-      <w:proofErr w:type="spellStart"/>
-      <w:r>
-        <w:t>shortcode</w:t>
-      </w:r>
-      <w:proofErr w:type="spellEnd"/>
-      <w:r>
-        <w:t>: “[</w:t>
-      </w:r>
-      <w:proofErr w:type="spellStart"/>
-      <w:r>
-        <w:t>products</w:t>
-      </w:r>
-      <w:proofErr w:type="spellEnd"/>
-      <w:r>
-        <w:t xml:space="preserve"> </w:t>
-      </w:r>
-      <w:proofErr w:type="spellStart"/>
-      <w:r>
-        <w:t>attribute</w:t>
-      </w:r>
-      <w:proofErr w:type="spellEnd"/>
-      <w:r>
-        <w:t>="</w:t>
-      </w:r>
-      <w:proofErr w:type="spellStart"/>
-      <w:r>
-        <w:t>pa_lingua</w:t>
-      </w:r>
-      <w:proofErr w:type="spellEnd"/>
-      <w:r>
-        <w:t>"]</w:t>
+        <w:t>criar páginas com os produtos de terminados atributos com o shortcode: “[</w:t>
+      </w:r>
+      <w:r>
+        <w:t>products attribute="pa_lingua"]</w:t>
       </w:r>
       <w:r>
         <w:t>”</w:t>
@@ -1588,11 +1411,9 @@
       <w:r>
         <w:t xml:space="preserve">E filtrar os atributos que se pretende visualizar utilizando o </w:t>
       </w:r>
-      <w:proofErr w:type="spellStart"/>
       <w:r>
         <w:t>WPCode</w:t>
       </w:r>
-      <w:proofErr w:type="spellEnd"/>
     </w:p>
     <w:p/>
     <w:p>
@@ -1612,208 +1433,141 @@
     </w:p>
     <w:p>
       <w:r>
-        <w:t xml:space="preserve">Alterei o </w:t>
-      </w:r>
-      <w:proofErr w:type="spellStart"/>
-      <w:r>
-        <w:t>guid</w:t>
-      </w:r>
-      <w:proofErr w:type="spellEnd"/>
-      <w:r>
-        <w:t xml:space="preserve"> de um </w:t>
-      </w:r>
-      <w:proofErr w:type="spellStart"/>
-      <w:r>
+        <w:t xml:space="preserve">Alterei o guid de um post de uma imagem e corri o comando wp que regenera as imagens, para ver se é </w:t>
+      </w:r>
+      <w:r>
+        <w:t xml:space="preserve">assim que se pode </w:t>
+      </w:r>
+      <w:r>
+        <w:t>defin</w:t>
+      </w:r>
+      <w:r>
+        <w:t>ir as “capas” das imagens</w:t>
+      </w:r>
+    </w:p>
+    <w:p/>
+    <w:p>
+      <w:pPr>
+        <w:rPr>
+          <w:lang w:val="en-US"/>
+        </w:rPr>
+      </w:pPr>
+      <w:r>
+        <w:rPr>
+          <w:lang w:val="en-US"/>
+        </w:rPr>
+        <w:t>post_title = 367428</w:t>
+      </w:r>
+    </w:p>
+    <w:p>
+      <w:pPr>
+        <w:rPr>
+          <w:lang w:val="en-US"/>
+        </w:rPr>
+      </w:pPr>
+      <w:r>
+        <w:rPr>
+          <w:lang w:val="en-US"/>
+        </w:rPr>
+        <w:t>post_name = 367428</w:t>
+      </w:r>
+    </w:p>
+    <w:p>
+      <w:pPr>
+        <w:rPr>
+          <w:lang w:val="en-US"/>
+        </w:rPr>
+      </w:pPr>
+    </w:p>
+    <w:p>
+      <w:pPr>
+        <w:rPr>
+          <w:lang w:val="en-US"/>
+        </w:rPr>
+      </w:pPr>
+      <w:r>
+        <w:rPr>
+          <w:lang w:val="en-US"/>
+        </w:rPr>
+        <w:t>ID = 8181</w:t>
+      </w:r>
+    </w:p>
+    <w:p>
+      <w:pPr>
+        <w:rPr>
+          <w:lang w:val="fr-FR"/>
+        </w:rPr>
+      </w:pPr>
+      <w:r>
+        <w:rPr>
+          <w:lang w:val="fr-FR"/>
+        </w:rPr>
+        <w:t>post_parent = 6932</w:t>
+      </w:r>
+    </w:p>
+    <w:p>
+      <w:pPr>
+        <w:rPr>
+          <w:lang w:val="fr-FR"/>
+        </w:rPr>
+      </w:pPr>
+    </w:p>
+    <w:p>
+      <w:pPr>
+        <w:rPr>
+          <w:lang w:val="fr-FR"/>
+        </w:rPr>
+      </w:pPr>
+      <w:r>
+        <w:rPr>
+          <w:lang w:val="fr-FR"/>
+        </w:rPr>
+        <w:t>guid = https://camonianadigital.bnportugal.gov.pt/wp-content/uploads/2025/capas/367428.jpg</w:t>
+      </w:r>
+      <w:r>
+        <w:rPr>
+          <w:lang w:val="fr-FR"/>
+        </w:rPr>
+        <w:t>g</w:t>
+      </w:r>
+    </w:p>
+    <w:p>
+      <w:pPr>
+        <w:rPr>
+          <w:b/>
+          <w:bCs/>
+          <w:lang w:val="fr-FR"/>
+        </w:rPr>
+      </w:pPr>
+    </w:p>
+    <w:p>
+      <w:pPr>
+        <w:rPr>
+          <w:b/>
+          <w:bCs/>
+        </w:rPr>
+      </w:pPr>
+      <w:r>
+        <w:rPr>
+          <w:b/>
+          <w:bCs/>
+        </w:rPr>
+        <w:t xml:space="preserve">Falta alterar no </w:t>
+      </w:r>
+      <w:r>
+        <w:rPr>
+          <w:b/>
+          <w:bCs/>
+        </w:rPr>
+        <w:t>wp_</w:t>
+      </w:r>
+      <w:r>
+        <w:rPr>
+          <w:b/>
+          <w:bCs/>
+        </w:rPr>
         <w:t>post</w:t>
       </w:r>
-      <w:proofErr w:type="spellEnd"/>
-      <w:r>
-        <w:t xml:space="preserve"> de uma imagem e corri o comando </w:t>
-      </w:r>
-      <w:proofErr w:type="spellStart"/>
-      <w:r>
-        <w:t>wp</w:t>
-      </w:r>
-      <w:proofErr w:type="spellEnd"/>
-      <w:r>
-        <w:t xml:space="preserve"> que regenera as imagens, para ver se é </w:t>
-      </w:r>
-      <w:r>
-        <w:t xml:space="preserve">assim que se pode </w:t>
-      </w:r>
-      <w:r>
-        <w:t>defin</w:t>
-      </w:r>
-      <w:r>
-        <w:t>ir as “capas” das imagens</w:t>
-      </w:r>
-    </w:p>
-    <w:p/>
-    <w:p>
-      <w:pPr>
-        <w:rPr>
-          <w:lang w:val="en-US"/>
-        </w:rPr>
-      </w:pPr>
-      <w:proofErr w:type="spellStart"/>
-      <w:r>
-        <w:rPr>
-          <w:lang w:val="en-US"/>
-        </w:rPr>
-        <w:t>post_title</w:t>
-      </w:r>
-      <w:proofErr w:type="spellEnd"/>
-      <w:r>
-        <w:rPr>
-          <w:lang w:val="en-US"/>
-        </w:rPr>
-        <w:t xml:space="preserve"> = 367428</w:t>
-      </w:r>
-    </w:p>
-    <w:p>
-      <w:pPr>
-        <w:rPr>
-          <w:lang w:val="en-US"/>
-        </w:rPr>
-      </w:pPr>
-      <w:proofErr w:type="spellStart"/>
-      <w:r>
-        <w:rPr>
-          <w:lang w:val="en-US"/>
-        </w:rPr>
-        <w:t>post_name</w:t>
-      </w:r>
-      <w:proofErr w:type="spellEnd"/>
-      <w:r>
-        <w:rPr>
-          <w:lang w:val="en-US"/>
-        </w:rPr>
-        <w:t xml:space="preserve"> = 367428</w:t>
-      </w:r>
-    </w:p>
-    <w:p>
-      <w:pPr>
-        <w:rPr>
-          <w:lang w:val="en-US"/>
-        </w:rPr>
-      </w:pPr>
-    </w:p>
-    <w:p>
-      <w:pPr>
-        <w:rPr>
-          <w:lang w:val="en-US"/>
-        </w:rPr>
-      </w:pPr>
-      <w:r>
-        <w:rPr>
-          <w:lang w:val="en-US"/>
-        </w:rPr>
-        <w:t>ID = 8181</w:t>
-      </w:r>
-    </w:p>
-    <w:p>
-      <w:pPr>
-        <w:rPr>
-          <w:lang w:val="fr-FR"/>
-        </w:rPr>
-      </w:pPr>
-      <w:proofErr w:type="spellStart"/>
-      <w:proofErr w:type="gramStart"/>
-      <w:r>
-        <w:rPr>
-          <w:lang w:val="fr-FR"/>
-        </w:rPr>
-        <w:t>post</w:t>
-      </w:r>
-      <w:proofErr w:type="gramEnd"/>
-      <w:r>
-        <w:rPr>
-          <w:lang w:val="fr-FR"/>
-        </w:rPr>
-        <w:t>_parent</w:t>
-      </w:r>
-      <w:proofErr w:type="spellEnd"/>
-      <w:r>
-        <w:rPr>
-          <w:lang w:val="fr-FR"/>
-        </w:rPr>
-        <w:t xml:space="preserve"> = 6932</w:t>
-      </w:r>
-    </w:p>
-    <w:p>
-      <w:pPr>
-        <w:rPr>
-          <w:lang w:val="fr-FR"/>
-        </w:rPr>
-      </w:pPr>
-    </w:p>
-    <w:p>
-      <w:pPr>
-        <w:rPr>
-          <w:lang w:val="fr-FR"/>
-        </w:rPr>
-      </w:pPr>
-      <w:proofErr w:type="spellStart"/>
-      <w:proofErr w:type="gramStart"/>
-      <w:r>
-        <w:rPr>
-          <w:lang w:val="fr-FR"/>
-        </w:rPr>
-        <w:t>guid</w:t>
-      </w:r>
-      <w:proofErr w:type="spellEnd"/>
-      <w:proofErr w:type="gramEnd"/>
-      <w:r>
-        <w:rPr>
-          <w:lang w:val="fr-FR"/>
-        </w:rPr>
-        <w:t xml:space="preserve"> = https://camonianadigital.bnportugal.gov.pt/wp-content/uploads/2025/capas/367428.jpg</w:t>
-      </w:r>
-      <w:r>
-        <w:rPr>
-          <w:lang w:val="fr-FR"/>
-        </w:rPr>
-        <w:t>g</w:t>
-      </w:r>
-    </w:p>
-    <w:p>
-      <w:pPr>
-        <w:rPr>
-          <w:b/>
-          <w:bCs/>
-          <w:lang w:val="fr-FR"/>
-        </w:rPr>
-      </w:pPr>
-    </w:p>
-    <w:p>
-      <w:pPr>
-        <w:rPr>
-          <w:b/>
-          <w:bCs/>
-        </w:rPr>
-      </w:pPr>
-      <w:r>
-        <w:rPr>
-          <w:b/>
-          <w:bCs/>
-        </w:rPr>
-        <w:t xml:space="preserve">Falta alterar no </w:t>
-      </w:r>
-      <w:proofErr w:type="spellStart"/>
-      <w:r>
-        <w:rPr>
-          <w:b/>
-          <w:bCs/>
-        </w:rPr>
-        <w:t>wp_</w:t>
-      </w:r>
-      <w:r>
-        <w:rPr>
-          <w:b/>
-          <w:bCs/>
-        </w:rPr>
-        <w:t>post</w:t>
-      </w:r>
       <w:r>
         <w:rPr>
           <w:b/>
@@ -1821,7 +1575,6 @@
         </w:rPr>
         <w:t>meta</w:t>
       </w:r>
-      <w:proofErr w:type="spellEnd"/>
     </w:p>
     <w:tbl>
       <w:tblPr>
@@ -1908,17 +1661,8 @@
                 <w:b/>
                 <w:bCs/>
               </w:rPr>
-              <w:t>_</w:t>
+              <w:t>_wp_attached_file</w:t>
             </w:r>
-            <w:proofErr w:type="spellStart"/>
-            <w:r>
-              <w:rPr>
-                <w:b/>
-                <w:bCs/>
-              </w:rPr>
-              <w:t>wp_attached_file</w:t>
-            </w:r>
-            <w:proofErr w:type="spellEnd"/>
           </w:p>
         </w:tc>
         <w:tc>
@@ -2014,261 +1758,51 @@
         <w:rPr>
           <w:lang w:val="en-US"/>
         </w:rPr>
-        <w:t xml:space="preserve">            </w:t>
-      </w:r>
-      <w:proofErr w:type="spellStart"/>
-      <w:r>
-        <w:rPr>
-          <w:lang w:val="en-US"/>
-        </w:rPr>
-        <w:t>elif</w:t>
-      </w:r>
-      <w:proofErr w:type="spellEnd"/>
-      <w:r>
-        <w:rPr>
-          <w:lang w:val="en-US"/>
-        </w:rPr>
-        <w:t xml:space="preserve"> collection == 'imagens':</w:t>
-      </w:r>
-    </w:p>
-    <w:p>
-      <w:pPr>
-        <w:rPr>
-          <w:lang w:val="en-US"/>
-        </w:rPr>
-      </w:pPr>
+        <w:t>            elif collection == 'imagens':</w:t>
+      </w:r>
+    </w:p>
+    <w:p>
+      <w:pPr>
+        <w:rPr>
+          <w:lang w:val="en-US"/>
+        </w:rPr>
+      </w:pPr>
+      <w:r>
+        <w:rPr>
+          <w:lang w:val="en-US"/>
+        </w:rPr>
+        <w:t>                db.insert_post_metadata(post_id, "_wp_attached_file", f"{path_to_folder}{ncb}/{volume}/{imagem}.jpg")</w:t>
+      </w:r>
+    </w:p>
+    <w:p>
+      <w:pPr>
+        <w:rPr>
+          <w:lang w:val="en-US"/>
+        </w:rPr>
+      </w:pPr>
+      <w:r>
+        <w:rPr>
+          <w:lang w:val="en-US"/>
+        </w:rPr>
+        <w:lastRenderedPageBreak/>
+        <w:t xml:space="preserve"> </w:t>
+      </w:r>
+      <w:r>
+        <w:rPr>
+          <w:lang w:val="en-US"/>
+        </w:rPr>
+        <w:t xml:space="preserve">               db.insert_post_metadata(post_id, "_wp_attachment_metadata", metadata)</w:t>
+      </w:r>
+    </w:p>
+    <w:p>
       <w:r>
         <w:rPr>
           <w:lang w:val="en-US"/>
         </w:rPr>
         <w:t xml:space="preserve">                </w:t>
       </w:r>
-      <w:proofErr w:type="spellStart"/>
-      <w:proofErr w:type="gramStart"/>
-      <w:r>
-        <w:rPr>
-          <w:lang w:val="en-US"/>
-        </w:rPr>
-        <w:t>db.insert</w:t>
-      </w:r>
-      <w:proofErr w:type="gramEnd"/>
-      <w:r>
-        <w:rPr>
-          <w:lang w:val="en-US"/>
-        </w:rPr>
-        <w:t>_post_</w:t>
-      </w:r>
-      <w:proofErr w:type="gramStart"/>
-      <w:r>
-        <w:rPr>
-          <w:lang w:val="en-US"/>
-        </w:rPr>
-        <w:t>metadata</w:t>
-      </w:r>
-      <w:proofErr w:type="spellEnd"/>
-      <w:r>
-        <w:rPr>
-          <w:lang w:val="en-US"/>
-        </w:rPr>
-        <w:t>(</w:t>
-      </w:r>
-      <w:proofErr w:type="spellStart"/>
-      <w:proofErr w:type="gramEnd"/>
-      <w:r>
-        <w:rPr>
-          <w:lang w:val="en-US"/>
-        </w:rPr>
-        <w:t>post_id</w:t>
-      </w:r>
-      <w:proofErr w:type="spellEnd"/>
-      <w:r>
-        <w:rPr>
-          <w:lang w:val="en-US"/>
-        </w:rPr>
-        <w:t>, "_</w:t>
-      </w:r>
-      <w:proofErr w:type="spellStart"/>
-      <w:r>
-        <w:rPr>
-          <w:lang w:val="en-US"/>
-        </w:rPr>
-        <w:t>wp_attached_file</w:t>
-      </w:r>
-      <w:proofErr w:type="spellEnd"/>
-      <w:r>
-        <w:rPr>
-          <w:lang w:val="en-US"/>
-        </w:rPr>
-        <w:t>", f"{</w:t>
-      </w:r>
-      <w:proofErr w:type="spellStart"/>
-      <w:r>
-        <w:rPr>
-          <w:lang w:val="en-US"/>
-        </w:rPr>
-        <w:t>path_to_</w:t>
-      </w:r>
-      <w:proofErr w:type="gramStart"/>
-      <w:r>
-        <w:rPr>
-          <w:lang w:val="en-US"/>
-        </w:rPr>
-        <w:t>folder</w:t>
-      </w:r>
-      <w:proofErr w:type="spellEnd"/>
-      <w:r>
-        <w:rPr>
-          <w:lang w:val="en-US"/>
-        </w:rPr>
-        <w:t>}{</w:t>
-      </w:r>
-      <w:proofErr w:type="spellStart"/>
-      <w:proofErr w:type="gramEnd"/>
-      <w:r>
-        <w:rPr>
-          <w:lang w:val="en-US"/>
-        </w:rPr>
-        <w:t>ncb</w:t>
-      </w:r>
-      <w:proofErr w:type="spellEnd"/>
-      <w:r>
-        <w:rPr>
-          <w:lang w:val="en-US"/>
-        </w:rPr>
-        <w:t>}/{volume}/{</w:t>
-      </w:r>
-      <w:proofErr w:type="spellStart"/>
-      <w:r>
-        <w:rPr>
-          <w:lang w:val="en-US"/>
-        </w:rPr>
-        <w:t>imagem</w:t>
-      </w:r>
-      <w:proofErr w:type="spellEnd"/>
-      <w:r>
-        <w:rPr>
-          <w:lang w:val="en-US"/>
-        </w:rPr>
-        <w:t>}.jpg")</w:t>
-      </w:r>
-    </w:p>
-    <w:p>
-      <w:pPr>
-        <w:rPr>
-          <w:lang w:val="en-US"/>
-        </w:rPr>
-      </w:pPr>
-      <w:r>
-        <w:rPr>
-          <w:lang w:val="en-US"/>
-        </w:rPr>
-        <w:t xml:space="preserve"> </w:t>
-      </w:r>
-      <w:r>
-        <w:rPr>
-          <w:lang w:val="en-US"/>
-        </w:rPr>
-        <w:t xml:space="preserve">               </w:t>
-      </w:r>
-      <w:proofErr w:type="spellStart"/>
-      <w:proofErr w:type="gramStart"/>
-      <w:r>
-        <w:rPr>
-          <w:lang w:val="en-US"/>
-        </w:rPr>
-        <w:t>db.insert</w:t>
-      </w:r>
-      <w:proofErr w:type="gramEnd"/>
-      <w:r>
-        <w:rPr>
-          <w:lang w:val="en-US"/>
-        </w:rPr>
-        <w:t>_post_</w:t>
-      </w:r>
-      <w:proofErr w:type="gramStart"/>
-      <w:r>
-        <w:rPr>
-          <w:lang w:val="en-US"/>
-        </w:rPr>
-        <w:t>metadata</w:t>
-      </w:r>
-      <w:proofErr w:type="spellEnd"/>
-      <w:r>
-        <w:rPr>
-          <w:lang w:val="en-US"/>
-        </w:rPr>
-        <w:t>(</w:t>
-      </w:r>
-      <w:proofErr w:type="spellStart"/>
-      <w:proofErr w:type="gramEnd"/>
-      <w:r>
-        <w:rPr>
-          <w:lang w:val="en-US"/>
-        </w:rPr>
-        <w:t>post_id</w:t>
-      </w:r>
-      <w:proofErr w:type="spellEnd"/>
-      <w:r>
-        <w:rPr>
-          <w:lang w:val="en-US"/>
-        </w:rPr>
-        <w:t>, "_</w:t>
-      </w:r>
-      <w:proofErr w:type="spellStart"/>
-      <w:r>
-        <w:rPr>
-          <w:lang w:val="en-US"/>
-        </w:rPr>
-        <w:t>wp_attachment_metadata</w:t>
-      </w:r>
-      <w:proofErr w:type="spellEnd"/>
-      <w:r>
-        <w:rPr>
-          <w:lang w:val="en-US"/>
-        </w:rPr>
-        <w:t>", metadata)</w:t>
-      </w:r>
-    </w:p>
-    <w:p>
-      <w:r>
-        <w:rPr>
-          <w:lang w:val="en-US"/>
-        </w:rPr>
-        <w:t xml:space="preserve">                </w:t>
-      </w:r>
-      <w:proofErr w:type="spellStart"/>
-      <w:proofErr w:type="gramStart"/>
-      <w:r>
-        <w:t>db.insert</w:t>
-      </w:r>
-      <w:proofErr w:type="gramEnd"/>
-      <w:r>
-        <w:t>_post_</w:t>
-      </w:r>
-      <w:proofErr w:type="gramStart"/>
-      <w:r>
-        <w:t>metadata</w:t>
-      </w:r>
-      <w:proofErr w:type="spellEnd"/>
-      <w:r>
-        <w:t>(</w:t>
-      </w:r>
-      <w:proofErr w:type="spellStart"/>
-      <w:proofErr w:type="gramEnd"/>
-      <w:r>
-        <w:t>post_id</w:t>
-      </w:r>
-      <w:proofErr w:type="spellEnd"/>
-      <w:r>
-        <w:t>, "_</w:t>
-      </w:r>
-      <w:proofErr w:type="spellStart"/>
-      <w:r>
-        <w:t>wp_attachment_image_alt</w:t>
-      </w:r>
-      <w:proofErr w:type="spellEnd"/>
-      <w:r>
-        <w:t>", "página")</w:t>
+      <w:r>
+        <w:t>db.insert_post_metadata(post_id, "_wp_attachment_image_alt", "página")</w:t>
       </w:r>
     </w:p>
     <w:p/>
@@ -2383,7 +1917,7 @@
           <w:bCs/>
         </w:rPr>
       </w:pPr>
-      <w:hyperlink r:id="rId5" w:history="1">
+      <w:hyperlink r:id="rId6" w:history="1">
         <w:r>
           <w:rPr>
             <w:rStyle w:val="Hiperligao"/>
@@ -2409,37 +1943,8 @@
       <w:r>
         <w:t>: “</w:t>
       </w:r>
-      <w:proofErr w:type="spellStart"/>
-      <w:r>
-        <w:t>pattern</w:t>
-      </w:r>
-      <w:proofErr w:type="spellEnd"/>
-      <w:r>
-        <w:t xml:space="preserve"> = r"[</w:t>
-      </w:r>
-      <w:proofErr w:type="gramStart"/>
-      <w:r>
-        <w:t>\x98\x9C\x88\x89«</w:t>
-      </w:r>
-      <w:proofErr w:type="gramEnd"/>
-      <w:r>
-        <w:t>»&lt;</w:t>
-      </w:r>
-      <w:proofErr w:type="gramStart"/>
-      <w:r>
-        <w:t>&gt;?[\]\x80-\x9F\xa0</w:t>
-      </w:r>
-      <w:proofErr w:type="gramEnd"/>
-      <w:r>
-        <w:t>()</w:t>
-      </w:r>
-      <w:proofErr w:type="gramStart"/>
-      <w:r>
-        <w:t>']+</w:t>
-      </w:r>
-      <w:proofErr w:type="gramEnd"/>
-      <w:r>
-        <w:t>"</w:t>
+      <w:r>
+        <w:t>pattern = r"[\x98\x9C\x88\x89«»&lt;&gt;?[\]\x80-\x9F\xa0()']+"</w:t>
       </w:r>
     </w:p>
     <w:p>
@@ -2451,7 +1956,7 @@
       <w:r>
         <w:t xml:space="preserve">Exemplo: </w:t>
       </w:r>
-      <w:hyperlink r:id="rId6" w:history="1">
+      <w:hyperlink r:id="rId7" w:history="1">
         <w:r>
           <w:rPr>
             <w:rStyle w:val="Hiperligao"/>
@@ -2464,7 +1969,7 @@
       </w:r>
     </w:p>
     <w:p>
-      <w:hyperlink r:id="rId7" w:history="1">
+      <w:hyperlink r:id="rId8" w:history="1">
         <w:r>
           <w:rPr>
             <w:rStyle w:val="Hiperligao"/>
@@ -2477,7 +1982,7 @@
       </w:r>
     </w:p>
     <w:p>
-      <w:hyperlink r:id="rId8" w:history="1">
+      <w:hyperlink r:id="rId9" w:history="1">
         <w:r>
           <w:rPr>
             <w:rStyle w:val="Hiperligao"/>
@@ -2490,7 +1995,7 @@
       </w:r>
     </w:p>
     <w:p>
-      <w:hyperlink r:id="rId9" w:history="1">
+      <w:hyperlink r:id="rId10" w:history="1">
         <w:r>
           <w:rPr>
             <w:rStyle w:val="Hiperligao"/>
@@ -2508,7 +2013,7 @@
       </w:r>
     </w:p>
     <w:p>
-      <w:hyperlink r:id="rId10" w:history="1">
+      <w:hyperlink r:id="rId11" w:history="1">
         <w:r>
           <w:rPr>
             <w:rStyle w:val="Hiperligao"/>
@@ -2521,7 +2026,7 @@
       </w:r>
     </w:p>
     <w:p>
-      <w:hyperlink r:id="rId11" w:history="1">
+      <w:hyperlink r:id="rId12" w:history="1">
         <w:r>
           <w:rPr>
             <w:rStyle w:val="Hiperligao"/>
@@ -2531,7 +2036,7 @@
       </w:hyperlink>
     </w:p>
     <w:p>
-      <w:hyperlink r:id="rId12" w:history="1">
+      <w:hyperlink r:id="rId13" w:history="1">
         <w:r>
           <w:rPr>
             <w:rStyle w:val="Hiperligao"/>
@@ -2541,7 +2046,7 @@
       </w:hyperlink>
     </w:p>
     <w:p>
-      <w:hyperlink r:id="rId13" w:history="1">
+      <w:hyperlink r:id="rId14" w:history="1">
         <w:r>
           <w:rPr>
             <w:rStyle w:val="Hiperligao"/>
@@ -2554,7 +2059,7 @@
       </w:r>
     </w:p>
     <w:p>
-      <w:hyperlink r:id="rId14" w:history="1">
+      <w:hyperlink r:id="rId15" w:history="1">
         <w:r>
           <w:rPr>
             <w:rStyle w:val="Hiperligao"/>
@@ -2564,7 +2069,7 @@
       </w:hyperlink>
     </w:p>
     <w:p>
-      <w:hyperlink r:id="rId15" w:history="1">
+      <w:hyperlink r:id="rId16" w:history="1">
         <w:r>
           <w:rPr>
             <w:rStyle w:val="Hiperligao"/>
@@ -2574,7 +2079,7 @@
       </w:hyperlink>
     </w:p>
     <w:p>
-      <w:hyperlink r:id="rId16" w:history="1">
+      <w:hyperlink r:id="rId17" w:history="1">
         <w:r>
           <w:rPr>
             <w:rStyle w:val="Hiperligao"/>
@@ -2585,7 +2090,7 @@
     </w:p>
     <w:p/>
     <w:p>
-      <w:hyperlink r:id="rId17" w:history="1">
+      <w:hyperlink r:id="rId18" w:history="1">
         <w:r>
           <w:rPr>
             <w:rStyle w:val="Hiperligao"/>
@@ -2595,7 +2100,7 @@
       </w:hyperlink>
     </w:p>
     <w:p>
-      <w:hyperlink r:id="rId18" w:history="1">
+      <w:hyperlink r:id="rId19" w:history="1">
         <w:r>
           <w:rPr>
             <w:rStyle w:val="Hiperligao"/>
@@ -2605,7 +2110,7 @@
       </w:hyperlink>
     </w:p>
     <w:p>
-      <w:hyperlink r:id="rId19" w:history="1">
+      <w:hyperlink r:id="rId20" w:history="1">
         <w:r>
           <w:rPr>
             <w:rStyle w:val="Hiperligao"/>
@@ -2615,7 +2120,7 @@
       </w:hyperlink>
     </w:p>
     <w:p>
-      <w:hyperlink r:id="rId20" w:history="1">
+      <w:hyperlink r:id="rId21" w:history="1">
         <w:r>
           <w:rPr>
             <w:rStyle w:val="Hiperligao"/>
@@ -2625,7 +2130,7 @@
       </w:hyperlink>
     </w:p>
     <w:p>
-      <w:hyperlink r:id="rId21" w:history="1">
+      <w:hyperlink r:id="rId22" w:history="1">
         <w:r>
           <w:rPr>
             <w:rStyle w:val="Hiperligao"/>
@@ -2641,7 +2146,7 @@
       </w:r>
     </w:p>
     <w:p>
-      <w:hyperlink r:id="rId22" w:history="1">
+      <w:hyperlink r:id="rId23" w:history="1">
         <w:r>
           <w:rPr>
             <w:rStyle w:val="Hiperligao"/>
@@ -2654,7 +2159,7 @@
       </w:r>
     </w:p>
     <w:p>
-      <w:hyperlink r:id="rId23" w:history="1">
+      <w:hyperlink r:id="rId24" w:history="1">
         <w:r>
           <w:rPr>
             <w:rStyle w:val="Hiperligao"/>
@@ -2678,23 +2183,7 @@
           <w:b/>
           <w:bCs/>
         </w:rPr>
-        <w:t xml:space="preserve">Problema codificação ficheiros </w:t>
-      </w:r>
-      <w:proofErr w:type="gramStart"/>
-      <w:r>
-        <w:rPr>
-          <w:b/>
-          <w:bCs/>
-        </w:rPr>
-        <w:t>catalogo</w:t>
-      </w:r>
-      <w:proofErr w:type="gramEnd"/>
-      <w:r>
-        <w:rPr>
-          <w:b/>
-          <w:bCs/>
-        </w:rPr>
-        <w:t xml:space="preserve"> e imagens</w:t>
+        <w:t>Problema codificação ficheiros catalogo e imagens</w:t>
       </w:r>
     </w:p>
     <w:p>
@@ -2719,13 +2208,8 @@
         <w:t>categorias associadas. É necessário remov</w:t>
       </w:r>
       <w:r>
-        <w:t xml:space="preserve">er esses registos, bem como os que não têm </w:t>
-      </w:r>
-      <w:proofErr w:type="spellStart"/>
-      <w:r>
-        <w:t>purl</w:t>
-      </w:r>
-      <w:proofErr w:type="spellEnd"/>
+        <w:t>er esses registos, bem como os que não têm purl</w:t>
+      </w:r>
     </w:p>
     <w:p/>
     <w:p>
@@ -2758,23 +2242,14 @@
     </w:p>
     <w:p>
       <w:r>
-        <w:t xml:space="preserve">Extrair dados atualizados do </w:t>
-      </w:r>
-      <w:proofErr w:type="spellStart"/>
-      <w:r>
-        <w:t>urn</w:t>
-      </w:r>
-      <w:proofErr w:type="spellEnd"/>
-    </w:p>
-    <w:p>
-      <w:r>
-        <w:t xml:space="preserve">Eliminar as linhas das obras que não têm </w:t>
-      </w:r>
-      <w:proofErr w:type="spellStart"/>
-      <w:r>
-        <w:t>purl</w:t>
-      </w:r>
-      <w:proofErr w:type="spellEnd"/>
+        <w:t>Extrair dados atualizados do urn</w:t>
+      </w:r>
+    </w:p>
+    <w:p>
+      <w:r>
+        <w:lastRenderedPageBreak/>
+        <w:t>Eliminar as linhas das obras que não têm purl</w:t>
+      </w:r>
     </w:p>
     <w:p>
       <w:r>
@@ -2827,133 +2302,101 @@
           <w:b/>
           <w:bCs/>
         </w:rPr>
-        <w:t xml:space="preserve">É necessário acrescentar o ID às tabelas “catalogo” e “imagens” da </w:t>
-      </w:r>
-      <w:proofErr w:type="spellStart"/>
-      <w:r>
-        <w:rPr>
-          <w:b/>
-          <w:bCs/>
-        </w:rPr>
-        <w:t>bd</w:t>
-      </w:r>
-      <w:proofErr w:type="spellEnd"/>
-      <w:r>
-        <w:rPr>
-          <w:b/>
-          <w:bCs/>
-        </w:rPr>
-        <w:t>: “</w:t>
-      </w:r>
-      <w:proofErr w:type="spellStart"/>
-      <w:r>
-        <w:rPr>
-          <w:b/>
-          <w:bCs/>
-        </w:rPr>
-        <w:t>bibligraphic_data</w:t>
-      </w:r>
-      <w:proofErr w:type="spellEnd"/>
-      <w:r>
-        <w:rPr>
-          <w:b/>
-          <w:bCs/>
-        </w:rPr>
-        <w:t>”</w:t>
+        <w:t>É necessário acrescentar o ID às tabelas “catalogo” e “imagens” da bd: “bibligraphic_data”</w:t>
       </w:r>
     </w:p>
     <w:p/>
     <w:p>
       <w:r>
+        <w:t xml:space="preserve">Houve uma fusão de registos e os registos: </w:t>
+      </w:r>
+    </w:p>
+    <w:p>
+      <w:pPr>
+        <w:rPr>
+          <w:b/>
+          <w:bCs/>
+          <w:color w:val="000000" w:themeColor="text1"/>
+        </w:rPr>
+      </w:pPr>
+      <w:r>
+        <w:rPr>
+          <w:b/>
+          <w:bCs/>
+          <w:color w:val="000000" w:themeColor="text1"/>
+        </w:rPr>
+        <w:t>ALTERAR NO FICHEIRO ncb.csv</w:t>
+      </w:r>
+    </w:p>
+    <w:p>
+      <w:pPr>
+        <w:rPr>
+          <w:color w:val="000000" w:themeColor="text1"/>
+        </w:rPr>
+      </w:pPr>
+      <w:r>
+        <w:rPr>
+          <w:color w:val="000000" w:themeColor="text1"/>
+        </w:rPr>
+        <w:t>66868</w:t>
+      </w:r>
+      <w:r>
+        <w:rPr>
+          <w:color w:val="000000" w:themeColor="text1"/>
+        </w:rPr>
+        <w:t xml:space="preserve"> passou a 197691</w:t>
+      </w:r>
+    </w:p>
+    <w:p>
+      <w:pPr>
+        <w:rPr>
+          <w:color w:val="000000" w:themeColor="text1"/>
+        </w:rPr>
+      </w:pPr>
+      <w:r>
+        <w:rPr>
+          <w:color w:val="000000" w:themeColor="text1"/>
+        </w:rPr>
+        <w:t xml:space="preserve">454907 </w:t>
+      </w:r>
+      <w:r>
+        <w:rPr>
+          <w:color w:val="000000" w:themeColor="text1"/>
+        </w:rPr>
+        <w:t>passou a 851358</w:t>
+      </w:r>
+    </w:p>
+    <w:p>
+      <w:pPr>
+        <w:rPr>
+          <w:color w:val="000000" w:themeColor="text1"/>
+        </w:rPr>
+      </w:pPr>
+      <w:r>
+        <w:rPr>
+          <w:color w:val="000000" w:themeColor="text1"/>
+        </w:rPr>
+        <w:t xml:space="preserve">599364 passou a: </w:t>
+      </w:r>
+      <w:r>
+        <w:rPr>
+          <w:color w:val="000000" w:themeColor="text1"/>
+        </w:rPr>
+        <w:t>357297</w:t>
+      </w:r>
+    </w:p>
+    <w:p>
+      <w:pPr>
+        <w:spacing w:after="0" w:line="240" w:lineRule="auto"/>
+        <w:rPr>
+          <w:color w:val="000000" w:themeColor="text1"/>
+        </w:rPr>
+      </w:pPr>
+      <w:r>
+        <w:rPr>
+          <w:color w:val="000000" w:themeColor="text1"/>
+        </w:rPr>
         <w:lastRenderedPageBreak/>
-        <w:t xml:space="preserve">Houve uma fusão de registos e os registos: </w:t>
-      </w:r>
-    </w:p>
-    <w:p>
-      <w:pPr>
-        <w:rPr>
-          <w:b/>
-          <w:bCs/>
-          <w:color w:val="000000" w:themeColor="text1"/>
-        </w:rPr>
-      </w:pPr>
-      <w:r>
-        <w:rPr>
-          <w:b/>
-          <w:bCs/>
-          <w:color w:val="000000" w:themeColor="text1"/>
-        </w:rPr>
-        <w:t>ALTERAR NO FICHEIRO ncb.csv</w:t>
-      </w:r>
-    </w:p>
-    <w:p>
-      <w:pPr>
-        <w:rPr>
-          <w:color w:val="000000" w:themeColor="text1"/>
-        </w:rPr>
-      </w:pPr>
-      <w:r>
-        <w:rPr>
-          <w:color w:val="000000" w:themeColor="text1"/>
-        </w:rPr>
-        <w:t>66868</w:t>
-      </w:r>
-      <w:r>
-        <w:rPr>
-          <w:color w:val="000000" w:themeColor="text1"/>
-        </w:rPr>
-        <w:t xml:space="preserve"> passou a 197691</w:t>
-      </w:r>
-    </w:p>
-    <w:p>
-      <w:pPr>
-        <w:rPr>
-          <w:color w:val="000000" w:themeColor="text1"/>
-        </w:rPr>
-      </w:pPr>
-      <w:r>
-        <w:rPr>
-          <w:color w:val="000000" w:themeColor="text1"/>
-        </w:rPr>
-        <w:t xml:space="preserve">454907 </w:t>
-      </w:r>
-      <w:r>
-        <w:rPr>
-          <w:color w:val="000000" w:themeColor="text1"/>
-        </w:rPr>
-        <w:t>passou a 851358</w:t>
-      </w:r>
-    </w:p>
-    <w:p>
-      <w:pPr>
-        <w:rPr>
-          <w:color w:val="000000" w:themeColor="text1"/>
-        </w:rPr>
-      </w:pPr>
-      <w:r>
-        <w:rPr>
-          <w:color w:val="000000" w:themeColor="text1"/>
-        </w:rPr>
-        <w:t xml:space="preserve">599364 passou a: </w:t>
-      </w:r>
-      <w:r>
-        <w:rPr>
-          <w:color w:val="000000" w:themeColor="text1"/>
-        </w:rPr>
-        <w:t>357297</w:t>
-      </w:r>
-    </w:p>
-    <w:p>
-      <w:pPr>
-        <w:spacing w:after="0" w:line="240" w:lineRule="auto"/>
-        <w:rPr>
-          <w:color w:val="000000" w:themeColor="text1"/>
-        </w:rPr>
-      </w:pPr>
-      <w:r>
-        <w:rPr>
-          <w:color w:val="000000" w:themeColor="text1"/>
-        </w:rPr>
         <w:t>397785</w:t>
       </w:r>
       <w:r>
@@ -3182,7 +2625,6 @@
                 <w:lang w:eastAsia="pt-PT"/>
                 <w14:ligatures w14:val="none"/>
               </w:rPr>
-              <w:lastRenderedPageBreak/>
               <w:t>454907</w:t>
             </w:r>
           </w:p>
@@ -3296,7 +2738,7 @@
                 <w14:ligatures w14:val="none"/>
               </w:rPr>
             </w:pPr>
-            <w:hyperlink r:id="rId24" w:tgtFrame="_parent" w:history="1">
+            <w:hyperlink r:id="rId25" w:tgtFrame="_parent" w:history="1">
               <w:r>
                 <w:rPr>
                   <w:rFonts w:ascii="Aptos Narrow" w:eastAsia="Times New Roman" w:hAnsi="Aptos Narrow" w:cs="Times New Roman"/>
@@ -3680,6 +3122,7 @@
                 <w:lang w:eastAsia="pt-PT"/>
                 <w14:ligatures w14:val="none"/>
               </w:rPr>
+              <w:lastRenderedPageBreak/>
               <w:t>454907</w:t>
             </w:r>
           </w:p>
@@ -3793,7 +3236,7 @@
                 <w14:ligatures w14:val="none"/>
               </w:rPr>
             </w:pPr>
-            <w:hyperlink r:id="rId25" w:tgtFrame="_parent" w:history="1">
+            <w:hyperlink r:id="rId26" w:tgtFrame="_parent" w:history="1">
               <w:r>
                 <w:rPr>
                   <w:rFonts w:ascii="Aptos Narrow" w:eastAsia="Times New Roman" w:hAnsi="Aptos Narrow" w:cs="Times New Roman"/>
@@ -4177,7 +3620,6 @@
                 <w:lang w:eastAsia="pt-PT"/>
                 <w14:ligatures w14:val="none"/>
               </w:rPr>
-              <w:lastRenderedPageBreak/>
               <w:t>454907</w:t>
             </w:r>
           </w:p>
@@ -4291,7 +3733,7 @@
                 <w14:ligatures w14:val="none"/>
               </w:rPr>
             </w:pPr>
-            <w:hyperlink r:id="rId26" w:tgtFrame="_parent" w:history="1">
+            <w:hyperlink r:id="rId27" w:tgtFrame="_parent" w:history="1">
               <w:r>
                 <w:rPr>
                   <w:rFonts w:ascii="Aptos Narrow" w:eastAsia="Times New Roman" w:hAnsi="Aptos Narrow" w:cs="Times New Roman"/>
@@ -5249,6 +4691,7 @@
   <w:style w:type="character" w:default="1" w:styleId="Tipodeletrapredefinidodopargrafo">
     <w:name w:val="Default Paragraph Font"/>
     <w:uiPriority w:val="1"/>
+    <w:semiHidden/>
     <w:unhideWhenUsed/>
   </w:style>
   <w:style w:type="table" w:default="1" w:styleId="Tabelanormal">

</xml_diff>

<commit_message>
with images categories and subcategories
</commit_message>
<xml_diff>
--- a/relatorio.docx
+++ b/relatorio.docx
@@ -14,6 +14,1000 @@
           <w:b/>
           <w:bCs/>
         </w:rPr>
+        <w:t>11/05/2026</w:t>
+      </w:r>
+    </w:p>
+    <w:p>
+      <w:pPr>
+        <w:rPr>
+          <w:b/>
+          <w:bCs/>
+        </w:rPr>
+      </w:pPr>
+    </w:p>
+    <w:p>
+      <w:pPr>
+        <w:rPr>
+          <w:b/>
+          <w:bCs/>
+        </w:rPr>
+      </w:pPr>
+    </w:p>
+    <w:p>
+      <w:pPr>
+        <w:rPr>
+          <w:b/>
+          <w:bCs/>
+        </w:rPr>
+      </w:pPr>
+      <w:r>
+        <w:rPr>
+          <w:b/>
+          <w:bCs/>
+        </w:rPr>
+        <w:t>08/05/2026</w:t>
+      </w:r>
+    </w:p>
+    <w:p>
+      <w:pPr>
+        <w:rPr>
+          <w:b/>
+          <w:bCs/>
+        </w:rPr>
+      </w:pPr>
+    </w:p>
+    <w:p>
+      <w:pPr>
+        <w:rPr>
+          <w:b/>
+          <w:bCs/>
+        </w:rPr>
+      </w:pPr>
+      <w:r>
+        <w:rPr>
+          <w:b/>
+          <w:bCs/>
+        </w:rPr>
+        <w:t>Retirei o código:</w:t>
+      </w:r>
+    </w:p>
+    <w:p>
+      <w:pPr>
+        <w:spacing w:after="0" w:line="240" w:lineRule="auto"/>
+        <w:rPr>
+          <w:lang w:val="en-US"/>
+        </w:rPr>
+      </w:pPr>
+      <w:r>
+        <w:rPr>
+          <w:lang w:val="en-US"/>
+        </w:rPr>
+        <w:t>add_action( 'woocommerce_product_query', 'exclude_categories_from_shop' );</w:t>
+      </w:r>
+    </w:p>
+    <w:p>
+      <w:pPr>
+        <w:spacing w:after="0" w:line="240" w:lineRule="auto"/>
+        <w:rPr>
+          <w:lang w:val="en-US"/>
+        </w:rPr>
+      </w:pPr>
+    </w:p>
+    <w:p>
+      <w:pPr>
+        <w:spacing w:after="0" w:line="240" w:lineRule="auto"/>
+        <w:rPr>
+          <w:lang w:val="en-US"/>
+        </w:rPr>
+      </w:pPr>
+      <w:r>
+        <w:rPr>
+          <w:lang w:val="en-US"/>
+        </w:rPr>
+        <w:t>// function exclude_categories_from_shop( $q ) {</w:t>
+      </w:r>
+    </w:p>
+    <w:p>
+      <w:pPr>
+        <w:spacing w:after="0" w:line="240" w:lineRule="auto"/>
+        <w:rPr>
+          <w:lang w:val="en-US"/>
+        </w:rPr>
+      </w:pPr>
+    </w:p>
+    <w:p>
+      <w:pPr>
+        <w:spacing w:after="0" w:line="240" w:lineRule="auto"/>
+        <w:rPr>
+          <w:lang w:val="en-US"/>
+        </w:rPr>
+      </w:pPr>
+      <w:r>
+        <w:rPr>
+          <w:lang w:val="en-US"/>
+        </w:rPr>
+        <w:t xml:space="preserve">    // // --- Add the slugs of categories you want to hide ---</w:t>
+      </w:r>
+    </w:p>
+    <w:p>
+      <w:pPr>
+        <w:spacing w:after="0" w:line="240" w:lineRule="auto"/>
+        <w:rPr>
+          <w:lang w:val="en-US"/>
+        </w:rPr>
+      </w:pPr>
+      <w:r>
+        <w:rPr>
+          <w:lang w:val="en-US"/>
+        </w:rPr>
+        <w:t xml:space="preserve">    // $excluded_categories = array(</w:t>
+      </w:r>
+    </w:p>
+    <w:p>
+      <w:pPr>
+        <w:spacing w:after="0" w:line="240" w:lineRule="auto"/>
+        <w:rPr>
+          <w:lang w:val="en-US"/>
+        </w:rPr>
+      </w:pPr>
+      <w:r>
+        <w:rPr>
+          <w:lang w:val="en-US"/>
+        </w:rPr>
+        <w:t xml:space="preserve">        // 'imagens_cat',       // replace with your actual slug</w:t>
+      </w:r>
+    </w:p>
+    <w:p>
+      <w:pPr>
+        <w:spacing w:after="0" w:line="240" w:lineRule="auto"/>
+        <w:rPr>
+          <w:lang w:val="en-US"/>
+        </w:rPr>
+      </w:pPr>
+      <w:r>
+        <w:rPr>
+          <w:lang w:val="en-US"/>
+        </w:rPr>
+        <w:t xml:space="preserve">        </w:t>
+      </w:r>
+    </w:p>
+    <w:p>
+      <w:pPr>
+        <w:spacing w:after="0" w:line="240" w:lineRule="auto"/>
+        <w:rPr>
+          <w:lang w:val="en-US"/>
+        </w:rPr>
+      </w:pPr>
+      <w:r>
+        <w:rPr>
+          <w:lang w:val="en-US"/>
+        </w:rPr>
+        <w:t xml:space="preserve">    // );</w:t>
+      </w:r>
+    </w:p>
+    <w:p>
+      <w:pPr>
+        <w:spacing w:after="0" w:line="240" w:lineRule="auto"/>
+        <w:rPr>
+          <w:lang w:val="en-US"/>
+        </w:rPr>
+      </w:pPr>
+    </w:p>
+    <w:p>
+      <w:pPr>
+        <w:spacing w:after="0" w:line="240" w:lineRule="auto"/>
+        <w:rPr>
+          <w:lang w:val="en-US"/>
+        </w:rPr>
+      </w:pPr>
+      <w:r>
+        <w:rPr>
+          <w:lang w:val="en-US"/>
+        </w:rPr>
+        <w:t xml:space="preserve">    // // Don't run this on single product pages or admin</w:t>
+      </w:r>
+    </w:p>
+    <w:p>
+      <w:pPr>
+        <w:spacing w:after="0" w:line="240" w:lineRule="auto"/>
+        <w:rPr>
+          <w:lang w:val="en-US"/>
+        </w:rPr>
+      </w:pPr>
+      <w:r>
+        <w:rPr>
+          <w:lang w:val="en-US"/>
+        </w:rPr>
+        <w:t xml:space="preserve">    // if ( is_admin() || is_singular() ) {</w:t>
+      </w:r>
+    </w:p>
+    <w:p>
+      <w:pPr>
+        <w:spacing w:after="0" w:line="240" w:lineRule="auto"/>
+        <w:rPr>
+          <w:lang w:val="en-US"/>
+        </w:rPr>
+      </w:pPr>
+      <w:r>
+        <w:rPr>
+          <w:lang w:val="en-US"/>
+        </w:rPr>
+        <w:t xml:space="preserve">        // return;</w:t>
+      </w:r>
+    </w:p>
+    <w:p>
+      <w:pPr>
+        <w:spacing w:after="0" w:line="240" w:lineRule="auto"/>
+        <w:rPr>
+          <w:lang w:val="en-US"/>
+        </w:rPr>
+      </w:pPr>
+      <w:r>
+        <w:rPr>
+          <w:lang w:val="en-US"/>
+        </w:rPr>
+        <w:t xml:space="preserve">    // }</w:t>
+      </w:r>
+    </w:p>
+    <w:p>
+      <w:pPr>
+        <w:spacing w:after="0" w:line="240" w:lineRule="auto"/>
+        <w:rPr>
+          <w:lang w:val="en-US"/>
+        </w:rPr>
+      </w:pPr>
+    </w:p>
+    <w:p>
+      <w:pPr>
+        <w:spacing w:after="0" w:line="240" w:lineRule="auto"/>
+        <w:rPr>
+          <w:lang w:val="en-US"/>
+        </w:rPr>
+      </w:pPr>
+      <w:r>
+        <w:rPr>
+          <w:lang w:val="en-US"/>
+        </w:rPr>
+        <w:t xml:space="preserve">    // // Don't run this on the imagens_cat category page</w:t>
+      </w:r>
+    </w:p>
+    <w:p>
+      <w:pPr>
+        <w:spacing w:after="0" w:line="240" w:lineRule="auto"/>
+        <w:rPr>
+          <w:lang w:val="en-US"/>
+        </w:rPr>
+      </w:pPr>
+      <w:r>
+        <w:rPr>
+          <w:lang w:val="en-US"/>
+        </w:rPr>
+        <w:t xml:space="preserve">    // if ( is_product_category( 'imagens_cat' ) ) {</w:t>
+      </w:r>
+    </w:p>
+    <w:p>
+      <w:pPr>
+        <w:spacing w:after="0" w:line="240" w:lineRule="auto"/>
+        <w:rPr>
+          <w:lang w:val="en-US"/>
+        </w:rPr>
+      </w:pPr>
+      <w:r>
+        <w:rPr>
+          <w:lang w:val="en-US"/>
+        </w:rPr>
+        <w:t xml:space="preserve">        // return;</w:t>
+      </w:r>
+    </w:p>
+    <w:p>
+      <w:pPr>
+        <w:spacing w:after="0" w:line="240" w:lineRule="auto"/>
+        <w:rPr>
+          <w:lang w:val="en-US"/>
+        </w:rPr>
+      </w:pPr>
+      <w:r>
+        <w:rPr>
+          <w:lang w:val="en-US"/>
+        </w:rPr>
+        <w:lastRenderedPageBreak/>
+        <w:t xml:space="preserve">    // }</w:t>
+      </w:r>
+    </w:p>
+    <w:p>
+      <w:pPr>
+        <w:spacing w:after="0" w:line="240" w:lineRule="auto"/>
+        <w:rPr>
+          <w:lang w:val="en-US"/>
+        </w:rPr>
+      </w:pPr>
+    </w:p>
+    <w:p>
+      <w:pPr>
+        <w:spacing w:after="0" w:line="240" w:lineRule="auto"/>
+        <w:rPr>
+          <w:lang w:val="en-US"/>
+        </w:rPr>
+      </w:pPr>
+      <w:r>
+        <w:rPr>
+          <w:lang w:val="en-US"/>
+        </w:rPr>
+        <w:t xml:space="preserve">    // $tax_query = (array) $q-&gt;get( 'tax_query' );</w:t>
+      </w:r>
+    </w:p>
+    <w:p>
+      <w:pPr>
+        <w:spacing w:after="0" w:line="240" w:lineRule="auto"/>
+        <w:rPr>
+          <w:lang w:val="en-US"/>
+        </w:rPr>
+      </w:pPr>
+    </w:p>
+    <w:p>
+      <w:pPr>
+        <w:spacing w:after="0" w:line="240" w:lineRule="auto"/>
+        <w:rPr>
+          <w:lang w:val="en-US"/>
+        </w:rPr>
+      </w:pPr>
+      <w:r>
+        <w:rPr>
+          <w:lang w:val="en-US"/>
+        </w:rPr>
+        <w:t xml:space="preserve">    // $tax_query[] = array(</w:t>
+      </w:r>
+    </w:p>
+    <w:p>
+      <w:pPr>
+        <w:spacing w:after="0" w:line="240" w:lineRule="auto"/>
+        <w:rPr>
+          <w:lang w:val="en-US"/>
+        </w:rPr>
+      </w:pPr>
+      <w:r>
+        <w:rPr>
+          <w:lang w:val="en-US"/>
+        </w:rPr>
+        <w:t xml:space="preserve">        // 'taxonomy' =&gt; 'product_cat',</w:t>
+      </w:r>
+    </w:p>
+    <w:p>
+      <w:pPr>
+        <w:spacing w:after="0" w:line="240" w:lineRule="auto"/>
+        <w:rPr>
+          <w:lang w:val="en-US"/>
+        </w:rPr>
+      </w:pPr>
+      <w:r>
+        <w:rPr>
+          <w:lang w:val="en-US"/>
+        </w:rPr>
+        <w:t xml:space="preserve">        // 'field'    =&gt; 'slug',</w:t>
+      </w:r>
+    </w:p>
+    <w:p>
+      <w:pPr>
+        <w:spacing w:after="0" w:line="240" w:lineRule="auto"/>
+        <w:rPr>
+          <w:lang w:val="en-US"/>
+        </w:rPr>
+      </w:pPr>
+      <w:r>
+        <w:rPr>
+          <w:lang w:val="en-US"/>
+        </w:rPr>
+        <w:t xml:space="preserve">        // 'terms'    =&gt; $excluded_categories,</w:t>
+      </w:r>
+    </w:p>
+    <w:p>
+      <w:pPr>
+        <w:spacing w:after="0" w:line="240" w:lineRule="auto"/>
+        <w:rPr>
+          <w:lang w:val="en-US"/>
+        </w:rPr>
+      </w:pPr>
+      <w:r>
+        <w:rPr>
+          <w:lang w:val="en-US"/>
+        </w:rPr>
+        <w:t xml:space="preserve">        // 'operator' =&gt; 'NOT IN',</w:t>
+      </w:r>
+    </w:p>
+    <w:p>
+      <w:pPr>
+        <w:spacing w:after="0" w:line="240" w:lineRule="auto"/>
+        <w:rPr>
+          <w:lang w:val="en-US"/>
+        </w:rPr>
+      </w:pPr>
+      <w:r>
+        <w:rPr>
+          <w:lang w:val="en-US"/>
+        </w:rPr>
+        <w:t xml:space="preserve">    // );</w:t>
+      </w:r>
+    </w:p>
+    <w:p>
+      <w:pPr>
+        <w:spacing w:after="0" w:line="240" w:lineRule="auto"/>
+        <w:rPr>
+          <w:lang w:val="en-US"/>
+        </w:rPr>
+      </w:pPr>
+    </w:p>
+    <w:p>
+      <w:pPr>
+        <w:spacing w:after="0" w:line="240" w:lineRule="auto"/>
+        <w:rPr>
+          <w:lang w:val="en-US"/>
+        </w:rPr>
+      </w:pPr>
+      <w:r>
+        <w:rPr>
+          <w:lang w:val="en-US"/>
+        </w:rPr>
+        <w:t xml:space="preserve">    // $q-&gt;set( 'tax_query', $tax_query );</w:t>
+      </w:r>
+    </w:p>
+    <w:p>
+      <w:pPr>
+        <w:spacing w:after="0" w:line="240" w:lineRule="auto"/>
+      </w:pPr>
+      <w:r>
+        <w:t>// }</w:t>
+      </w:r>
+    </w:p>
+    <w:p>
+      <w:pPr>
+        <w:rPr>
+          <w:b/>
+          <w:bCs/>
+        </w:rPr>
+      </w:pPr>
+    </w:p>
+    <w:p>
+      <w:pPr>
+        <w:rPr>
+          <w:b/>
+          <w:bCs/>
+        </w:rPr>
+      </w:pPr>
+      <w:r>
+        <w:rPr>
+          <w:b/>
+          <w:bCs/>
+        </w:rPr>
+        <w:t>07/05/2026</w:t>
+      </w:r>
+    </w:p>
+    <w:p>
+      <w:r>
+        <w:t>Colocar as categorias das imagens como atributos resultou</w:t>
+      </w:r>
+      <w:r>
+        <w:t xml:space="preserve">. Os ficheiros estão em: </w:t>
+      </w:r>
+      <w:r>
+        <w:t>camoniana-imagens-com-atributos-RESULTOU</w:t>
+      </w:r>
+    </w:p>
+    <w:p/>
+    <w:p>
+      <w:r>
+        <w:t>Se as categorias ficarem todas associadas à categoria principal “Imagens”</w:t>
+      </w:r>
+      <w:r>
+        <w:t xml:space="preserve">, como as imagens não contam para a contagem das categorias do catálogo e é possível </w:t>
+      </w:r>
+      <w:r>
+        <w:t>não disponibilizar os registos com a categoria “Imagens” através de CSS</w:t>
+      </w:r>
+      <w:r>
+        <w:t>…</w:t>
+      </w:r>
+    </w:p>
+    <w:p/>
+    <w:p>
+      <w:pPr>
+        <w:rPr>
+          <w:b/>
+          <w:bCs/>
+        </w:rPr>
+      </w:pPr>
+      <w:r>
+        <w:rPr>
+          <w:b/>
+          <w:bCs/>
+        </w:rPr>
+        <w:t>17/04/2026</w:t>
+      </w:r>
+    </w:p>
+    <w:p>
+      <w:pPr>
+        <w:rPr>
+          <w:b/>
+          <w:bCs/>
+          <w:color w:val="EE0000"/>
+        </w:rPr>
+      </w:pPr>
+      <w:r>
+        <w:rPr>
+          <w:b/>
+          <w:bCs/>
+          <w:color w:val="EE0000"/>
+        </w:rPr>
+        <w:t>Se algum dos filtros dos atributos não estiver a apresentar a contagem correta, editar um dos produtos</w:t>
+      </w:r>
+      <w:r>
+        <w:rPr>
+          <w:b/>
+          <w:bCs/>
+          <w:color w:val="EE0000"/>
+        </w:rPr>
+        <w:t>, selecionar o atributo correto e guardar. Passam a aparecer as contagens corretas de todos os produtos.</w:t>
+      </w:r>
+    </w:p>
+    <w:p>
+      <w:pPr>
+        <w:rPr>
+          <w:b/>
+          <w:bCs/>
+        </w:rPr>
+      </w:pPr>
+    </w:p>
+    <w:p>
+      <w:pPr>
+        <w:rPr>
+          <w:b/>
+          <w:bCs/>
+        </w:rPr>
+      </w:pPr>
+      <w:r>
+        <w:rPr>
+          <w:b/>
+          <w:bCs/>
+        </w:rPr>
+        <w:t>Casos em que os registos devem ter sido fundidos:</w:t>
+      </w:r>
+    </w:p>
+    <w:p>
+      <w:hyperlink r:id="rId4" w:history="1">
+        <w:r>
+          <w:rPr>
+            <w:rStyle w:val="Hiperligao"/>
+          </w:rPr>
+          <w:t>https://camonianadigital.bnportugal.gov.pt/obra/o-biographo-8653431120/</w:t>
+        </w:r>
+      </w:hyperlink>
+    </w:p>
+    <w:p>
+      <w:pPr>
+        <w:rPr>
+          <w:b/>
+          <w:bCs/>
+        </w:rPr>
+      </w:pPr>
+    </w:p>
+    <w:p>
+      <w:pPr>
+        <w:rPr>
+          <w:b/>
+          <w:bCs/>
+        </w:rPr>
+      </w:pPr>
+    </w:p>
+    <w:p>
+      <w:pPr>
+        <w:rPr>
+          <w:b/>
+          <w:bCs/>
+        </w:rPr>
+      </w:pPr>
+      <w:r>
+        <w:rPr>
+          <w:b/>
+          <w:bCs/>
+        </w:rPr>
+        <w:t>15/04/2026</w:t>
+      </w:r>
+    </w:p>
+    <w:p>
+      <w:pPr>
+        <w:rPr>
+          <w:b/>
+          <w:bCs/>
+        </w:rPr>
+      </w:pPr>
+      <w:r>
+        <w:rPr>
+          <w:b/>
+          <w:bCs/>
+        </w:rPr>
+        <w:t xml:space="preserve">Ver Excel imagens e </w:t>
+      </w:r>
+      <w:r>
+        <w:rPr>
+          <w:b/>
+          <w:bCs/>
+        </w:rPr>
+        <w:t xml:space="preserve">registar volume e link para a imagem, depois extrair </w:t>
+      </w:r>
+      <w:proofErr w:type="spellStart"/>
+      <w:r>
+        <w:rPr>
+          <w:b/>
+          <w:bCs/>
+        </w:rPr>
+        <w:t>metadados</w:t>
+      </w:r>
+      <w:proofErr w:type="spellEnd"/>
+      <w:r>
+        <w:rPr>
+          <w:b/>
+          <w:bCs/>
+        </w:rPr>
+        <w:t xml:space="preserve">, importar ficheiro e </w:t>
+      </w:r>
+      <w:r>
+        <w:rPr>
+          <w:b/>
+          <w:bCs/>
+        </w:rPr>
+        <w:t>correr main.py</w:t>
+      </w:r>
+    </w:p>
+    <w:p>
+      <w:pPr>
+        <w:rPr>
+          <w:b/>
+          <w:bCs/>
+          <w:color w:val="EE0000"/>
+        </w:rPr>
+      </w:pPr>
+      <w:r>
+        <w:rPr>
+          <w:b/>
+          <w:bCs/>
+          <w:color w:val="EE0000"/>
+        </w:rPr>
+        <w:t>Ver se as imagens estão duplicadas antes de as recortar</w:t>
+      </w:r>
+    </w:p>
+    <w:p>
+      <w:pPr>
+        <w:rPr>
+          <w:b/>
+          <w:bCs/>
+        </w:rPr>
+      </w:pPr>
+    </w:p>
+    <w:p>
+      <w:pPr>
+        <w:rPr>
+          <w:b/>
+          <w:bCs/>
+        </w:rPr>
+      </w:pPr>
+      <w:r>
+        <w:rPr>
+          <w:b/>
+          <w:bCs/>
+        </w:rPr>
+        <w:t>14/04/2026</w:t>
+      </w:r>
+    </w:p>
+    <w:p>
+      <w:pPr>
+        <w:rPr>
+          <w:b/>
+          <w:bCs/>
+        </w:rPr>
+      </w:pPr>
+      <w:r>
+        <w:rPr>
+          <w:b/>
+          <w:bCs/>
+        </w:rPr>
+        <w:t>330 imagens</w:t>
+      </w:r>
+    </w:p>
+    <w:p>
+      <w:pPr>
+        <w:rPr>
+          <w:b/>
+          <w:bCs/>
+          <w:color w:val="EE0000"/>
+        </w:rPr>
+      </w:pPr>
+      <w:r>
+        <w:rPr>
+          <w:b/>
+          <w:bCs/>
+          <w:color w:val="EE0000"/>
+        </w:rPr>
+        <w:t xml:space="preserve">Faltam 20 camonianas que não tinham os </w:t>
+      </w:r>
+      <w:proofErr w:type="spellStart"/>
+      <w:r>
+        <w:rPr>
+          <w:b/>
+          <w:bCs/>
+          <w:color w:val="EE0000"/>
+        </w:rPr>
+        <w:t>purl</w:t>
+      </w:r>
+      <w:proofErr w:type="spellEnd"/>
+      <w:r>
+        <w:rPr>
+          <w:b/>
+          <w:bCs/>
+          <w:color w:val="EE0000"/>
+        </w:rPr>
+        <w:t xml:space="preserve"> em condições</w:t>
+      </w:r>
+    </w:p>
+    <w:p>
+      <w:pPr>
+        <w:rPr>
+          <w:b/>
+          <w:bCs/>
+        </w:rPr>
+      </w:pPr>
+    </w:p>
+    <w:p>
+      <w:pPr>
+        <w:rPr>
+          <w:b/>
+          <w:bCs/>
+        </w:rPr>
+      </w:pPr>
+      <w:r>
+        <w:rPr>
+          <w:b/>
+          <w:bCs/>
+        </w:rPr>
+        <w:t>13/04/2026</w:t>
+      </w:r>
+    </w:p>
+    <w:p>
+      <w:r>
+        <w:t xml:space="preserve">Ordenar </w:t>
+      </w:r>
+      <w:r>
+        <w:t>tanto os registos do catálogo, como das imagens, pela ordem crescente.</w:t>
+      </w:r>
+    </w:p>
+    <w:p>
+      <w:r>
+        <w:t>Também foi neces</w:t>
+      </w:r>
+      <w:r>
+        <w:t>sário substituir o ponto e vírgula por nada em create_posts.py</w:t>
+      </w:r>
+    </w:p>
+    <w:p>
+      <w:pPr>
+        <w:rPr>
+          <w:b/>
+          <w:bCs/>
+        </w:rPr>
+      </w:pPr>
+    </w:p>
+    <w:p>
+      <w:pPr>
+        <w:rPr>
+          <w:b/>
+          <w:bCs/>
+        </w:rPr>
+      </w:pPr>
+      <w:r>
+        <w:rPr>
+          <w:b/>
+          <w:bCs/>
+        </w:rPr>
+        <w:lastRenderedPageBreak/>
+        <w:t>10/04/2026</w:t>
+      </w:r>
+    </w:p>
+    <w:p>
+      <w:r>
+        <w:t xml:space="preserve">Recorte das imagens – Fiquei na página </w:t>
+      </w:r>
+      <w:r>
+        <w:t>14</w:t>
+      </w:r>
+    </w:p>
+    <w:p>
+      <w:r>
+        <w:t xml:space="preserve">Para os séculos surgirem pela ordem correta, </w:t>
+      </w:r>
+      <w:r>
+        <w:t>foi necessário acrescentar os números entre parênteses</w:t>
+      </w:r>
+    </w:p>
+    <w:p/>
+    <w:p>
+      <w:pPr>
+        <w:rPr>
+          <w:b/>
+          <w:bCs/>
+        </w:rPr>
+      </w:pPr>
+    </w:p>
+    <w:p>
+      <w:pPr>
+        <w:rPr>
+          <w:b/>
+          <w:bCs/>
+        </w:rPr>
+      </w:pPr>
+      <w:r>
+        <w:rPr>
+          <w:b/>
+          <w:bCs/>
+        </w:rPr>
+        <w:t>09/</w:t>
+      </w:r>
+      <w:r>
+        <w:rPr>
+          <w:b/>
+          <w:bCs/>
+        </w:rPr>
+        <w:t>04/2026</w:t>
+      </w:r>
+    </w:p>
+    <w:p>
+      <w:pPr>
+        <w:rPr>
+          <w:b/>
+          <w:bCs/>
+        </w:rPr>
+      </w:pPr>
+      <w:r>
+        <w:rPr>
+          <w:b/>
+          <w:bCs/>
+        </w:rPr>
+        <w:t xml:space="preserve">Retirar as funções do </w:t>
+      </w:r>
+      <w:proofErr w:type="spellStart"/>
+      <w:r>
+        <w:rPr>
+          <w:b/>
+          <w:bCs/>
+        </w:rPr>
+        <w:t>e</w:t>
+      </w:r>
+      <w:r>
+        <w:rPr>
+          <w:b/>
+          <w:bCs/>
+        </w:rPr>
+        <w:t>xtract_</w:t>
+      </w:r>
+      <w:r>
+        <w:rPr>
+          <w:b/>
+          <w:bCs/>
+        </w:rPr>
+        <w:t>urn_metadata</w:t>
+      </w:r>
+      <w:proofErr w:type="spellEnd"/>
+      <w:r>
+        <w:rPr>
+          <w:b/>
+          <w:bCs/>
+        </w:rPr>
+        <w:t xml:space="preserve"> e </w:t>
+      </w:r>
+      <w:proofErr w:type="spellStart"/>
+      <w:r>
+        <w:rPr>
+          <w:b/>
+          <w:bCs/>
+        </w:rPr>
+        <w:t>create_temp_categories</w:t>
+      </w:r>
+      <w:proofErr w:type="spellEnd"/>
+      <w:r>
+        <w:rPr>
+          <w:b/>
+          <w:bCs/>
+        </w:rPr>
+        <w:t xml:space="preserve"> – tipo de material, séculos, etc. - e colocar no ficheiro </w:t>
+      </w:r>
+      <w:proofErr w:type="spellStart"/>
+      <w:r>
+        <w:rPr>
+          <w:b/>
+          <w:bCs/>
+        </w:rPr>
+        <w:t>functions</w:t>
+      </w:r>
+      <w:proofErr w:type="spellEnd"/>
+      <w:r>
+        <w:rPr>
+          <w:b/>
+          <w:bCs/>
+        </w:rPr>
+        <w:t xml:space="preserve"> para </w:t>
+      </w:r>
+      <w:r>
+        <w:rPr>
+          <w:b/>
+          <w:bCs/>
+        </w:rPr>
+        <w:t>não ter de alterar em dois lados</w:t>
+      </w:r>
+    </w:p>
+    <w:p>
+      <w:pPr>
+        <w:rPr>
+          <w:b/>
+          <w:bCs/>
+        </w:rPr>
+      </w:pPr>
+    </w:p>
+    <w:p>
+      <w:pPr>
+        <w:rPr>
+          <w:b/>
+          <w:bCs/>
+        </w:rPr>
+      </w:pPr>
+      <w:r>
+        <w:rPr>
+          <w:b/>
+          <w:bCs/>
+        </w:rPr>
+        <w:t xml:space="preserve">Problema com diacríticos </w:t>
+      </w:r>
+      <w:r>
+        <w:rPr>
+          <w:b/>
+          <w:bCs/>
+        </w:rPr>
+        <w:t xml:space="preserve">no filtro dos episódios: </w:t>
+      </w:r>
+      <w:hyperlink r:id="rId5" w:history="1">
+        <w:r>
+          <w:rPr>
+            <w:rStyle w:val="Hiperligao"/>
+            <w:b/>
+            <w:bCs/>
+          </w:rPr>
+          <w:t>Concílio "Conselho dos Deuses"</w:t>
+        </w:r>
+      </w:hyperlink>
+      <w:r>
+        <w:rPr>
+          <w:b/>
+          <w:bCs/>
+        </w:rPr>
+        <w:t> (79)</w:t>
+      </w:r>
+    </w:p>
+    <w:p>
+      <w:pPr>
+        <w:rPr>
+          <w:b/>
+          <w:bCs/>
+        </w:rPr>
+      </w:pPr>
+    </w:p>
+    <w:p>
+      <w:pPr>
+        <w:rPr>
+          <w:b/>
+          <w:bCs/>
+        </w:rPr>
+      </w:pPr>
+      <w:r>
+        <w:rPr>
+          <w:b/>
+          <w:bCs/>
+        </w:rPr>
         <w:t>07/04/2026</w:t>
       </w:r>
     </w:p>
@@ -29,7 +1023,7 @@
           <w:b/>
           <w:bCs/>
         </w:rPr>
-        <w:t xml:space="preserve">Sugestões do Paulo Barata: </w:t>
+        <w:t xml:space="preserve">Sugestões do P B: </w:t>
       </w:r>
     </w:p>
     <w:p>
@@ -66,6 +1060,7 @@
           <w:b/>
           <w:bCs/>
         </w:rPr>
+        <w:lastRenderedPageBreak/>
         <w:t>02/04/2026</w:t>
       </w:r>
     </w:p>
@@ -99,14 +1094,42 @@
           <w:bCs/>
           <w:color w:val="EE0000"/>
         </w:rPr>
-        <w:t>Canto deve ter o slug: pa_cantos</w:t>
-      </w:r>
+        <w:t xml:space="preserve">Canto deve ter o </w:t>
+      </w:r>
+      <w:proofErr w:type="spellStart"/>
       <w:r>
         <w:rPr>
           <w:b/>
           <w:bCs/>
           <w:color w:val="EE0000"/>
         </w:rPr>
+        <w:t>slug</w:t>
+      </w:r>
+      <w:proofErr w:type="spellEnd"/>
+      <w:r>
+        <w:rPr>
+          <w:b/>
+          <w:bCs/>
+          <w:color w:val="EE0000"/>
+        </w:rPr>
+        <w:t xml:space="preserve">: </w:t>
+      </w:r>
+      <w:proofErr w:type="spellStart"/>
+      <w:r>
+        <w:rPr>
+          <w:b/>
+          <w:bCs/>
+          <w:color w:val="EE0000"/>
+        </w:rPr>
+        <w:t>pa_cantos</w:t>
+      </w:r>
+      <w:proofErr w:type="spellEnd"/>
+      <w:r>
+        <w:rPr>
+          <w:b/>
+          <w:bCs/>
+          <w:color w:val="EE0000"/>
+        </w:rPr>
         <w:t xml:space="preserve"> e o mesmo procedimento para os episódios</w:t>
       </w:r>
     </w:p>
@@ -155,31 +1178,51 @@
           <w:bCs/>
           <w:color w:val="EE0000"/>
         </w:rPr>
-        <w:t>O problema está no thumbnail_id</w:t>
-      </w:r>
+        <w:t xml:space="preserve">O problema está no </w:t>
+      </w:r>
+      <w:proofErr w:type="spellStart"/>
       <w:r>
         <w:rPr>
           <w:b/>
           <w:bCs/>
           <w:color w:val="EE0000"/>
         </w:rPr>
-        <w:t>, está se feita a ligação ao registo master</w:t>
-      </w:r>
-    </w:p>
-    <w:p>
-      <w:pPr>
+        <w:t>thumbnail_id</w:t>
+      </w:r>
+      <w:proofErr w:type="spellEnd"/>
+      <w:r>
         <w:rPr>
           <w:b/>
           <w:bCs/>
           <w:color w:val="EE0000"/>
         </w:rPr>
-      </w:pPr>
+        <w:t xml:space="preserve">, está se feita a ligação ao registo </w:t>
+      </w:r>
+      <w:proofErr w:type="spellStart"/>
       <w:r>
         <w:rPr>
           <w:b/>
           <w:bCs/>
           <w:color w:val="EE0000"/>
         </w:rPr>
+        <w:t>master</w:t>
+      </w:r>
+      <w:proofErr w:type="spellEnd"/>
+    </w:p>
+    <w:p>
+      <w:pPr>
+        <w:rPr>
+          <w:b/>
+          <w:bCs/>
+          <w:color w:val="EE0000"/>
+        </w:rPr>
+      </w:pPr>
+      <w:r>
+        <w:rPr>
+          <w:b/>
+          <w:bCs/>
+          <w:color w:val="EE0000"/>
+        </w:rPr>
         <w:t>Correr sc</w:t>
       </w:r>
       <w:r>
@@ -188,20 +1231,62 @@
           <w:bCs/>
           <w:color w:val="EE0000"/>
         </w:rPr>
-        <w:t>ript até postmeta_thumbs – ficheiro imagens1</w:t>
-      </w:r>
+        <w:t xml:space="preserve">ript até </w:t>
+      </w:r>
+      <w:proofErr w:type="spellStart"/>
       <w:r>
         <w:rPr>
           <w:b/>
           <w:bCs/>
           <w:color w:val="EE0000"/>
         </w:rPr>
+        <w:t>postmeta_thumbs</w:t>
+      </w:r>
+      <w:proofErr w:type="spellEnd"/>
+      <w:r>
+        <w:rPr>
+          <w:b/>
+          <w:bCs/>
+          <w:color w:val="EE0000"/>
+        </w:rPr>
+        <w:t xml:space="preserve"> – ficheiro imagens1</w:t>
+      </w:r>
+      <w:r>
+        <w:rPr>
+          <w:b/>
+          <w:bCs/>
+          <w:color w:val="EE0000"/>
+        </w:rPr>
         <w:t xml:space="preserve"> para ver se há diferença</w:t>
       </w:r>
     </w:p>
     <w:p>
       <w:r>
-        <w:t>9679 tem como parent o 7564 que tem no postmeta o meta_value 9430 que é a capa da obra</w:t>
+        <w:t xml:space="preserve">9679 tem como </w:t>
+      </w:r>
+      <w:proofErr w:type="spellStart"/>
+      <w:r>
+        <w:t>parent</w:t>
+      </w:r>
+      <w:proofErr w:type="spellEnd"/>
+      <w:r>
+        <w:t xml:space="preserve"> o 7564 que tem no </w:t>
+      </w:r>
+      <w:proofErr w:type="spellStart"/>
+      <w:r>
+        <w:t>postmeta</w:t>
+      </w:r>
+      <w:proofErr w:type="spellEnd"/>
+      <w:r>
+        <w:t xml:space="preserve"> o </w:t>
+      </w:r>
+      <w:proofErr w:type="spellStart"/>
+      <w:r>
+        <w:t>meta_value</w:t>
+      </w:r>
+      <w:proofErr w:type="spellEnd"/>
+      <w:r>
+        <w:t xml:space="preserve"> 9430 que é a capa da obra</w:t>
       </w:r>
     </w:p>
     <w:p>
@@ -239,7 +1324,6 @@
           <w:b/>
           <w:bCs/>
         </w:rPr>
-        <w:lastRenderedPageBreak/>
         <w:t xml:space="preserve">9679 </w:t>
       </w:r>
       <w:r>
@@ -331,7 +1415,7 @@
         </w:rPr>
         <w:t xml:space="preserve">depois de correr: </w:t>
       </w:r>
-      <w:hyperlink r:id="rId4" w:tgtFrame="mysql_doc" w:history="1">
+      <w:hyperlink r:id="rId6" w:tgtFrame="mysql_doc" w:history="1">
         <w:r>
           <w:rPr>
             <w:rStyle w:val="Hiperligao"/>
@@ -346,21 +1430,54 @@
           <w:b/>
           <w:bCs/>
         </w:rPr>
-        <w:t> * FROM `wp_postmeta` WHERE post_id = 8204;</w:t>
-      </w:r>
-    </w:p>
-    <w:p>
-      <w:pPr>
-        <w:rPr>
-          <w:b/>
-          <w:bCs/>
-        </w:rPr>
-      </w:pPr>
-      <w:r>
-        <w:rPr>
-          <w:b/>
-          <w:bCs/>
-        </w:rPr>
+        <w:t> * FROM `</w:t>
+      </w:r>
+      <w:proofErr w:type="spellStart"/>
+      <w:r>
+        <w:rPr>
+          <w:b/>
+          <w:bCs/>
+        </w:rPr>
+        <w:t>wp_postmeta</w:t>
+      </w:r>
+      <w:proofErr w:type="spellEnd"/>
+      <w:r>
+        <w:rPr>
+          <w:b/>
+          <w:bCs/>
+        </w:rPr>
+        <w:t>` WHERE </w:t>
+      </w:r>
+      <w:proofErr w:type="spellStart"/>
+      <w:r>
+        <w:rPr>
+          <w:b/>
+          <w:bCs/>
+        </w:rPr>
+        <w:t>post_id</w:t>
+      </w:r>
+      <w:proofErr w:type="spellEnd"/>
+      <w:r>
+        <w:rPr>
+          <w:b/>
+          <w:bCs/>
+        </w:rPr>
+        <w:t> = 8204;</w:t>
+      </w:r>
+    </w:p>
+    <w:p>
+      <w:pPr>
+        <w:rPr>
+          <w:b/>
+          <w:bCs/>
+        </w:rPr>
+      </w:pPr>
+      <w:r>
+        <w:rPr>
+          <w:b/>
+          <w:bCs/>
+        </w:rPr>
+        <w:lastRenderedPageBreak/>
         <w:t xml:space="preserve">Aparece. </w:t>
       </w:r>
     </w:p>
@@ -486,8 +1603,17 @@
                 <w:b/>
                 <w:bCs/>
               </w:rPr>
-              <w:t>_thumbnail_id</w:t>
+              <w:t>_</w:t>
             </w:r>
+            <w:proofErr w:type="spellStart"/>
+            <w:r>
+              <w:rPr>
+                <w:b/>
+                <w:bCs/>
+              </w:rPr>
+              <w:t>thumbnail_id</w:t>
+            </w:r>
+            <w:proofErr w:type="spellEnd"/>
           </w:p>
         </w:tc>
         <w:tc>
@@ -549,7 +1675,7 @@
       </w:r>
     </w:p>
     <w:p>
-      <w:hyperlink r:id="rId5" w:history="1">
+      <w:hyperlink r:id="rId7" w:history="1">
         <w:r>
           <w:rPr>
             <w:rStyle w:val="Hiperligao"/>
@@ -600,7 +1726,25 @@
           <w:bCs/>
           <w:color w:val="EE0000"/>
         </w:rPr>
-        <w:t xml:space="preserve"> não no 554, devido à categoria “imagens_cat” ser a 554</w:t>
+        <w:t xml:space="preserve"> não no 554, devido à categoria “</w:t>
+      </w:r>
+      <w:proofErr w:type="spellStart"/>
+      <w:r>
+        <w:rPr>
+          <w:b/>
+          <w:bCs/>
+          <w:color w:val="EE0000"/>
+        </w:rPr>
+        <w:t>imagens_cat</w:t>
+      </w:r>
+      <w:proofErr w:type="spellEnd"/>
+      <w:r>
+        <w:rPr>
+          <w:b/>
+          <w:bCs/>
+          <w:color w:val="EE0000"/>
+        </w:rPr>
+        <w:t>” ser a 554</w:t>
       </w:r>
     </w:p>
     <w:p>
@@ -660,26 +1804,25 @@
           <w:iCs/>
           <w:lang w:val="en-US"/>
         </w:rPr>
-        <w:lastRenderedPageBreak/>
-        <w:t>function change_products_found_number() {</w:t>
-      </w:r>
-    </w:p>
-    <w:p>
-      <w:pPr>
-        <w:spacing w:after="0" w:line="240" w:lineRule="auto"/>
+        <w:t xml:space="preserve">function </w:t>
+      </w:r>
+      <w:proofErr w:type="spellStart"/>
+      <w:r>
         <w:rPr>
           <w:i/>
           <w:iCs/>
           <w:lang w:val="en-US"/>
         </w:rPr>
-      </w:pPr>
+        <w:t>change_products_found_number</w:t>
+      </w:r>
+      <w:proofErr w:type="spellEnd"/>
       <w:r>
         <w:rPr>
           <w:i/>
           <w:iCs/>
           <w:lang w:val="en-US"/>
         </w:rPr>
-        <w:t xml:space="preserve">    ?&gt;</w:t>
+        <w:t>() {</w:t>
       </w:r>
     </w:p>
     <w:p>
@@ -697,7 +1840,7 @@
           <w:iCs/>
           <w:lang w:val="en-US"/>
         </w:rPr>
-        <w:t xml:space="preserve">    &lt;script&gt;</w:t>
+        <w:t xml:space="preserve">    ?&gt;</w:t>
       </w:r>
     </w:p>
     <w:p>
@@ -715,7 +1858,7 @@
           <w:iCs/>
           <w:lang w:val="en-US"/>
         </w:rPr>
-        <w:t xml:space="preserve">        jQuery(document).ready(function($) {</w:t>
+        <w:t xml:space="preserve">    &lt;script&gt;</w:t>
       </w:r>
     </w:p>
     <w:p>
@@ -733,7 +1876,7 @@
           <w:iCs/>
           <w:lang w:val="en-US"/>
         </w:rPr>
-        <w:t xml:space="preserve">            if ($('.products-found strong').text() === '2115') {</w:t>
+        <w:t xml:space="preserve">        jQuery(document).ready(function($) {</w:t>
       </w:r>
     </w:p>
     <w:p>
@@ -751,7 +1894,7 @@
           <w:iCs/>
           <w:lang w:val="en-US"/>
         </w:rPr>
-        <w:t xml:space="preserve">                $('.products-found strong').text('1249');</w:t>
+        <w:t xml:space="preserve">            if ($('.products-found strong').text() === '2115') {</w:t>
       </w:r>
     </w:p>
     <w:p>
@@ -769,7 +1912,7 @@
           <w:iCs/>
           <w:lang w:val="en-US"/>
         </w:rPr>
-        <w:t xml:space="preserve">            }</w:t>
+        <w:t xml:space="preserve">                $('.products-found strong').text('1249');</w:t>
       </w:r>
     </w:p>
     <w:p>
@@ -787,7 +1930,7 @@
           <w:iCs/>
           <w:lang w:val="en-US"/>
         </w:rPr>
-        <w:t xml:space="preserve">        });</w:t>
+        <w:t xml:space="preserve">            }</w:t>
       </w:r>
     </w:p>
     <w:p>
@@ -805,7 +1948,7 @@
           <w:iCs/>
           <w:lang w:val="en-US"/>
         </w:rPr>
-        <w:t xml:space="preserve">    &lt;/script&gt;</w:t>
+        <w:t xml:space="preserve">        });</w:t>
       </w:r>
     </w:p>
     <w:p>
@@ -823,7 +1966,7 @@
           <w:iCs/>
           <w:lang w:val="en-US"/>
         </w:rPr>
-        <w:t xml:space="preserve">    &lt;?php</w:t>
+        <w:t xml:space="preserve">    &lt;/script&gt;</w:t>
       </w:r>
     </w:p>
     <w:p>
@@ -841,25 +1984,100 @@
           <w:iCs/>
           <w:lang w:val="en-US"/>
         </w:rPr>
-        <w:t>}</w:t>
-      </w:r>
-    </w:p>
-    <w:p>
-      <w:pPr>
-        <w:spacing w:after="0" w:line="240" w:lineRule="auto"/>
+        <w:t xml:space="preserve">    &lt;?</w:t>
+      </w:r>
+      <w:proofErr w:type="spellStart"/>
+      <w:r>
         <w:rPr>
           <w:i/>
           <w:iCs/>
           <w:lang w:val="en-US"/>
         </w:rPr>
-      </w:pPr>
-      <w:r>
+        <w:t>php</w:t>
+      </w:r>
+      <w:proofErr w:type="spellEnd"/>
+    </w:p>
+    <w:p>
+      <w:pPr>
+        <w:spacing w:after="0" w:line="240" w:lineRule="auto"/>
         <w:rPr>
           <w:i/>
           <w:iCs/>
           <w:lang w:val="en-US"/>
         </w:rPr>
-        <w:t>add_action('wp_footer', 'change_products_found_number');</w:t>
+      </w:pPr>
+      <w:r>
+        <w:rPr>
+          <w:i/>
+          <w:iCs/>
+          <w:lang w:val="en-US"/>
+        </w:rPr>
+        <w:lastRenderedPageBreak/>
+        <w:t>}</w:t>
+      </w:r>
+    </w:p>
+    <w:p>
+      <w:pPr>
+        <w:spacing w:after="0" w:line="240" w:lineRule="auto"/>
+        <w:rPr>
+          <w:i/>
+          <w:iCs/>
+          <w:lang w:val="en-US"/>
+        </w:rPr>
+      </w:pPr>
+      <w:proofErr w:type="spellStart"/>
+      <w:r>
+        <w:rPr>
+          <w:i/>
+          <w:iCs/>
+          <w:lang w:val="en-US"/>
+        </w:rPr>
+        <w:t>add_action</w:t>
+      </w:r>
+      <w:proofErr w:type="spellEnd"/>
+      <w:r>
+        <w:rPr>
+          <w:i/>
+          <w:iCs/>
+          <w:lang w:val="en-US"/>
+        </w:rPr>
+        <w:t>('</w:t>
+      </w:r>
+      <w:proofErr w:type="spellStart"/>
+      <w:r>
+        <w:rPr>
+          <w:i/>
+          <w:iCs/>
+          <w:lang w:val="en-US"/>
+        </w:rPr>
+        <w:t>wp_footer</w:t>
+      </w:r>
+      <w:proofErr w:type="spellEnd"/>
+      <w:r>
+        <w:rPr>
+          <w:i/>
+          <w:iCs/>
+          <w:lang w:val="en-US"/>
+        </w:rPr>
+        <w:t>', '</w:t>
+      </w:r>
+      <w:proofErr w:type="spellStart"/>
+      <w:r>
+        <w:rPr>
+          <w:i/>
+          <w:iCs/>
+          <w:lang w:val="en-US"/>
+        </w:rPr>
+        <w:t>change_products_found_number</w:t>
+      </w:r>
+      <w:proofErr w:type="spellEnd"/>
+      <w:r>
+        <w:rPr>
+          <w:i/>
+          <w:iCs/>
+          <w:lang w:val="en-US"/>
+        </w:rPr>
+        <w:t>');</w:t>
       </w:r>
     </w:p>
     <w:p>
@@ -918,24 +2136,78 @@
           <w:bCs/>
           <w:color w:val="EE0000"/>
         </w:rPr>
-        <w:t xml:space="preserve">Tive de alterar a numeração do ficheiro “imagens” de “data_csv” de </w:t>
-      </w:r>
+        <w:t>Tive de alterar a numeração do ficheiro “imagens” de “</w:t>
+      </w:r>
+      <w:proofErr w:type="spellStart"/>
       <w:r>
         <w:rPr>
           <w:b/>
           <w:bCs/>
           <w:color w:val="EE0000"/>
         </w:rPr>
-        <w:t>7341 para 9456, senão não haveria encontro entre os posts das imagens (das imagens) e o os registos do ficheiro “data_csv.imagens”</w:t>
-      </w:r>
-    </w:p>
-    <w:p>
-      <w:pPr>
+        <w:t>data_csv</w:t>
+      </w:r>
+      <w:proofErr w:type="spellEnd"/>
+      <w:r>
         <w:rPr>
           <w:b/>
           <w:bCs/>
           <w:color w:val="EE0000"/>
         </w:rPr>
+        <w:t xml:space="preserve">” de </w:t>
+      </w:r>
+      <w:r>
+        <w:rPr>
+          <w:b/>
+          <w:bCs/>
+          <w:color w:val="EE0000"/>
+        </w:rPr>
+        <w:t xml:space="preserve">7341 para 9456, senão não haveria encontro entre os </w:t>
+      </w:r>
+      <w:proofErr w:type="spellStart"/>
+      <w:r>
+        <w:rPr>
+          <w:b/>
+          <w:bCs/>
+          <w:color w:val="EE0000"/>
+        </w:rPr>
+        <w:t>posts</w:t>
+      </w:r>
+      <w:proofErr w:type="spellEnd"/>
+      <w:r>
+        <w:rPr>
+          <w:b/>
+          <w:bCs/>
+          <w:color w:val="EE0000"/>
+        </w:rPr>
+        <w:t xml:space="preserve"> das imagens (das imagens) e o os registos do ficheiro “</w:t>
+      </w:r>
+      <w:proofErr w:type="spellStart"/>
+      <w:r>
+        <w:rPr>
+          <w:b/>
+          <w:bCs/>
+          <w:color w:val="EE0000"/>
+        </w:rPr>
+        <w:t>data_csv.imagens</w:t>
+      </w:r>
+      <w:proofErr w:type="spellEnd"/>
+      <w:r>
+        <w:rPr>
+          <w:b/>
+          <w:bCs/>
+          <w:color w:val="EE0000"/>
+        </w:rPr>
+        <w:t>”</w:t>
+      </w:r>
+    </w:p>
+    <w:p>
+      <w:pPr>
+        <w:rPr>
+          <w:b/>
+          <w:bCs/>
+          <w:color w:val="EE0000"/>
+        </w:rPr>
       </w:pPr>
     </w:p>
     <w:p>
@@ -1039,46 +2311,35 @@
         <w:rPr>
           <w:lang w:val="en-US"/>
         </w:rPr>
-        <w:t>                                 category_suffix = '_pa_cantos'</w:t>
-      </w:r>
-    </w:p>
-    <w:p>
-      <w:pPr>
-        <w:rPr>
-          <w:lang w:val="en-US"/>
-        </w:rPr>
-      </w:pPr>
-      <w:r>
-        <w:rPr>
-          <w:lang w:val="en-US"/>
-        </w:rPr>
-        <w:t>                            elif 'Episódios' in categories:</w:t>
-      </w:r>
-    </w:p>
-    <w:p>
-      <w:pPr>
-        <w:rPr>
-          <w:lang w:val="en-US"/>
-        </w:rPr>
-      </w:pPr>
-      <w:r>
-        <w:rPr>
-          <w:lang w:val="en-US"/>
-        </w:rPr>
-        <w:t>                                 category_suffix = '_pa_episodios'</w:t>
-      </w:r>
-    </w:p>
-    <w:p>
-      <w:pPr>
-        <w:rPr>
-          <w:lang w:val="en-US"/>
-        </w:rPr>
-      </w:pPr>
-      <w:r>
-        <w:rPr>
-          <w:lang w:val="en-US"/>
-        </w:rPr>
-        <w:t>                            slugs_text = "".join(slugs) + category_suffix</w:t>
+        <w:t>                                 </w:t>
+      </w:r>
+      <w:proofErr w:type="spellStart"/>
+      <w:r>
+        <w:rPr>
+          <w:lang w:val="en-US"/>
+        </w:rPr>
+        <w:t>category_suffix</w:t>
+      </w:r>
+      <w:proofErr w:type="spellEnd"/>
+      <w:r>
+        <w:rPr>
+          <w:lang w:val="en-US"/>
+        </w:rPr>
+        <w:t xml:space="preserve"> = '_</w:t>
+      </w:r>
+      <w:proofErr w:type="spellStart"/>
+      <w:r>
+        <w:rPr>
+          <w:lang w:val="en-US"/>
+        </w:rPr>
+        <w:t>pa_cantos</w:t>
+      </w:r>
+      <w:proofErr w:type="spellEnd"/>
+      <w:r>
+        <w:rPr>
+          <w:lang w:val="en-US"/>
+        </w:rPr>
+        <w:t>'</w:t>
       </w:r>
     </w:p>
     <w:p>
@@ -1093,11 +2354,129 @@
         </w:rPr>
         <w:t xml:space="preserve">                            </w:t>
       </w:r>
-      <w:r>
-        <w:rPr>
-          <w:lang w:val="en-US"/>
-        </w:rPr>
-        <w:t>print(slugs_text)</w:t>
+      <w:proofErr w:type="spellStart"/>
+      <w:r>
+        <w:rPr>
+          <w:lang w:val="en-US"/>
+        </w:rPr>
+        <w:t>elif</w:t>
+      </w:r>
+      <w:proofErr w:type="spellEnd"/>
+      <w:r>
+        <w:rPr>
+          <w:lang w:val="en-US"/>
+        </w:rPr>
+        <w:t xml:space="preserve"> 'Episódios' in categories:</w:t>
+      </w:r>
+    </w:p>
+    <w:p>
+      <w:pPr>
+        <w:rPr>
+          <w:lang w:val="en-US"/>
+        </w:rPr>
+      </w:pPr>
+      <w:r>
+        <w:rPr>
+          <w:lang w:val="en-US"/>
+        </w:rPr>
+        <w:lastRenderedPageBreak/>
+        <w:t>                                 </w:t>
+      </w:r>
+      <w:proofErr w:type="spellStart"/>
+      <w:r>
+        <w:rPr>
+          <w:lang w:val="en-US"/>
+        </w:rPr>
+        <w:t>category_suffix</w:t>
+      </w:r>
+      <w:proofErr w:type="spellEnd"/>
+      <w:r>
+        <w:rPr>
+          <w:lang w:val="en-US"/>
+        </w:rPr>
+        <w:t xml:space="preserve"> = '_</w:t>
+      </w:r>
+      <w:proofErr w:type="spellStart"/>
+      <w:r>
+        <w:rPr>
+          <w:lang w:val="en-US"/>
+        </w:rPr>
+        <w:t>pa_episodios</w:t>
+      </w:r>
+      <w:proofErr w:type="spellEnd"/>
+      <w:r>
+        <w:rPr>
+          <w:lang w:val="en-US"/>
+        </w:rPr>
+        <w:t>'</w:t>
+      </w:r>
+    </w:p>
+    <w:p>
+      <w:pPr>
+        <w:rPr>
+          <w:lang w:val="en-US"/>
+        </w:rPr>
+      </w:pPr>
+      <w:r>
+        <w:rPr>
+          <w:lang w:val="en-US"/>
+        </w:rPr>
+        <w:t xml:space="preserve">                            </w:t>
+      </w:r>
+      <w:proofErr w:type="spellStart"/>
+      <w:r>
+        <w:rPr>
+          <w:lang w:val="en-US"/>
+        </w:rPr>
+        <w:t>slugs_text</w:t>
+      </w:r>
+      <w:proofErr w:type="spellEnd"/>
+      <w:r>
+        <w:rPr>
+          <w:lang w:val="en-US"/>
+        </w:rPr>
+        <w:t xml:space="preserve"> = "".join(slugs) + </w:t>
+      </w:r>
+      <w:proofErr w:type="spellStart"/>
+      <w:r>
+        <w:rPr>
+          <w:lang w:val="en-US"/>
+        </w:rPr>
+        <w:t>category_suffix</w:t>
+      </w:r>
+      <w:proofErr w:type="spellEnd"/>
+    </w:p>
+    <w:p>
+      <w:pPr>
+        <w:rPr>
+          <w:lang w:val="en-US"/>
+        </w:rPr>
+      </w:pPr>
+      <w:r>
+        <w:rPr>
+          <w:lang w:val="en-US"/>
+        </w:rPr>
+        <w:t xml:space="preserve">                            </w:t>
+      </w:r>
+      <w:r>
+        <w:rPr>
+          <w:lang w:val="en-US"/>
+        </w:rPr>
+        <w:t>print(</w:t>
+      </w:r>
+      <w:proofErr w:type="spellStart"/>
+      <w:r>
+        <w:rPr>
+          <w:lang w:val="en-US"/>
+        </w:rPr>
+        <w:t>slugs_text</w:t>
+      </w:r>
+      <w:proofErr w:type="spellEnd"/>
+      <w:r>
+        <w:rPr>
+          <w:lang w:val="en-US"/>
+        </w:rPr>
+        <w:t>)</w:t>
       </w:r>
     </w:p>
     <w:p>
@@ -1133,183 +2512,324 @@
         </w:rPr>
         <w:t xml:space="preserve">            </w:t>
       </w:r>
-      <w:r>
-        <w:t>elif '_cantos' in categories[i][2]:</w:t>
-      </w:r>
-    </w:p>
-    <w:p>
-      <w:r>
-        <w:t>                taxonomy = 'pa_cantos'</w:t>
-      </w:r>
-    </w:p>
-    <w:p>
-      <w:r>
-        <w:t>            elif '_episodios' in categories[i][2]:</w:t>
-      </w:r>
-    </w:p>
-    <w:p>
-      <w:r>
-        <w:t>                taxonomy = 'pa_episodios'</w:t>
-      </w:r>
-    </w:p>
-    <w:p>
-      <w:pPr>
-        <w:rPr>
-          <w:b/>
-          <w:bCs/>
-        </w:rPr>
-      </w:pPr>
-    </w:p>
-    <w:p>
-      <w:pPr>
-        <w:rPr>
-          <w:b/>
-          <w:bCs/>
-        </w:rPr>
-      </w:pPr>
-    </w:p>
-    <w:p>
-      <w:pPr>
-        <w:rPr>
-          <w:b/>
-          <w:bCs/>
-        </w:rPr>
-      </w:pPr>
-      <w:r>
-        <w:rPr>
-          <w:b/>
-          <w:bCs/>
+      <w:proofErr w:type="spellStart"/>
+      <w:r>
+        <w:t>elif</w:t>
+      </w:r>
+      <w:proofErr w:type="spellEnd"/>
+      <w:r>
+        <w:t xml:space="preserve"> '_cantos' in </w:t>
+      </w:r>
+      <w:proofErr w:type="spellStart"/>
+      <w:r>
+        <w:t>categories</w:t>
+      </w:r>
+      <w:proofErr w:type="spellEnd"/>
+      <w:r>
+        <w:t>[i][2]:</w:t>
+      </w:r>
+    </w:p>
+    <w:p>
+      <w:r>
+        <w:t xml:space="preserve">                </w:t>
+      </w:r>
+      <w:proofErr w:type="spellStart"/>
+      <w:r>
+        <w:t>taxonomy</w:t>
+      </w:r>
+      <w:proofErr w:type="spellEnd"/>
+      <w:r>
+        <w:t xml:space="preserve"> = '</w:t>
+      </w:r>
+      <w:proofErr w:type="spellStart"/>
+      <w:r>
+        <w:t>pa_cantos</w:t>
+      </w:r>
+      <w:proofErr w:type="spellEnd"/>
+      <w:r>
+        <w:t>'</w:t>
+      </w:r>
+    </w:p>
+    <w:p>
+      <w:r>
+        <w:t xml:space="preserve">            </w:t>
+      </w:r>
+      <w:proofErr w:type="spellStart"/>
+      <w:r>
+        <w:t>elif</w:t>
+      </w:r>
+      <w:proofErr w:type="spellEnd"/>
+      <w:r>
+        <w:t xml:space="preserve"> '_episodios' in </w:t>
+      </w:r>
+      <w:proofErr w:type="spellStart"/>
+      <w:r>
+        <w:t>categories</w:t>
+      </w:r>
+      <w:proofErr w:type="spellEnd"/>
+      <w:r>
+        <w:t>[i][2]:</w:t>
+      </w:r>
+    </w:p>
+    <w:p>
+      <w:r>
+        <w:t xml:space="preserve">                </w:t>
+      </w:r>
+      <w:proofErr w:type="spellStart"/>
+      <w:r>
+        <w:t>taxonomy</w:t>
+      </w:r>
+      <w:proofErr w:type="spellEnd"/>
+      <w:r>
+        <w:t xml:space="preserve"> = '</w:t>
+      </w:r>
+      <w:proofErr w:type="spellStart"/>
+      <w:r>
+        <w:t>pa_episodios</w:t>
+      </w:r>
+      <w:proofErr w:type="spellEnd"/>
+      <w:r>
+        <w:t>'</w:t>
+      </w:r>
+    </w:p>
+    <w:p>
+      <w:pPr>
+        <w:rPr>
+          <w:b/>
+          <w:bCs/>
+        </w:rPr>
+      </w:pPr>
+    </w:p>
+    <w:p>
+      <w:pPr>
+        <w:rPr>
+          <w:b/>
+          <w:bCs/>
+        </w:rPr>
+      </w:pPr>
+    </w:p>
+    <w:p>
+      <w:pPr>
+        <w:rPr>
+          <w:b/>
+          <w:bCs/>
+        </w:rPr>
+      </w:pPr>
+      <w:r>
+        <w:rPr>
+          <w:b/>
+          <w:bCs/>
+        </w:rPr>
+        <w:t>Faltam os restantes atributos de imagens</w:t>
+      </w:r>
+    </w:p>
+    <w:p>
+      <w:pPr>
+        <w:rPr>
+          <w:b/>
+          <w:bCs/>
+        </w:rPr>
+      </w:pPr>
+    </w:p>
+    <w:p/>
+    <w:p>
+      <w:pPr>
+        <w:rPr>
+          <w:b/>
+          <w:bCs/>
+        </w:rPr>
+      </w:pPr>
+    </w:p>
+    <w:p>
+      <w:pPr>
+        <w:rPr>
+          <w:b/>
+          <w:bCs/>
+        </w:rPr>
+      </w:pPr>
+    </w:p>
+    <w:p>
+      <w:pPr>
+        <w:rPr>
+          <w:b/>
+          <w:bCs/>
+        </w:rPr>
+      </w:pPr>
+      <w:r>
+        <w:rPr>
+          <w:b/>
+          <w:bCs/>
+        </w:rPr>
+        <w:t>27/03/2026</w:t>
+      </w:r>
+    </w:p>
+    <w:p>
+      <w:pPr>
+        <w:rPr>
+          <w:b/>
+          <w:bCs/>
+          <w:color w:val="EE0000"/>
+        </w:rPr>
+      </w:pPr>
+      <w:r>
+        <w:rPr>
+          <w:b/>
+          <w:bCs/>
+          <w:color w:val="EE0000"/>
         </w:rPr>
         <w:lastRenderedPageBreak/>
-        <w:t>Faltam os restantes atributos de imagens</w:t>
-      </w:r>
-    </w:p>
-    <w:p>
-      <w:pPr>
-        <w:rPr>
-          <w:b/>
-          <w:bCs/>
-        </w:rPr>
-      </w:pPr>
+        <w:t>Criar 1º a categoria “Imagens” e os atributos gerais (Cantos, Episódios, etc.)</w:t>
+      </w:r>
+    </w:p>
+    <w:p>
+      <w:pPr>
+        <w:rPr>
+          <w:b/>
+          <w:bCs/>
+        </w:rPr>
+      </w:pPr>
+    </w:p>
+    <w:p>
+      <w:r>
+        <w:t>Acrescentei a categoria: “Imagens”</w:t>
+      </w:r>
+      <w:r>
+        <w:t xml:space="preserve"> com o </w:t>
+      </w:r>
+      <w:proofErr w:type="spellStart"/>
+      <w:r>
+        <w:t>slug</w:t>
+      </w:r>
+      <w:proofErr w:type="spellEnd"/>
+      <w:r>
+        <w:t xml:space="preserve"> “</w:t>
+      </w:r>
+      <w:r>
+        <w:t>imagens</w:t>
+      </w:r>
+      <w:r>
+        <w:t>”</w:t>
+      </w:r>
+    </w:p>
+    <w:p>
+      <w:r>
+        <w:t>Acrescentei os atributos: “Cantos”</w:t>
+      </w:r>
+      <w:r>
+        <w:t xml:space="preserve"> (</w:t>
+      </w:r>
+      <w:proofErr w:type="spellStart"/>
+      <w:r>
+        <w:t>slug</w:t>
+      </w:r>
+      <w:proofErr w:type="spellEnd"/>
+      <w:r>
+        <w:t>: cantos)</w:t>
+      </w:r>
+      <w:r>
+        <w:t xml:space="preserve"> e “Episódios”</w:t>
+      </w:r>
+      <w:r>
+        <w:t xml:space="preserve"> (</w:t>
+      </w:r>
+      <w:proofErr w:type="spellStart"/>
+      <w:r>
+        <w:t>slug</w:t>
+      </w:r>
+      <w:proofErr w:type="spellEnd"/>
+      <w:r>
+        <w:t xml:space="preserve">: </w:t>
+      </w:r>
+      <w:proofErr w:type="spellStart"/>
+      <w:r>
+        <w:t>episodios</w:t>
+      </w:r>
+      <w:proofErr w:type="spellEnd"/>
+      <w:r>
+        <w:t>)</w:t>
+      </w:r>
     </w:p>
     <w:p/>
     <w:p>
-      <w:pPr>
-        <w:rPr>
-          <w:b/>
-          <w:bCs/>
-        </w:rPr>
-      </w:pPr>
-    </w:p>
-    <w:p>
-      <w:pPr>
-        <w:rPr>
-          <w:b/>
-          <w:bCs/>
-        </w:rPr>
-      </w:pPr>
-    </w:p>
-    <w:p>
-      <w:pPr>
-        <w:rPr>
-          <w:b/>
-          <w:bCs/>
-        </w:rPr>
-      </w:pPr>
-      <w:r>
-        <w:rPr>
-          <w:b/>
-          <w:bCs/>
-        </w:rPr>
-        <w:t>27/03/2026</w:t>
-      </w:r>
-    </w:p>
-    <w:p>
-      <w:pPr>
-        <w:rPr>
-          <w:b/>
-          <w:bCs/>
-          <w:color w:val="EE0000"/>
-        </w:rPr>
-      </w:pPr>
-      <w:r>
-        <w:rPr>
-          <w:b/>
-          <w:bCs/>
-          <w:color w:val="EE0000"/>
-        </w:rPr>
-        <w:t>Criar 1º a categoria “Imagens” e os atributos gerais (Cantos, Episódios, etc.)</w:t>
-      </w:r>
-    </w:p>
-    <w:p>
-      <w:pPr>
-        <w:rPr>
-          <w:b/>
-          <w:bCs/>
-        </w:rPr>
-      </w:pPr>
-    </w:p>
-    <w:p>
-      <w:r>
-        <w:t>Acrescentei a categoria: “Imagens”</w:t>
-      </w:r>
-      <w:r>
-        <w:t xml:space="preserve"> com o slug “</w:t>
-      </w:r>
-      <w:r>
-        <w:t>imagens</w:t>
-      </w:r>
-      <w:r>
-        <w:t>”</w:t>
-      </w:r>
-    </w:p>
-    <w:p>
-      <w:r>
-        <w:t>Acrescentei os atributos: “Cantos”</w:t>
-      </w:r>
-      <w:r>
-        <w:t xml:space="preserve"> (slug: cantos)</w:t>
-      </w:r>
-      <w:r>
-        <w:t xml:space="preserve"> e “Episódios”</w:t>
-      </w:r>
-      <w:r>
-        <w:t xml:space="preserve"> (slug: episodios)</w:t>
-      </w:r>
-    </w:p>
-    <w:p/>
-    <w:p>
-      <w:r>
-        <w:t>Dentro do atributo: Cantos, adicionei: “Canto I” (slug: canto-i</w:t>
+      <w:r>
+        <w:t>Dentro do atributo: Cantos, adicionei: “Canto I” (</w:t>
+      </w:r>
+      <w:proofErr w:type="spellStart"/>
+      <w:r>
+        <w:t>slug</w:t>
+      </w:r>
+      <w:proofErr w:type="spellEnd"/>
+      <w:r>
+        <w:t>: canto-</w:t>
+      </w:r>
+      <w:proofErr w:type="spellStart"/>
+      <w:r>
+        <w:t>i</w:t>
       </w:r>
       <w:r>
         <w:t>_pa_cantos</w:t>
       </w:r>
-      <w:r>
-        <w:t>) e “Canto II” (slug:canto-ii</w:t>
+      <w:proofErr w:type="spellEnd"/>
+      <w:r>
+        <w:t>) e “Canto II” (</w:t>
+      </w:r>
+      <w:proofErr w:type="spellStart"/>
+      <w:r>
+        <w:t>slug:canto-ii</w:t>
       </w:r>
       <w:r>
         <w:t>_pa_cantos</w:t>
       </w:r>
+      <w:proofErr w:type="spellEnd"/>
       <w:r>
         <w:t>)</w:t>
       </w:r>
     </w:p>
     <w:p>
       <w:r>
-        <w:t xml:space="preserve">Dentro de episódio, acrescentei os termos: Camões na gruta de Macau (slug: </w:t>
-      </w:r>
-      <w:r>
-        <w:t>camoes-na-gruta-de-macau</w:t>
+        <w:t>Dentro de episódio, acrescentei os termos: Camões na gruta de Macau (</w:t>
+      </w:r>
+      <w:proofErr w:type="spellStart"/>
+      <w:r>
+        <w:t>slug</w:t>
+      </w:r>
+      <w:proofErr w:type="spellEnd"/>
+      <w:r>
+        <w:t xml:space="preserve">: </w:t>
+      </w:r>
+      <w:proofErr w:type="spellStart"/>
+      <w:r>
+        <w:t>camoes</w:t>
+      </w:r>
+      <w:proofErr w:type="spellEnd"/>
+      <w:r>
+        <w:t>-na-gruta-de-</w:t>
+      </w:r>
+      <w:proofErr w:type="spellStart"/>
+      <w:r>
+        <w:t>macau</w:t>
       </w:r>
       <w:r>
         <w:t>_pa_episodios</w:t>
       </w:r>
+      <w:proofErr w:type="spellEnd"/>
       <w:r>
         <w:t xml:space="preserve">) e </w:t>
       </w:r>
       <w:r>
-        <w:t>Visita do Rei de Melinde a Gama (visita-do-rei-de-melinde-a-gama</w:t>
+        <w:t>Visita do Rei de Melinde a Gama (visita-do-rei-de-</w:t>
+      </w:r>
+      <w:proofErr w:type="spellStart"/>
+      <w:r>
+        <w:t>melinde</w:t>
+      </w:r>
+      <w:proofErr w:type="spellEnd"/>
+      <w:r>
+        <w:t>-a-</w:t>
+      </w:r>
+      <w:proofErr w:type="spellStart"/>
+      <w:r>
+        <w:t>gama</w:t>
       </w:r>
       <w:r>
         <w:t>_pa_episodios</w:t>
@@ -1317,6 +2837,7 @@
       <w:r>
         <w:t>f</w:t>
       </w:r>
+      <w:proofErr w:type="spellEnd"/>
       <w:r>
         <w:t>)</w:t>
       </w:r>
@@ -1340,7 +2861,55 @@
     </w:p>
     <w:p>
       <w:r>
-        <w:t>#mf_product_categories-1, #martfury_product_tag_cloud-4, #martfury_layered_nav-15, #martfury_layered_nav-16, #martfury_layered_nav-23 {box-shadow: 0 4px 8px 0 rgba(0, 0, 0, 0.1), 0 6px 20px 0 rgba(0, 0, 0, 0.1);background-color:#fff !important;} /*border:10px solid #47595c;border-radius:10px;  */</w:t>
+        <w:t>#mf_product_categories-1, #martfury_product_tag_cloud-4, #martfury_layered_nav-15, #martfury_layered_nav-16, #martfury_layered_nav-23 {box-</w:t>
+      </w:r>
+      <w:proofErr w:type="spellStart"/>
+      <w:r>
+        <w:t>shadow</w:t>
+      </w:r>
+      <w:proofErr w:type="spellEnd"/>
+      <w:r>
+        <w:t xml:space="preserve">: 0 4px 8px 0 </w:t>
+      </w:r>
+      <w:proofErr w:type="spellStart"/>
+      <w:r>
+        <w:t>rgba</w:t>
+      </w:r>
+      <w:proofErr w:type="spellEnd"/>
+      <w:r>
+        <w:t xml:space="preserve">(0, 0, 0, 0.1), 0 6px 20px 0 </w:t>
+      </w:r>
+      <w:proofErr w:type="spellStart"/>
+      <w:r>
+        <w:t>rgba</w:t>
+      </w:r>
+      <w:proofErr w:type="spellEnd"/>
+      <w:r>
+        <w:t>(0, 0, 0, 0.1);background-color:#</w:t>
+      </w:r>
+      <w:proofErr w:type="spellStart"/>
+      <w:r>
+        <w:t>fff</w:t>
+      </w:r>
+      <w:proofErr w:type="spellEnd"/>
+      <w:r>
+        <w:t xml:space="preserve"> !</w:t>
+      </w:r>
+      <w:proofErr w:type="spellStart"/>
+      <w:r>
+        <w:t>important</w:t>
+      </w:r>
+      <w:proofErr w:type="spellEnd"/>
+      <w:r>
+        <w:t xml:space="preserve">;} /*border:10px </w:t>
+      </w:r>
+      <w:proofErr w:type="spellStart"/>
+      <w:r>
+        <w:t>solid</w:t>
+      </w:r>
+      <w:proofErr w:type="spellEnd"/>
+      <w:r>
+        <w:t xml:space="preserve"> #47595c;border-radius:10px;  */</w:t>
       </w:r>
     </w:p>
     <w:p/>
@@ -1382,7 +2951,61 @@
           <w:bCs/>
           <w:color w:val="EE0000"/>
         </w:rPr>
-        <w:t>Foi necessário recriar o kit do Elementor, a partir de Elementor &gt; Ferramentas &gt; Recreate Kit</w:t>
+        <w:t xml:space="preserve">Foi necessário recriar o kit do </w:t>
+      </w:r>
+      <w:proofErr w:type="spellStart"/>
+      <w:r>
+        <w:rPr>
+          <w:b/>
+          <w:bCs/>
+          <w:color w:val="EE0000"/>
+        </w:rPr>
+        <w:t>Elementor</w:t>
+      </w:r>
+      <w:proofErr w:type="spellEnd"/>
+      <w:r>
+        <w:rPr>
+          <w:b/>
+          <w:bCs/>
+          <w:color w:val="EE0000"/>
+        </w:rPr>
+        <w:t xml:space="preserve">, a partir de </w:t>
+      </w:r>
+      <w:proofErr w:type="spellStart"/>
+      <w:r>
+        <w:rPr>
+          <w:b/>
+          <w:bCs/>
+          <w:color w:val="EE0000"/>
+        </w:rPr>
+        <w:t>Elementor</w:t>
+      </w:r>
+      <w:proofErr w:type="spellEnd"/>
+      <w:r>
+        <w:rPr>
+          <w:b/>
+          <w:bCs/>
+          <w:color w:val="EE0000"/>
+        </w:rPr>
+        <w:t xml:space="preserve"> &gt; Ferramentas &gt; </w:t>
+      </w:r>
+      <w:proofErr w:type="spellStart"/>
+      <w:r>
+        <w:rPr>
+          <w:b/>
+          <w:bCs/>
+          <w:color w:val="EE0000"/>
+        </w:rPr>
+        <w:t>Recreate</w:t>
+      </w:r>
+      <w:proofErr w:type="spellEnd"/>
+      <w:r>
+        <w:rPr>
+          <w:b/>
+          <w:bCs/>
+          <w:color w:val="EE0000"/>
+        </w:rPr>
+        <w:t xml:space="preserve"> Kit</w:t>
       </w:r>
     </w:p>
     <w:p>
@@ -1398,10 +3021,39 @@
         <w:t xml:space="preserve">É possível </w:t>
       </w:r>
       <w:r>
-        <w:t>criar páginas com os produtos de terminados atributos com o shortcode: “[</w:t>
-      </w:r>
-      <w:r>
-        <w:t>products attribute="pa_lingua"]</w:t>
+        <w:t xml:space="preserve">criar páginas com os produtos de terminados atributos com o </w:t>
+      </w:r>
+      <w:proofErr w:type="spellStart"/>
+      <w:r>
+        <w:t>shortcode</w:t>
+      </w:r>
+      <w:proofErr w:type="spellEnd"/>
+      <w:r>
+        <w:t>: “[</w:t>
+      </w:r>
+      <w:proofErr w:type="spellStart"/>
+      <w:r>
+        <w:t>products</w:t>
+      </w:r>
+      <w:proofErr w:type="spellEnd"/>
+      <w:r>
+        <w:t xml:space="preserve"> </w:t>
+      </w:r>
+      <w:proofErr w:type="spellStart"/>
+      <w:r>
+        <w:t>attribute</w:t>
+      </w:r>
+      <w:proofErr w:type="spellEnd"/>
+      <w:r>
+        <w:t>="</w:t>
+      </w:r>
+      <w:proofErr w:type="spellStart"/>
+      <w:r>
+        <w:t>pa_lingua</w:t>
+      </w:r>
+      <w:proofErr w:type="spellEnd"/>
+      <w:r>
+        <w:t>"]</w:t>
       </w:r>
       <w:r>
         <w:t>”</w:t>
@@ -1411,9 +3063,11 @@
       <w:r>
         <w:t xml:space="preserve">E filtrar os atributos que se pretende visualizar utilizando o </w:t>
       </w:r>
+      <w:proofErr w:type="spellStart"/>
       <w:r>
         <w:t>WPCode</w:t>
       </w:r>
+      <w:proofErr w:type="spellEnd"/>
     </w:p>
     <w:p/>
     <w:p>
@@ -1433,7 +3087,31 @@
     </w:p>
     <w:p>
       <w:r>
-        <w:t xml:space="preserve">Alterei o guid de um post de uma imagem e corri o comando wp que regenera as imagens, para ver se é </w:t>
+        <w:t xml:space="preserve">Alterei o </w:t>
+      </w:r>
+      <w:proofErr w:type="spellStart"/>
+      <w:r>
+        <w:t>guid</w:t>
+      </w:r>
+      <w:proofErr w:type="spellEnd"/>
+      <w:r>
+        <w:t xml:space="preserve"> de um </w:t>
+      </w:r>
+      <w:proofErr w:type="spellStart"/>
+      <w:r>
+        <w:t>post</w:t>
+      </w:r>
+      <w:proofErr w:type="spellEnd"/>
+      <w:r>
+        <w:t xml:space="preserve"> de uma imagem e corri o comando </w:t>
+      </w:r>
+      <w:proofErr w:type="spellStart"/>
+      <w:r>
+        <w:t>wp</w:t>
+      </w:r>
+      <w:proofErr w:type="spellEnd"/>
+      <w:r>
+        <w:t xml:space="preserve"> que regenera as imagens, para ver se é </w:t>
       </w:r>
       <w:r>
         <w:t xml:space="preserve">assim que se pode </w:t>
@@ -1452,24 +3130,40 @@
           <w:lang w:val="en-US"/>
         </w:rPr>
       </w:pPr>
-      <w:r>
-        <w:rPr>
-          <w:lang w:val="en-US"/>
-        </w:rPr>
-        <w:t>post_title = 367428</w:t>
-      </w:r>
-    </w:p>
-    <w:p>
-      <w:pPr>
-        <w:rPr>
-          <w:lang w:val="en-US"/>
-        </w:rPr>
-      </w:pPr>
-      <w:r>
-        <w:rPr>
-          <w:lang w:val="en-US"/>
-        </w:rPr>
-        <w:t>post_name = 367428</w:t>
+      <w:proofErr w:type="spellStart"/>
+      <w:r>
+        <w:rPr>
+          <w:lang w:val="en-US"/>
+        </w:rPr>
+        <w:t>post_title</w:t>
+      </w:r>
+      <w:proofErr w:type="spellEnd"/>
+      <w:r>
+        <w:rPr>
+          <w:lang w:val="en-US"/>
+        </w:rPr>
+        <w:t xml:space="preserve"> = 367428</w:t>
+      </w:r>
+    </w:p>
+    <w:p>
+      <w:pPr>
+        <w:rPr>
+          <w:lang w:val="en-US"/>
+        </w:rPr>
+      </w:pPr>
+      <w:proofErr w:type="spellStart"/>
+      <w:r>
+        <w:rPr>
+          <w:lang w:val="en-US"/>
+        </w:rPr>
+        <w:t>post_name</w:t>
+      </w:r>
+      <w:proofErr w:type="spellEnd"/>
+      <w:r>
+        <w:rPr>
+          <w:lang w:val="en-US"/>
+        </w:rPr>
+        <w:t xml:space="preserve"> = 367428</w:t>
       </w:r>
     </w:p>
     <w:p>
@@ -1498,19 +3192,20 @@
           <w:lang w:val="fr-FR"/>
         </w:rPr>
       </w:pPr>
+      <w:proofErr w:type="spellStart"/>
       <w:r>
         <w:rPr>
           <w:lang w:val="fr-FR"/>
         </w:rPr>
-        <w:t>post_parent = 6932</w:t>
-      </w:r>
-    </w:p>
-    <w:p>
-      <w:pPr>
+        <w:t>post_parent</w:t>
+      </w:r>
+      <w:proofErr w:type="spellEnd"/>
+      <w:r>
         <w:rPr>
           <w:lang w:val="fr-FR"/>
         </w:rPr>
-      </w:pPr>
+        <w:t xml:space="preserve"> = 6932</w:t>
+      </w:r>
     </w:p>
     <w:p>
       <w:pPr>
@@ -1518,16 +3213,31 @@
           <w:lang w:val="fr-FR"/>
         </w:rPr>
       </w:pPr>
-      <w:r>
+    </w:p>
+    <w:p>
+      <w:pPr>
         <w:rPr>
           <w:lang w:val="fr-FR"/>
         </w:rPr>
-        <w:t>guid = https://camonianadigital.bnportugal.gov.pt/wp-content/uploads/2025/capas/367428.jpg</w:t>
-      </w:r>
+      </w:pPr>
+      <w:proofErr w:type="spellStart"/>
       <w:r>
         <w:rPr>
           <w:lang w:val="fr-FR"/>
         </w:rPr>
+        <w:t>guid</w:t>
+      </w:r>
+      <w:proofErr w:type="spellEnd"/>
+      <w:r>
+        <w:rPr>
+          <w:lang w:val="fr-FR"/>
+        </w:rPr>
+        <w:t xml:space="preserve"> = https://camonianadigital.bnportugal.gov.pt/wp-content/uploads/2025/capas/367428.jpg</w:t>
+      </w:r>
+      <w:r>
+        <w:rPr>
+          <w:lang w:val="fr-FR"/>
+        </w:rPr>
         <w:t>g</w:t>
       </w:r>
     </w:p>
@@ -1554,6 +3264,7 @@
         </w:rPr>
         <w:t xml:space="preserve">Falta alterar no </w:t>
       </w:r>
+      <w:proofErr w:type="spellStart"/>
       <w:r>
         <w:rPr>
           <w:b/>
@@ -1575,6 +3286,7 @@
         </w:rPr>
         <w:t>meta</w:t>
       </w:r>
+      <w:proofErr w:type="spellEnd"/>
     </w:p>
     <w:tbl>
       <w:tblPr>
@@ -1661,8 +3373,17 @@
                 <w:b/>
                 <w:bCs/>
               </w:rPr>
-              <w:t>_wp_attached_file</w:t>
+              <w:t>_</w:t>
             </w:r>
+            <w:proofErr w:type="spellStart"/>
+            <w:r>
+              <w:rPr>
+                <w:b/>
+                <w:bCs/>
+              </w:rPr>
+              <w:t>wp_attached_file</w:t>
+            </w:r>
+            <w:proofErr w:type="spellEnd"/>
           </w:p>
         </w:tc>
         <w:tc>
@@ -1758,54 +3479,264 @@
         <w:rPr>
           <w:lang w:val="en-US"/>
         </w:rPr>
-        <w:t>            elif collection == 'imagens':</w:t>
-      </w:r>
-    </w:p>
-    <w:p>
-      <w:pPr>
-        <w:rPr>
-          <w:lang w:val="en-US"/>
-        </w:rPr>
-      </w:pPr>
-      <w:r>
-        <w:rPr>
-          <w:lang w:val="en-US"/>
-        </w:rPr>
-        <w:t>                db.insert_post_metadata(post_id, "_wp_attached_file", f"{path_to_folder}{ncb}/{volume}/{imagem}.jpg")</w:t>
-      </w:r>
-    </w:p>
-    <w:p>
-      <w:pPr>
-        <w:rPr>
-          <w:lang w:val="en-US"/>
-        </w:rPr>
-      </w:pPr>
-      <w:r>
-        <w:rPr>
-          <w:lang w:val="en-US"/>
+        <w:t xml:space="preserve">            </w:t>
+      </w:r>
+      <w:proofErr w:type="spellStart"/>
+      <w:r>
+        <w:rPr>
+          <w:lang w:val="en-US"/>
+        </w:rPr>
+        <w:t>elif</w:t>
+      </w:r>
+      <w:proofErr w:type="spellEnd"/>
+      <w:r>
+        <w:rPr>
+          <w:lang w:val="en-US"/>
+        </w:rPr>
+        <w:t xml:space="preserve"> collection == 'imagens':</w:t>
+      </w:r>
+    </w:p>
+    <w:p>
+      <w:pPr>
+        <w:rPr>
+          <w:lang w:val="en-US"/>
+        </w:rPr>
+      </w:pPr>
+      <w:r>
+        <w:rPr>
+          <w:lang w:val="en-US"/>
+        </w:rPr>
+        <w:t xml:space="preserve">                </w:t>
+      </w:r>
+      <w:proofErr w:type="spellStart"/>
+      <w:r>
+        <w:rPr>
+          <w:lang w:val="en-US"/>
+        </w:rPr>
+        <w:t>db.insert_post_metadata</w:t>
+      </w:r>
+      <w:proofErr w:type="spellEnd"/>
+      <w:r>
+        <w:rPr>
+          <w:lang w:val="en-US"/>
+        </w:rPr>
+        <w:t>(</w:t>
+      </w:r>
+      <w:proofErr w:type="spellStart"/>
+      <w:r>
+        <w:rPr>
+          <w:lang w:val="en-US"/>
+        </w:rPr>
+        <w:t>post_id</w:t>
+      </w:r>
+      <w:proofErr w:type="spellEnd"/>
+      <w:r>
+        <w:rPr>
+          <w:lang w:val="en-US"/>
+        </w:rPr>
+        <w:t>, "_</w:t>
+      </w:r>
+      <w:proofErr w:type="spellStart"/>
+      <w:r>
+        <w:rPr>
+          <w:lang w:val="en-US"/>
+        </w:rPr>
+        <w:t>wp_attached_file</w:t>
+      </w:r>
+      <w:proofErr w:type="spellEnd"/>
+      <w:r>
+        <w:rPr>
+          <w:lang w:val="en-US"/>
+        </w:rPr>
+        <w:t>", f"{</w:t>
+      </w:r>
+      <w:proofErr w:type="spellStart"/>
+      <w:r>
+        <w:rPr>
+          <w:lang w:val="en-US"/>
+        </w:rPr>
+        <w:t>path_to_folder</w:t>
+      </w:r>
+      <w:proofErr w:type="spellEnd"/>
+      <w:r>
+        <w:rPr>
+          <w:lang w:val="en-US"/>
+        </w:rPr>
+        <w:t>}{</w:t>
+      </w:r>
+      <w:proofErr w:type="spellStart"/>
+      <w:r>
+        <w:rPr>
+          <w:lang w:val="en-US"/>
+        </w:rPr>
+        <w:t>ncb</w:t>
+      </w:r>
+      <w:proofErr w:type="spellEnd"/>
+      <w:r>
+        <w:rPr>
+          <w:lang w:val="en-US"/>
+        </w:rPr>
+        <w:t>}/{volume}/{</w:t>
+      </w:r>
+      <w:proofErr w:type="spellStart"/>
+      <w:r>
+        <w:rPr>
+          <w:lang w:val="en-US"/>
+        </w:rPr>
+        <w:t>imagem</w:t>
+      </w:r>
+      <w:proofErr w:type="spellEnd"/>
+      <w:r>
+        <w:rPr>
+          <w:lang w:val="en-US"/>
+        </w:rPr>
+        <w:t>}.jpg")</w:t>
+      </w:r>
+    </w:p>
+    <w:p>
+      <w:pPr>
+        <w:rPr>
+          <w:lang w:val="en-US"/>
+        </w:rPr>
+      </w:pPr>
+      <w:r>
+        <w:rPr>
+          <w:lang w:val="en-US"/>
+        </w:rPr>
+        <w:t xml:space="preserve"> </w:t>
+      </w:r>
+      <w:r>
+        <w:rPr>
+          <w:lang w:val="en-US"/>
+        </w:rPr>
+        <w:t xml:space="preserve">               </w:t>
+      </w:r>
+      <w:proofErr w:type="spellStart"/>
+      <w:r>
+        <w:rPr>
+          <w:lang w:val="en-US"/>
+        </w:rPr>
+        <w:t>db.insert_post_metadata</w:t>
+      </w:r>
+      <w:proofErr w:type="spellEnd"/>
+      <w:r>
+        <w:rPr>
+          <w:lang w:val="en-US"/>
+        </w:rPr>
+        <w:t>(</w:t>
+      </w:r>
+      <w:proofErr w:type="spellStart"/>
+      <w:r>
+        <w:rPr>
+          <w:lang w:val="en-US"/>
+        </w:rPr>
+        <w:t>post_id</w:t>
+      </w:r>
+      <w:proofErr w:type="spellEnd"/>
+      <w:r>
+        <w:rPr>
+          <w:lang w:val="en-US"/>
+        </w:rPr>
+        <w:t>, "_</w:t>
+      </w:r>
+      <w:proofErr w:type="spellStart"/>
+      <w:r>
+        <w:rPr>
+          <w:lang w:val="en-US"/>
+        </w:rPr>
+        <w:t>wp_attachment_metadata</w:t>
+      </w:r>
+      <w:proofErr w:type="spellEnd"/>
+      <w:r>
+        <w:rPr>
+          <w:lang w:val="en-US"/>
+        </w:rPr>
+        <w:t>", metadata)</w:t>
+      </w:r>
+    </w:p>
+    <w:p>
+      <w:r>
+        <w:rPr>
+          <w:lang w:val="en-US"/>
+        </w:rPr>
+        <w:t xml:space="preserve">                </w:t>
+      </w:r>
+      <w:proofErr w:type="spellStart"/>
+      <w:r>
+        <w:t>db.insert_post_metadata</w:t>
+      </w:r>
+      <w:proofErr w:type="spellEnd"/>
+      <w:r>
+        <w:t>(</w:t>
+      </w:r>
+      <w:proofErr w:type="spellStart"/>
+      <w:r>
+        <w:t>post_id</w:t>
+      </w:r>
+      <w:proofErr w:type="spellEnd"/>
+      <w:r>
+        <w:t>, "_</w:t>
+      </w:r>
+      <w:proofErr w:type="spellStart"/>
+      <w:r>
+        <w:t>wp_attachment_image_alt</w:t>
+      </w:r>
+      <w:proofErr w:type="spellEnd"/>
+      <w:r>
+        <w:t>", "página")</w:t>
+      </w:r>
+    </w:p>
+    <w:p/>
+    <w:p>
+      <w:pPr>
+        <w:rPr>
+          <w:b/>
+          <w:bCs/>
+          <w:color w:val="EE0000"/>
+        </w:rPr>
+      </w:pPr>
+      <w:r>
+        <w:rPr>
+          <w:b/>
+          <w:bCs/>
+          <w:color w:val="EE0000"/>
+        </w:rPr>
+        <w:t xml:space="preserve">No ficheiro das imagens passar apenas as linhas que têm </w:t>
+      </w:r>
+      <w:r>
+        <w:rPr>
+          <w:b/>
+          <w:bCs/>
+          <w:color w:val="EE0000"/>
+        </w:rPr>
+        <w:t>categorias de teste definidas</w:t>
+      </w:r>
+    </w:p>
+    <w:p/>
+    <w:p>
+      <w:pPr>
+        <w:rPr>
+          <w:b/>
+          <w:bCs/>
+        </w:rPr>
+      </w:pPr>
+    </w:p>
+    <w:p>
+      <w:pPr>
+        <w:rPr>
+          <w:b/>
+          <w:bCs/>
+        </w:rPr>
+      </w:pPr>
+      <w:r>
+        <w:rPr>
+          <w:b/>
+          <w:bCs/>
         </w:rPr>
         <w:lastRenderedPageBreak/>
-        <w:t xml:space="preserve"> </w:t>
-      </w:r>
-      <w:r>
-        <w:rPr>
-          <w:lang w:val="en-US"/>
-        </w:rPr>
-        <w:t xml:space="preserve">               db.insert_post_metadata(post_id, "_wp_attachment_metadata", metadata)</w:t>
-      </w:r>
-    </w:p>
-    <w:p>
-      <w:r>
-        <w:rPr>
-          <w:lang w:val="en-US"/>
-        </w:rPr>
-        <w:t xml:space="preserve">                </w:t>
-      </w:r>
-      <w:r>
-        <w:t>db.insert_post_metadata(post_id, "_wp_attachment_image_alt", "página")</w:t>
-      </w:r>
-    </w:p>
-    <w:p/>
+        <w:t>18/03/2026</w:t>
+      </w:r>
+    </w:p>
     <w:p>
       <w:pPr>
         <w:rPr>
@@ -1820,7 +3751,7 @@
           <w:bCs/>
           <w:color w:val="EE0000"/>
         </w:rPr>
-        <w:t xml:space="preserve">No ficheiro das imagens passar apenas as linhas que têm </w:t>
+        <w:t>Em princípio as imagens terão de ter como nome: ncb</w:t>
       </w:r>
       <w:r>
         <w:rPr>
@@ -1828,55 +3759,6 @@
           <w:bCs/>
           <w:color w:val="EE0000"/>
         </w:rPr>
-        <w:t>categorias de teste definidas</w:t>
-      </w:r>
-    </w:p>
-    <w:p/>
-    <w:p>
-      <w:pPr>
-        <w:rPr>
-          <w:b/>
-          <w:bCs/>
-        </w:rPr>
-      </w:pPr>
-    </w:p>
-    <w:p>
-      <w:pPr>
-        <w:rPr>
-          <w:b/>
-          <w:bCs/>
-        </w:rPr>
-      </w:pPr>
-      <w:r>
-        <w:rPr>
-          <w:b/>
-          <w:bCs/>
-        </w:rPr>
-        <w:t>18/03/2026</w:t>
-      </w:r>
-    </w:p>
-    <w:p>
-      <w:pPr>
-        <w:rPr>
-          <w:b/>
-          <w:bCs/>
-          <w:color w:val="EE0000"/>
-        </w:rPr>
-      </w:pPr>
-      <w:r>
-        <w:rPr>
-          <w:b/>
-          <w:bCs/>
-          <w:color w:val="EE0000"/>
-        </w:rPr>
-        <w:t>Em princípio as imagens terão de ter como nome: ncb</w:t>
-      </w:r>
-      <w:r>
-        <w:rPr>
-          <w:b/>
-          <w:bCs/>
-          <w:color w:val="EE0000"/>
-        </w:rPr>
         <w:t>volumeimagem.jpg</w:t>
       </w:r>
     </w:p>
@@ -1917,7 +3799,7 @@
           <w:bCs/>
         </w:rPr>
       </w:pPr>
-      <w:hyperlink r:id="rId6" w:history="1">
+      <w:hyperlink r:id="rId8" w:history="1">
         <w:r>
           <w:rPr>
             <w:rStyle w:val="Hiperligao"/>
@@ -1943,8 +3825,13 @@
       <w:r>
         <w:t>: “</w:t>
       </w:r>
-      <w:r>
-        <w:t>pattern = r"[\x98\x9C\x88\x89«»&lt;&gt;?[\]\x80-\x9F\xa0()']+"</w:t>
+      <w:proofErr w:type="spellStart"/>
+      <w:r>
+        <w:t>pattern</w:t>
+      </w:r>
+      <w:proofErr w:type="spellEnd"/>
+      <w:r>
+        <w:t xml:space="preserve"> = r"[\x98\x9C\x88\x89«»&lt;&gt;?[\]\x80-\x9F\xa0()']+"</w:t>
       </w:r>
     </w:p>
     <w:p>
@@ -1956,7 +3843,7 @@
       <w:r>
         <w:t xml:space="preserve">Exemplo: </w:t>
       </w:r>
-      <w:hyperlink r:id="rId7" w:history="1">
+      <w:hyperlink r:id="rId9" w:history="1">
         <w:r>
           <w:rPr>
             <w:rStyle w:val="Hiperligao"/>
@@ -1969,7 +3856,7 @@
       </w:r>
     </w:p>
     <w:p>
-      <w:hyperlink r:id="rId8" w:history="1">
+      <w:hyperlink r:id="rId10" w:history="1">
         <w:r>
           <w:rPr>
             <w:rStyle w:val="Hiperligao"/>
@@ -1982,7 +3869,7 @@
       </w:r>
     </w:p>
     <w:p>
-      <w:hyperlink r:id="rId9" w:history="1">
+      <w:hyperlink r:id="rId11" w:history="1">
         <w:r>
           <w:rPr>
             <w:rStyle w:val="Hiperligao"/>
@@ -1995,7 +3882,7 @@
       </w:r>
     </w:p>
     <w:p>
-      <w:hyperlink r:id="rId10" w:history="1">
+      <w:hyperlink r:id="rId12" w:history="1">
         <w:r>
           <w:rPr>
             <w:rStyle w:val="Hiperligao"/>
@@ -2013,7 +3900,7 @@
       </w:r>
     </w:p>
     <w:p>
-      <w:hyperlink r:id="rId11" w:history="1">
+      <w:hyperlink r:id="rId13" w:history="1">
         <w:r>
           <w:rPr>
             <w:rStyle w:val="Hiperligao"/>
@@ -2026,7 +3913,7 @@
       </w:r>
     </w:p>
     <w:p>
-      <w:hyperlink r:id="rId12" w:history="1">
+      <w:hyperlink r:id="rId14" w:history="1">
         <w:r>
           <w:rPr>
             <w:rStyle w:val="Hiperligao"/>
@@ -2036,7 +3923,7 @@
       </w:hyperlink>
     </w:p>
     <w:p>
-      <w:hyperlink r:id="rId13" w:history="1">
+      <w:hyperlink r:id="rId15" w:history="1">
         <w:r>
           <w:rPr>
             <w:rStyle w:val="Hiperligao"/>
@@ -2046,7 +3933,7 @@
       </w:hyperlink>
     </w:p>
     <w:p>
-      <w:hyperlink r:id="rId14" w:history="1">
+      <w:hyperlink r:id="rId16" w:history="1">
         <w:r>
           <w:rPr>
             <w:rStyle w:val="Hiperligao"/>
@@ -2059,7 +3946,7 @@
       </w:r>
     </w:p>
     <w:p>
-      <w:hyperlink r:id="rId15" w:history="1">
+      <w:hyperlink r:id="rId17" w:history="1">
         <w:r>
           <w:rPr>
             <w:rStyle w:val="Hiperligao"/>
@@ -2069,7 +3956,7 @@
       </w:hyperlink>
     </w:p>
     <w:p>
-      <w:hyperlink r:id="rId16" w:history="1">
+      <w:hyperlink r:id="rId18" w:history="1">
         <w:r>
           <w:rPr>
             <w:rStyle w:val="Hiperligao"/>
@@ -2079,7 +3966,7 @@
       </w:hyperlink>
     </w:p>
     <w:p>
-      <w:hyperlink r:id="rId17" w:history="1">
+      <w:hyperlink r:id="rId19" w:history="1">
         <w:r>
           <w:rPr>
             <w:rStyle w:val="Hiperligao"/>
@@ -2090,7 +3977,7 @@
     </w:p>
     <w:p/>
     <w:p>
-      <w:hyperlink r:id="rId18" w:history="1">
+      <w:hyperlink r:id="rId20" w:history="1">
         <w:r>
           <w:rPr>
             <w:rStyle w:val="Hiperligao"/>
@@ -2100,7 +3987,7 @@
       </w:hyperlink>
     </w:p>
     <w:p>
-      <w:hyperlink r:id="rId19" w:history="1">
+      <w:hyperlink r:id="rId21" w:history="1">
         <w:r>
           <w:rPr>
             <w:rStyle w:val="Hiperligao"/>
@@ -2110,7 +3997,7 @@
       </w:hyperlink>
     </w:p>
     <w:p>
-      <w:hyperlink r:id="rId20" w:history="1">
+      <w:hyperlink r:id="rId22" w:history="1">
         <w:r>
           <w:rPr>
             <w:rStyle w:val="Hiperligao"/>
@@ -2120,7 +4007,7 @@
       </w:hyperlink>
     </w:p>
     <w:p>
-      <w:hyperlink r:id="rId21" w:history="1">
+      <w:hyperlink r:id="rId23" w:history="1">
         <w:r>
           <w:rPr>
             <w:rStyle w:val="Hiperligao"/>
@@ -2130,7 +4017,7 @@
       </w:hyperlink>
     </w:p>
     <w:p>
-      <w:hyperlink r:id="rId22" w:history="1">
+      <w:hyperlink r:id="rId24" w:history="1">
         <w:r>
           <w:rPr>
             <w:rStyle w:val="Hiperligao"/>
@@ -2146,7 +4033,7 @@
       </w:r>
     </w:p>
     <w:p>
-      <w:hyperlink r:id="rId23" w:history="1">
+      <w:hyperlink r:id="rId25" w:history="1">
         <w:r>
           <w:rPr>
             <w:rStyle w:val="Hiperligao"/>
@@ -2159,7 +4046,7 @@
       </w:r>
     </w:p>
     <w:p>
-      <w:hyperlink r:id="rId24" w:history="1">
+      <w:hyperlink r:id="rId26" w:history="1">
         <w:r>
           <w:rPr>
             <w:rStyle w:val="Hiperligao"/>
@@ -2183,6 +4070,7 @@
           <w:b/>
           <w:bCs/>
         </w:rPr>
+        <w:lastRenderedPageBreak/>
         <w:t>Problema codificação ficheiros catalogo e imagens</w:t>
       </w:r>
     </w:p>
@@ -2208,8 +4096,13 @@
         <w:t>categorias associadas. É necessário remov</w:t>
       </w:r>
       <w:r>
-        <w:t>er esses registos, bem como os que não têm purl</w:t>
-      </w:r>
+        <w:t xml:space="preserve">er esses registos, bem como os que não têm </w:t>
+      </w:r>
+      <w:proofErr w:type="spellStart"/>
+      <w:r>
+        <w:t>purl</w:t>
+      </w:r>
+      <w:proofErr w:type="spellEnd"/>
     </w:p>
     <w:p/>
     <w:p>
@@ -2242,14 +4135,23 @@
     </w:p>
     <w:p>
       <w:r>
-        <w:t>Extrair dados atualizados do urn</w:t>
-      </w:r>
-    </w:p>
-    <w:p>
-      <w:r>
-        <w:lastRenderedPageBreak/>
-        <w:t>Eliminar as linhas das obras que não têm purl</w:t>
-      </w:r>
+        <w:t xml:space="preserve">Extrair dados atualizados do </w:t>
+      </w:r>
+      <w:proofErr w:type="spellStart"/>
+      <w:r>
+        <w:t>urn</w:t>
+      </w:r>
+      <w:proofErr w:type="spellEnd"/>
+    </w:p>
+    <w:p>
+      <w:r>
+        <w:t xml:space="preserve">Eliminar as linhas das obras que não têm </w:t>
+      </w:r>
+      <w:proofErr w:type="spellStart"/>
+      <w:r>
+        <w:t>purl</w:t>
+      </w:r>
+      <w:proofErr w:type="spellEnd"/>
     </w:p>
     <w:p>
       <w:r>
@@ -2302,7 +4204,39 @@
           <w:b/>
           <w:bCs/>
         </w:rPr>
-        <w:t>É necessário acrescentar o ID às tabelas “catalogo” e “imagens” da bd: “bibligraphic_data”</w:t>
+        <w:t xml:space="preserve">É necessário acrescentar o ID às tabelas “catalogo” e “imagens” da </w:t>
+      </w:r>
+      <w:proofErr w:type="spellStart"/>
+      <w:r>
+        <w:rPr>
+          <w:b/>
+          <w:bCs/>
+        </w:rPr>
+        <w:t>bd</w:t>
+      </w:r>
+      <w:proofErr w:type="spellEnd"/>
+      <w:r>
+        <w:rPr>
+          <w:b/>
+          <w:bCs/>
+        </w:rPr>
+        <w:t>: “</w:t>
+      </w:r>
+      <w:proofErr w:type="spellStart"/>
+      <w:r>
+        <w:rPr>
+          <w:b/>
+          <w:bCs/>
+        </w:rPr>
+        <w:t>bibligraphic_data</w:t>
+      </w:r>
+      <w:proofErr w:type="spellEnd"/>
+      <w:r>
+        <w:rPr>
+          <w:b/>
+          <w:bCs/>
+        </w:rPr>
+        <w:t>”</w:t>
       </w:r>
     </w:p>
     <w:p/>
@@ -2396,7 +4330,6 @@
         <w:rPr>
           <w:color w:val="000000" w:themeColor="text1"/>
         </w:rPr>
-        <w:lastRenderedPageBreak/>
         <w:t>397785</w:t>
       </w:r>
       <w:r>
@@ -2738,7 +4671,7 @@
                 <w14:ligatures w14:val="none"/>
               </w:rPr>
             </w:pPr>
-            <w:hyperlink r:id="rId25" w:tgtFrame="_parent" w:history="1">
+            <w:hyperlink r:id="rId27" w:tgtFrame="_parent" w:history="1">
               <w:r>
                 <w:rPr>
                   <w:rFonts w:ascii="Aptos Narrow" w:eastAsia="Times New Roman" w:hAnsi="Aptos Narrow" w:cs="Times New Roman"/>
@@ -3122,7 +5055,6 @@
                 <w:lang w:eastAsia="pt-PT"/>
                 <w14:ligatures w14:val="none"/>
               </w:rPr>
-              <w:lastRenderedPageBreak/>
               <w:t>454907</w:t>
             </w:r>
           </w:p>
@@ -3236,7 +5168,7 @@
                 <w14:ligatures w14:val="none"/>
               </w:rPr>
             </w:pPr>
-            <w:hyperlink r:id="rId26" w:tgtFrame="_parent" w:history="1">
+            <w:hyperlink r:id="rId28" w:tgtFrame="_parent" w:history="1">
               <w:r>
                 <w:rPr>
                   <w:rFonts w:ascii="Aptos Narrow" w:eastAsia="Times New Roman" w:hAnsi="Aptos Narrow" w:cs="Times New Roman"/>
@@ -3620,6 +5552,7 @@
                 <w:lang w:eastAsia="pt-PT"/>
                 <w14:ligatures w14:val="none"/>
               </w:rPr>
+              <w:lastRenderedPageBreak/>
               <w:t>454907</w:t>
             </w:r>
           </w:p>
@@ -3733,7 +5666,7 @@
                 <w14:ligatures w14:val="none"/>
               </w:rPr>
             </w:pPr>
-            <w:hyperlink r:id="rId27" w:tgtFrame="_parent" w:history="1">
+            <w:hyperlink r:id="rId29" w:tgtFrame="_parent" w:history="1">
               <w:r>
                 <w:rPr>
                   <w:rFonts w:ascii="Aptos Narrow" w:eastAsia="Times New Roman" w:hAnsi="Aptos Narrow" w:cs="Times New Roman"/>

</xml_diff>